<commit_message>
Update Бурсервис end date to February 2026
Co-Authored-By: Claude Opus 5.5 <noreply@anthropic.com>
Claude-Session: https://claude.ai/code/session_012npdp2UDGCWsrnjWPKCB4G
</commit_message>
<xml_diff>
--- a/Резюме_ITFB_Михаил_Н_UX-UI.docx
+++ b/Резюме_ITFB_Михаил_Н_UX-UI.docx
@@ -880,7 +880,7 @@
                       <w:bCs/>
                       <w:color w:val="AEAAAA" w:themeColor="background2" w:themeShade="BF"/>
                     </w:rPr>
-                    <w:t xml:space="preserve">декабрь 2024 – по настоящее время</w:t>
+                    <w:t xml:space="preserve">декабрь 2024 – февраль 2026</w:t>
                   </w:r>
                 </w:p>
                 <w:p>
@@ -898,7 +898,7 @@
                       <w:bCs/>
                       <w:color w:val="AEAAAA" w:themeColor="background2" w:themeShade="BF"/>
                     </w:rPr>
-                    <w:t xml:space="preserve">(1 год 9 месяцев)</w:t>
+                    <w:t xml:space="preserve">(1 год 3 месяца)</w:t>
                   </w:r>
                 </w:p>
               </w:tc>

</xml_diff>

<commit_message>
Add OTP Bank phase 2 (Aug 2026 – present), move entry to top
Co-Authored-By: Claude Opus 5.5 <noreply@anthropic.com>
Claude-Session: https://claude.ai/code/session_012npdp2UDGCWsrnjWPKCB4G
</commit_message>
<xml_diff>
--- a/Резюме_ITFB_Михаил_Н_UX-UI.docx
+++ b/Резюме_ITFB_Михаил_Н_UX-UI.docx
@@ -465,7 +465,7 @@
                       <w:bCs/>
                       <w:color w:val="AEAAAA" w:themeColor="background2" w:themeShade="BF"/>
                     </w:rPr>
-                    <w:t xml:space="preserve">март 2026 – по настоящее время</w:t>
+                    <w:t xml:space="preserve">август 2026 – по настоящее время</w:t>
                   </w:r>
                 </w:p>
                 <w:p>
@@ -483,7 +483,43 @@
                       <w:bCs/>
                       <w:color w:val="AEAAAA" w:themeColor="background2" w:themeShade="BF"/>
                     </w:rPr>
-                    <w:t xml:space="preserve">(6 месяцев)</w:t>
+                    <w:t xml:space="preserve">(2 месяца, фаза 2)</w:t>
+                  </w:r>
+                </w:p>
+                <w:p>
+                  <w:pPr>
+                    <w:pStyle w:val="ad"/>
+                    <w:spacing w:before="160" w:line="211" w:lineRule="auto"/>
+                    <w:ind w:left="-108" w:right="77"/>
+                    <w:rPr>
+                      <w:bCs/>
+                      <w:color w:val="AEAAAA" w:themeColor="background2" w:themeShade="BF"/>
+                    </w:rPr>
+                  </w:pPr>
+                  <w:r>
+                    <w:rPr>
+                      <w:bCs/>
+                      <w:color w:val="AEAAAA" w:themeColor="background2" w:themeShade="BF"/>
+                    </w:rPr>
+                    <w:t xml:space="preserve">март 2023 – июль 2023</w:t>
+                  </w:r>
+                </w:p>
+                <w:p>
+                  <w:pPr>
+                    <w:pStyle w:val="ad"/>
+                    <w:spacing w:before="54" w:line="211" w:lineRule="auto"/>
+                    <w:ind w:left="-108" w:right="77"/>
+                    <w:rPr>
+                      <w:bCs/>
+                      <w:color w:val="AEAAAA" w:themeColor="background2" w:themeShade="BF"/>
+                    </w:rPr>
+                  </w:pPr>
+                  <w:r>
+                    <w:rPr>
+                      <w:bCs/>
+                      <w:color w:val="AEAAAA" w:themeColor="background2" w:themeShade="BF"/>
+                    </w:rPr>
+                    <w:t xml:space="preserve">(5 месяцев, фаза 1)</w:t>
                   </w:r>
                 </w:p>
               </w:tc>
@@ -507,7 +543,7 @@
                       <w:bCs/>
                       <w:color w:val="404040"/>
                     </w:rPr>
-                    <w:t xml:space="preserve">«Вкусно и точка» (Mobile &amp; Web B2E)</w:t>
+                    <w:t xml:space="preserve">АО «ОТП Банк» (Web B2B ERP)</w:t>
                   </w:r>
                 </w:p>
                 <w:p>
@@ -589,7 +625,7 @@
                       <w:sz w:val="20"/>
                       <w:szCs w:val="20"/>
                     </w:rPr>
-                    <w:t xml:space="preserve">Проектирование с нуля корпоративного мобильного приложения для сотрудников сети ресторанов (20 000+ пользователей) и веб-админ-панели: новостная лента, календарь корпоративных событий, личные кабинеты сотрудника и предприятия, система баллов и поощрений, КЭДО, внутренний помощник (FAQ).</w:t>
+                    <w:t xml:space="preserve">Проектирование внутренней HR-системы для формирования и отслеживания командных и индивидуальных целей по всем сотрудникам банка для увеличения эффективности работы. С августа 2026 года — вторая фаза проекта.</w:t>
                   </w:r>
                 </w:p>
                 <w:p>
@@ -608,7 +644,7 @@
                     <w:rPr>
                       <w:color w:val="404040" w:themeColor="text1" w:themeTint="BF"/>
                     </w:rPr>
-                    <w:t xml:space="preserve">Спроектировал продукт целиком: информационная архитектура, пользовательские сценарии, интерактивные прототипы в Figma для сборки целостной картины приложения.</w:t>
+                    <w:t xml:space="preserve">Проведение интервью с бизнес-заказчиками для выявления реальных проблем и требований.</w:t>
                   </w:r>
                 </w:p>
                 <w:p>
@@ -627,7 +663,7 @@
                     <w:rPr>
                       <w:color w:val="404040" w:themeColor="text1" w:themeTint="BF"/>
                     </w:rPr>
-                    <w:t xml:space="preserve">Построил граф-схемы сценариев в Draw.io — путь пользователя от входа в сценарий до целевого действия, с ветвлениями, ролевой видимостью (6 уровней сотрудников) и проработкой краевых состояний.</w:t>
+                    <w:t xml:space="preserve">Проработка User flow, JTBD.</w:t>
                   </w:r>
                 </w:p>
                 <w:p>
@@ -646,7 +682,7 @@
                     <w:rPr>
                       <w:color w:val="404040" w:themeColor="text1" w:themeTint="BF"/>
                     </w:rPr>
-                    <w:t xml:space="preserve">Собрал и структурировал контент для внутреннего помощника: провёл интервью с сотрудниками, сформировал таксономию категорий вопросов и наполнение базы знаний FAQ как основу для автоматизации ответов.</w:t>
+                    <w:t xml:space="preserve">Разработка UX/UI ERP-системы для формирования и отслеживания выполнения целей для команд и сотрудников.</w:t>
                   </w:r>
                 </w:p>
                 <w:p>
@@ -665,7 +701,7 @@
                     <w:rPr>
                       <w:color w:val="404040" w:themeColor="text1" w:themeTint="BF"/>
                     </w:rPr>
-                    <w:t xml:space="preserve">Провёл серию интервью с сотрудниками ПБО и офиса, проанализировал действующие бизнес-процессы и выявил узкие места, которые закрывает продукт.</w:t>
+                    <w:t xml:space="preserve">Работа с аналитиками и разработчиками, адаптация дизайна под технические ограничения.</w:t>
                   </w:r>
                 </w:p>
                 <w:p>
@@ -684,131 +720,7 @@
                     <w:rPr>
                       <w:color w:val="404040" w:themeColor="text1" w:themeTint="BF"/>
                     </w:rPr>
-                    <w:t xml:space="preserve">Адаптировал брендбук компании под мобильный формат: перенёс фирменный визуальный язык в digital, собрал UI-kit под задачи приложения.</w:t>
-                  </w:r>
-                </w:p>
-                <w:p>
-                  <w:pPr>
-                    <w:pStyle w:val="ad"/>
-                    <w:numPr>
-                      <w:ilvl w:val="0"/>
-                      <w:numId w:val="30"/>
-                    </w:numPr>
-                    <w:spacing w:before="45" w:line="211" w:lineRule="auto"/>
-                    <w:rPr>
-                      <w:color w:val="404040" w:themeColor="text1" w:themeTint="BF"/>
-                    </w:rPr>
-                  </w:pPr>
-                  <w:r>
-                    <w:rPr>
-                      <w:color w:val="404040" w:themeColor="text1" w:themeTint="BF"/>
-                    </w:rPr>
-                    <w:t xml:space="preserve">Защищал дизайн-решения перед топ-менеджментом заказчика, опираясь на данные интервью и логику бизнес-процессов.</w:t>
-                  </w:r>
-                </w:p>
-                <w:p>
-                  <w:pPr>
-                    <w:pStyle w:val="ad"/>
-                    <w:numPr>
-                      <w:ilvl w:val="0"/>
-                      <w:numId w:val="30"/>
-                    </w:numPr>
-                    <w:spacing w:before="45" w:line="211" w:lineRule="auto"/>
-                    <w:rPr>
-                      <w:color w:val="404040" w:themeColor="text1" w:themeTint="BF"/>
-                    </w:rPr>
-                  </w:pPr>
-                  <w:r>
-                    <w:rPr>
-                      <w:color w:val="404040" w:themeColor="text1" w:themeTint="BF"/>
-                    </w:rPr>
-                    <w:t xml:space="preserve">Объяснял разработчикам логику сценариев, адаптировал дизайн под технические ограничения.</w:t>
-                  </w:r>
-                </w:p>
-                <w:p>
-                  <w:pPr>
-                    <w:pStyle w:val="ad"/>
-                    <w:keepNext/>
-                    <w:spacing w:before="72" w:line="211" w:lineRule="auto"/>
-                    <w:rPr>
-                      <w:bCs/>
-                      <w:color w:val="0483F8"/>
-                      <w:spacing w:val="-2"/>
-                      <w:sz w:val="22"/>
-                      <w:szCs w:val="22"/>
-                    </w:rPr>
-                  </w:pPr>
-                  <w:r>
-                    <w:rPr>
-                      <w:bCs/>
-                      <w:color w:val="0483F8"/>
-                      <w:spacing w:val="-2"/>
-                      <w:sz w:val="22"/>
-                      <w:szCs w:val="22"/>
-                    </w:rPr>
-                    <w:t xml:space="preserve">Достижения</w:t>
-                  </w:r>
-                </w:p>
-                <w:p>
-                  <w:pPr>
-                    <w:pStyle w:val="ad"/>
-                    <w:numPr>
-                      <w:ilvl w:val="0"/>
-                      <w:numId w:val="34"/>
-                    </w:numPr>
-                    <w:spacing w:before="45" w:line="211" w:lineRule="auto"/>
-                    <w:rPr>
-                      <w:color w:val="404040" w:themeColor="text1" w:themeTint="BF"/>
-                    </w:rPr>
-                  </w:pPr>
-                  <w:r>
-                    <w:rPr>
-                      <w:color w:val="404040" w:themeColor="text1" w:themeTint="BF"/>
-                    </w:rPr>
-                    <w:t xml:space="preserve">Выстроил работу с дизайн-китом через ИИ (Claude): автоматизировал поддержку компонентов и передачу в разработку — по оценке команды разработки, сократило время фронтенд-разработки до 40%.</w:t>
-                  </w:r>
-                </w:p>
-                <w:p>
-                  <w:pPr>
-                    <w:pStyle w:val="ad"/>
-                    <w:keepNext/>
-                    <w:spacing w:before="72" w:line="211" w:lineRule="auto"/>
-                    <w:rPr>
-                      <w:bCs/>
-                      <w:color w:val="0483F8"/>
-                      <w:spacing w:val="-2"/>
-                      <w:sz w:val="22"/>
-                      <w:szCs w:val="22"/>
-                    </w:rPr>
-                  </w:pPr>
-                  <w:r>
-                    <w:rPr>
-                      <w:bCs/>
-                      <w:color w:val="0483F8"/>
-                      <w:spacing w:val="-2"/>
-                      <w:sz w:val="22"/>
-                      <w:szCs w:val="22"/>
-                    </w:rPr>
-                    <w:t xml:space="preserve">Состав команды</w:t>
-                  </w:r>
-                </w:p>
-                <w:p>
-                  <w:pPr>
-                    <w:pStyle w:val="ad"/>
-                    <w:numPr>
-                      <w:ilvl w:val="0"/>
-                      <w:numId w:val="34"/>
-                    </w:numPr>
-                    <w:spacing w:before="45" w:line="211" w:lineRule="auto"/>
-                    <w:rPr>
-                      <w:color w:val="404040" w:themeColor="text1" w:themeTint="BF"/>
-                    </w:rPr>
-                  </w:pPr>
-                  <w:r>
-                    <w:rPr>
-                      <w:color w:val="404040" w:themeColor="text1" w:themeTint="BF"/>
-                    </w:rPr>
-                    <w:t xml:space="preserve">Арт-директор, бизнес- и системные аналитики, фронтенд- и бэкенд-команды.</w:t>
+                    <w:t xml:space="preserve">Постановка задач и менторинг младших дизайнеров.</w:t>
                   </w:r>
                 </w:p>
                 <w:p>
@@ -851,7 +763,7 @@
                     <w:rPr>
                       <w:color w:val="404040" w:themeColor="text1" w:themeTint="BF"/>
                     </w:rPr>
-                    <w:t xml:space="preserve">Figma, Draw.io, Claude (AI-assisted design), User flow, JTBD, дизайн-системы, UI-kit, прототипирование интерфейсов, Knowledge Base / FAQ</w:t>
+                    <w:t xml:space="preserve">Figma, User flow, JTBD, User Story, UI/UX, UI-kit</w:t>
                   </w:r>
                 </w:p>
               </w:tc>
@@ -880,7 +792,7 @@
                       <w:bCs/>
                       <w:color w:val="AEAAAA" w:themeColor="background2" w:themeShade="BF"/>
                     </w:rPr>
-                    <w:t xml:space="preserve">декабрь 2024 – февраль 2026</w:t>
+                    <w:t xml:space="preserve">март 2026 – по настоящее время</w:t>
                   </w:r>
                 </w:p>
                 <w:p>
@@ -898,7 +810,7 @@
                       <w:bCs/>
                       <w:color w:val="AEAAAA" w:themeColor="background2" w:themeShade="BF"/>
                     </w:rPr>
-                    <w:t xml:space="preserve">(1 год 3 месяца)</w:t>
+                    <w:t xml:space="preserve">(6 месяцев)</w:t>
                   </w:r>
                 </w:p>
               </w:tc>
@@ -922,7 +834,7 @@
                       <w:bCs/>
                       <w:color w:val="404040"/>
                     </w:rPr>
-                    <w:t xml:space="preserve">Нефтесервисная компания «Бурсервис» (Web B2B MES)</w:t>
+                    <w:t xml:space="preserve">«Вкусно и точка» (Mobile &amp; Web B2E)</w:t>
                   </w:r>
                 </w:p>
                 <w:p>
@@ -1004,7 +916,7 @@
                       <w:sz w:val="20"/>
                       <w:szCs w:val="20"/>
                     </w:rPr>
-                    <w:t xml:space="preserve">Разработка MES-системы для проектирования, планирования и мониторинга производственного процесса строительства и бурения нефтегазовых скважин для инженеров и операторов.</w:t>
+                    <w:t xml:space="preserve">Проектирование с нуля корпоративного мобильного приложения для сотрудников сети ресторанов (20 000+ пользователей) и веб-админ-панели: новостная лента, календарь корпоративных событий, личные кабинеты сотрудника и предприятия, система баллов и поощрений, КЭДО, внутренний помощник (FAQ).</w:t>
                   </w:r>
                 </w:p>
                 <w:p>
@@ -1023,7 +935,7 @@
                     <w:rPr>
                       <w:color w:val="404040" w:themeColor="text1" w:themeTint="BF"/>
                     </w:rPr>
-                    <w:t xml:space="preserve">Онбординг в узкопрофильный продукт со сложной информационной архитектурой.</w:t>
+                    <w:t xml:space="preserve">Спроектировал продукт целиком: информационная архитектура, пользовательские сценарии, интерактивные прототипы в Figma для сборки целостной картины приложения.</w:t>
                   </w:r>
                 </w:p>
                 <w:p>
@@ -1042,7 +954,7 @@
                     <w:rPr>
                       <w:color w:val="404040" w:themeColor="text1" w:themeTint="BF"/>
                     </w:rPr>
-                    <w:t xml:space="preserve">Проведение серии глубинных интервью.</w:t>
+                    <w:t xml:space="preserve">Построил граф-схемы сценариев в Draw.io — путь пользователя от входа в сценарий до целевого действия, с ветвлениями, ролевой видимостью (6 уровней сотрудников) и проработкой краевых состояний.</w:t>
                   </w:r>
                 </w:p>
                 <w:p>
@@ -1061,7 +973,7 @@
                     <w:rPr>
                       <w:color w:val="404040" w:themeColor="text1" w:themeTint="BF"/>
                     </w:rPr>
-                    <w:t xml:space="preserve">Оптимизация пользовательских сценариев текущего легаси-софта.</w:t>
+                    <w:t xml:space="preserve">Собрал и структурировал контент для внутреннего помощника: провёл интервью с сотрудниками, сформировал таксономию категорий вопросов и наполнение базы знаний FAQ как основу для автоматизации ответов.</w:t>
                   </w:r>
                 </w:p>
                 <w:p>
@@ -1080,7 +992,7 @@
                     <w:rPr>
                       <w:color w:val="404040" w:themeColor="text1" w:themeTint="BF"/>
                     </w:rPr>
-                    <w:t xml:space="preserve">Проработка UX-решения для веб-интерфейса инженеров по бурению.</w:t>
+                    <w:t xml:space="preserve">Провёл серию интервью с сотрудниками ПБО и офиса, проанализировал действующие бизнес-процессы и выявил узкие места, которые закрывает продукт.</w:t>
                   </w:r>
                 </w:p>
                 <w:p>
@@ -1099,7 +1011,7 @@
                     <w:rPr>
                       <w:color w:val="404040" w:themeColor="text1" w:themeTint="BF"/>
                     </w:rPr>
-                    <w:t xml:space="preserve">Работа с иконографикой: создание уникальных иконок для проекта.</w:t>
+                    <w:t xml:space="preserve">Адаптировал брендбук компании под мобильный формат: перенёс фирменный визуальный язык в digital, собрал UI-kit под задачи приложения.</w:t>
                   </w:r>
                 </w:p>
                 <w:p>
@@ -1118,7 +1030,7 @@
                     <w:rPr>
                       <w:color w:val="404040" w:themeColor="text1" w:themeTint="BF"/>
                     </w:rPr>
-                    <w:t xml:space="preserve">Работа с UI: создание гибкой палитры на основе токенов под запрос клиента для масштабирования в рамках модулей проекта.</w:t>
+                    <w:t xml:space="preserve">Защищал дизайн-решения перед топ-менеджментом заказчика, опираясь на данные интервью и логику бизнес-процессов.</w:t>
                   </w:r>
                 </w:p>
                 <w:p>
@@ -1137,7 +1049,7 @@
                     <w:rPr>
                       <w:color w:val="404040" w:themeColor="text1" w:themeTint="BF"/>
                     </w:rPr>
-                    <w:t xml:space="preserve">Менторинг и координация младших дизайнеров на проекте.</w:t>
+                    <w:t xml:space="preserve">Объяснял разработчикам логику сценариев, адаптировал дизайн под технические ограничения.</w:t>
                   </w:r>
                 </w:p>
                 <w:p>
@@ -1180,7 +1092,50 @@
                     <w:rPr>
                       <w:color w:val="404040" w:themeColor="text1" w:themeTint="BF"/>
                     </w:rPr>
-                    <w:t xml:space="preserve">Собрал кастомизируемый интерфейс на основе MUI, что позволило сократить затраты на разработку и упростить масштабирование на другие подразделения и смежные продукты.</w:t>
+                    <w:t xml:space="preserve">Выстроил работу с дизайн-китом через ИИ (Claude): автоматизировал поддержку компонентов и передачу в разработку — по оценке команды разработки, сократило время фронтенд-разработки до 40%.</w:t>
+                  </w:r>
+                </w:p>
+                <w:p>
+                  <w:pPr>
+                    <w:pStyle w:val="ad"/>
+                    <w:keepNext/>
+                    <w:spacing w:before="72" w:line="211" w:lineRule="auto"/>
+                    <w:rPr>
+                      <w:bCs/>
+                      <w:color w:val="0483F8"/>
+                      <w:spacing w:val="-2"/>
+                      <w:sz w:val="22"/>
+                      <w:szCs w:val="22"/>
+                    </w:rPr>
+                  </w:pPr>
+                  <w:r>
+                    <w:rPr>
+                      <w:bCs/>
+                      <w:color w:val="0483F8"/>
+                      <w:spacing w:val="-2"/>
+                      <w:sz w:val="22"/>
+                      <w:szCs w:val="22"/>
+                    </w:rPr>
+                    <w:t xml:space="preserve">Состав команды</w:t>
+                  </w:r>
+                </w:p>
+                <w:p>
+                  <w:pPr>
+                    <w:pStyle w:val="ad"/>
+                    <w:numPr>
+                      <w:ilvl w:val="0"/>
+                      <w:numId w:val="34"/>
+                    </w:numPr>
+                    <w:spacing w:before="45" w:line="211" w:lineRule="auto"/>
+                    <w:rPr>
+                      <w:color w:val="404040" w:themeColor="text1" w:themeTint="BF"/>
+                    </w:rPr>
+                  </w:pPr>
+                  <w:r>
+                    <w:rPr>
+                      <w:color w:val="404040" w:themeColor="text1" w:themeTint="BF"/>
+                    </w:rPr>
+                    <w:t xml:space="preserve">Арт-директор, бизнес- и системные аналитики, фронтенд- и бэкенд-команды.</w:t>
                   </w:r>
                 </w:p>
                 <w:p>
@@ -1223,7 +1178,7 @@
                     <w:rPr>
                       <w:color w:val="404040" w:themeColor="text1" w:themeTint="BF"/>
                     </w:rPr>
-                    <w:t xml:space="preserve">Figma, MUI, JTBD, User Story, UI-kit, прототипирование интерфейсов</w:t>
+                    <w:t xml:space="preserve">Figma, Draw.io, Claude (AI-assisted design), User flow, JTBD, дизайн-системы, UI-kit, прототипирование интерфейсов, Knowledge Base / FAQ</w:t>
                   </w:r>
                 </w:p>
               </w:tc>
@@ -1252,7 +1207,7 @@
                       <w:bCs/>
                       <w:color w:val="AEAAAA" w:themeColor="background2" w:themeShade="BF"/>
                     </w:rPr>
-                    <w:t xml:space="preserve">июль 2023 – декабрь 2024</w:t>
+                    <w:t xml:space="preserve">декабрь 2024 – февраль 2026</w:t>
                   </w:r>
                 </w:p>
                 <w:p>
@@ -1270,7 +1225,7 @@
                       <w:bCs/>
                       <w:color w:val="AEAAAA" w:themeColor="background2" w:themeShade="BF"/>
                     </w:rPr>
-                    <w:t xml:space="preserve">(1 год 6 месяцев)</w:t>
+                    <w:t xml:space="preserve">(1 год 3 месяца)</w:t>
                   </w:r>
                 </w:p>
               </w:tc>
@@ -1294,7 +1249,7 @@
                       <w:bCs/>
                       <w:color w:val="404040"/>
                     </w:rPr>
-                    <w:t xml:space="preserve">БК «Лига Ставок» (Web B2B CRM-ERP)</w:t>
+                    <w:t xml:space="preserve">Нефтесервисная компания «Бурсервис» (Web B2B MES)</w:t>
                   </w:r>
                 </w:p>
                 <w:p>
@@ -1376,7 +1331,7 @@
                       <w:sz w:val="20"/>
                       <w:szCs w:val="20"/>
                     </w:rPr>
-                    <w:t xml:space="preserve">Проектирование для ядра букмекерского бизнеса — внутренней системы для управления коэффициентами, обработки ставок и другими бизнес-процессами.</w:t>
+                    <w:t xml:space="preserve">Разработка MES-системы для проектирования, планирования и мониторинга производственного процесса строительства и бурения нефтегазовых скважин для инженеров и операторов.</w:t>
                   </w:r>
                 </w:p>
                 <w:p>
@@ -1414,7 +1369,7 @@
                     <w:rPr>
                       <w:color w:val="404040" w:themeColor="text1" w:themeTint="BF"/>
                     </w:rPr>
-                    <w:t xml:space="preserve">Настройка дизайн-процесса в команде разработки продукта.</w:t>
+                    <w:t xml:space="preserve">Проведение серии глубинных интервью.</w:t>
                   </w:r>
                 </w:p>
                 <w:p>
@@ -1433,7 +1388,7 @@
                     <w:rPr>
                       <w:color w:val="404040" w:themeColor="text1" w:themeTint="BF"/>
                     </w:rPr>
-                    <w:t xml:space="preserve">Проведение серий глубинных интервью, на основе которых сформировал гипотезы.</w:t>
+                    <w:t xml:space="preserve">Оптимизация пользовательских сценариев текущего легаси-софта.</w:t>
                   </w:r>
                 </w:p>
                 <w:p>
@@ -1452,7 +1407,7 @@
                     <w:rPr>
                       <w:color w:val="404040" w:themeColor="text1" w:themeTint="BF"/>
                     </w:rPr>
-                    <w:t xml:space="preserve">Проектирование UX для 3-х групп пользователей (250+ человек) в рамках бизнес-задач.</w:t>
+                    <w:t xml:space="preserve">Проработка UX-решения для веб-интерфейса инженеров по бурению.</w:t>
                   </w:r>
                 </w:p>
                 <w:p>
@@ -1471,7 +1426,7 @@
                     <w:rPr>
                       <w:color w:val="404040" w:themeColor="text1" w:themeTint="BF"/>
                     </w:rPr>
-                    <w:t xml:space="preserve">Описание и заведение новых компонентов и виджетов в общую дизайн-систему компании.</w:t>
+                    <w:t xml:space="preserve">Работа с иконографикой: создание уникальных иконок для проекта.</w:t>
                   </w:r>
                 </w:p>
                 <w:p>
@@ -1490,7 +1445,26 @@
                     <w:rPr>
                       <w:color w:val="404040" w:themeColor="text1" w:themeTint="BF"/>
                     </w:rPr>
-                    <w:t xml:space="preserve">Синхронизация с кросс-командами, тесное взаимодействие с аналитиками, пользователями и командой разработки.</w:t>
+                    <w:t xml:space="preserve">Работа с UI: создание гибкой палитры на основе токенов под запрос клиента для масштабирования в рамках модулей проекта.</w:t>
+                  </w:r>
+                </w:p>
+                <w:p>
+                  <w:pPr>
+                    <w:pStyle w:val="ad"/>
+                    <w:numPr>
+                      <w:ilvl w:val="0"/>
+                      <w:numId w:val="30"/>
+                    </w:numPr>
+                    <w:spacing w:before="45" w:line="211" w:lineRule="auto"/>
+                    <w:rPr>
+                      <w:color w:val="404040" w:themeColor="text1" w:themeTint="BF"/>
+                    </w:rPr>
+                  </w:pPr>
+                  <w:r>
+                    <w:rPr>
+                      <w:color w:val="404040" w:themeColor="text1" w:themeTint="BF"/>
+                    </w:rPr>
+                    <w:t xml:space="preserve">Менторинг и координация младших дизайнеров на проекте.</w:t>
                   </w:r>
                 </w:p>
                 <w:p>
@@ -1533,7 +1507,7 @@
                     <w:rPr>
                       <w:color w:val="404040" w:themeColor="text1" w:themeTint="BF"/>
                     </w:rPr>
-                    <w:t xml:space="preserve">Провёл несколько итераций usability-тестирований: сократил количество ошибок на 24% и когнитивную нагрузку на 36% — повысил скорость решения задач.</w:t>
+                    <w:t xml:space="preserve">Собрал кастомизируемый интерфейс на основе MUI, что позволило сократить затраты на разработку и упростить масштабирование на другие подразделения и смежные продукты.</w:t>
                   </w:r>
                 </w:p>
                 <w:p>
@@ -1576,7 +1550,7 @@
                     <w:rPr>
                       <w:color w:val="404040" w:themeColor="text1" w:themeTint="BF"/>
                     </w:rPr>
-                    <w:t xml:space="preserve">Figma, User flow, JTBD, User Story, CJM, дизайн-системы, прототипирование интерфейсов</w:t>
+                    <w:t xml:space="preserve">Figma, MUI, JTBD, User Story, UI-kit, прототипирование интерфейсов</w:t>
                   </w:r>
                 </w:p>
               </w:tc>
@@ -1605,7 +1579,7 @@
                       <w:bCs/>
                       <w:color w:val="AEAAAA" w:themeColor="background2" w:themeShade="BF"/>
                     </w:rPr>
-                    <w:t xml:space="preserve">март 2023 – июль 2023</w:t>
+                    <w:t xml:space="preserve">июль 2023 – декабрь 2024</w:t>
                   </w:r>
                 </w:p>
                 <w:p>
@@ -1623,7 +1597,7 @@
                       <w:bCs/>
                       <w:color w:val="AEAAAA" w:themeColor="background2" w:themeShade="BF"/>
                     </w:rPr>
-                    <w:t xml:space="preserve">(5 месяцев)</w:t>
+                    <w:t xml:space="preserve">(1 год 6 месяцев)</w:t>
                   </w:r>
                 </w:p>
               </w:tc>
@@ -1647,7 +1621,7 @@
                       <w:bCs/>
                       <w:color w:val="404040"/>
                     </w:rPr>
-                    <w:t xml:space="preserve">АО «ОТП Банк» (Web B2B ERP)</w:t>
+                    <w:t xml:space="preserve">БК «Лига Ставок» (Web B2B CRM-ERP)</w:t>
                   </w:r>
                 </w:p>
                 <w:p>
@@ -1729,7 +1703,7 @@
                       <w:sz w:val="20"/>
                       <w:szCs w:val="20"/>
                     </w:rPr>
-                    <w:t xml:space="preserve">Проектирование внутренней HR-системы для формирования и отслеживания командных и индивидуальных целей по всем сотрудникам банка для увеличения эффективности работы.</w:t>
+                    <w:t xml:space="preserve">Проектирование для ядра букмекерского бизнеса — внутренней системы для управления коэффициентами, обработки ставок и другими бизнес-процессами.</w:t>
                   </w:r>
                 </w:p>
                 <w:p>
@@ -1748,7 +1722,7 @@
                     <w:rPr>
                       <w:color w:val="404040" w:themeColor="text1" w:themeTint="BF"/>
                     </w:rPr>
-                    <w:t xml:space="preserve">Проведение интервью с бизнес-заказчиками для выявления реальных проблем и требований.</w:t>
+                    <w:t xml:space="preserve">Онбординг в узкопрофильный продукт со сложной информационной архитектурой.</w:t>
                   </w:r>
                 </w:p>
                 <w:p>
@@ -1767,7 +1741,7 @@
                     <w:rPr>
                       <w:color w:val="404040" w:themeColor="text1" w:themeTint="BF"/>
                     </w:rPr>
-                    <w:t xml:space="preserve">Проработка User flow, JTBD.</w:t>
+                    <w:t xml:space="preserve">Настройка дизайн-процесса в команде разработки продукта.</w:t>
                   </w:r>
                 </w:p>
                 <w:p>
@@ -1786,7 +1760,7 @@
                     <w:rPr>
                       <w:color w:val="404040" w:themeColor="text1" w:themeTint="BF"/>
                     </w:rPr>
-                    <w:t xml:space="preserve">Разработка UX/UI ERP-системы для формирования и отслеживания выполнения целей для команд и сотрудников.</w:t>
+                    <w:t xml:space="preserve">Проведение серий глубинных интервью, на основе которых сформировал гипотезы.</w:t>
                   </w:r>
                 </w:p>
                 <w:p>
@@ -1805,7 +1779,7 @@
                     <w:rPr>
                       <w:color w:val="404040" w:themeColor="text1" w:themeTint="BF"/>
                     </w:rPr>
-                    <w:t xml:space="preserve">Работа с аналитиками и разработчиками, адаптация дизайна под технические ограничения.</w:t>
+                    <w:t xml:space="preserve">Проектирование UX для 3-х групп пользователей (250+ человек) в рамках бизнес-задач.</w:t>
                   </w:r>
                 </w:p>
                 <w:p>
@@ -1824,7 +1798,69 @@
                     <w:rPr>
                       <w:color w:val="404040" w:themeColor="text1" w:themeTint="BF"/>
                     </w:rPr>
-                    <w:t xml:space="preserve">Постановка задач и менторинг младших дизайнеров.</w:t>
+                    <w:t xml:space="preserve">Описание и заведение новых компонентов и виджетов в общую дизайн-систему компании.</w:t>
+                  </w:r>
+                </w:p>
+                <w:p>
+                  <w:pPr>
+                    <w:pStyle w:val="ad"/>
+                    <w:numPr>
+                      <w:ilvl w:val="0"/>
+                      <w:numId w:val="30"/>
+                    </w:numPr>
+                    <w:spacing w:before="45" w:line="211" w:lineRule="auto"/>
+                    <w:rPr>
+                      <w:color w:val="404040" w:themeColor="text1" w:themeTint="BF"/>
+                    </w:rPr>
+                  </w:pPr>
+                  <w:r>
+                    <w:rPr>
+                      <w:color w:val="404040" w:themeColor="text1" w:themeTint="BF"/>
+                    </w:rPr>
+                    <w:t xml:space="preserve">Синхронизация с кросс-командами, тесное взаимодействие с аналитиками, пользователями и командой разработки.</w:t>
+                  </w:r>
+                </w:p>
+                <w:p>
+                  <w:pPr>
+                    <w:pStyle w:val="ad"/>
+                    <w:keepNext/>
+                    <w:spacing w:before="72" w:line="211" w:lineRule="auto"/>
+                    <w:rPr>
+                      <w:bCs/>
+                      <w:color w:val="0483F8"/>
+                      <w:spacing w:val="-2"/>
+                      <w:sz w:val="22"/>
+                      <w:szCs w:val="22"/>
+                    </w:rPr>
+                  </w:pPr>
+                  <w:r>
+                    <w:rPr>
+                      <w:bCs/>
+                      <w:color w:val="0483F8"/>
+                      <w:spacing w:val="-2"/>
+                      <w:sz w:val="22"/>
+                      <w:szCs w:val="22"/>
+                    </w:rPr>
+                    <w:t xml:space="preserve">Достижения</w:t>
+                  </w:r>
+                </w:p>
+                <w:p>
+                  <w:pPr>
+                    <w:pStyle w:val="ad"/>
+                    <w:numPr>
+                      <w:ilvl w:val="0"/>
+                      <w:numId w:val="34"/>
+                    </w:numPr>
+                    <w:spacing w:before="45" w:line="211" w:lineRule="auto"/>
+                    <w:rPr>
+                      <w:color w:val="404040" w:themeColor="text1" w:themeTint="BF"/>
+                    </w:rPr>
+                  </w:pPr>
+                  <w:r>
+                    <w:rPr>
+                      <w:color w:val="404040" w:themeColor="text1" w:themeTint="BF"/>
+                    </w:rPr>
+                    <w:t xml:space="preserve">Провёл несколько итераций usability-тестирований: сократил количество ошибок на 24% и когнитивную нагрузку на 36% — повысил скорость решения задач.</w:t>
                   </w:r>
                 </w:p>
                 <w:p>
@@ -1867,7 +1903,7 @@
                     <w:rPr>
                       <w:color w:val="404040" w:themeColor="text1" w:themeTint="BF"/>
                     </w:rPr>
-                    <w:t xml:space="preserve">Figma, User flow, JTBD, User Story, UI/UX, UI-kit</w:t>
+                    <w:t xml:space="preserve">Figma, User flow, JTBD, User Story, CJM, дизайн-системы, прототипирование интерфейсов</w:t>
                   </w:r>
                 </w:p>
               </w:tc>

</xml_diff>

<commit_message>
Split OTP Bank into phase 1 and phase 2 entries with phase 2 duties
Co-Authored-By: Claude Opus 5.5 <noreply@anthropic.com>
Claude-Session: https://claude.ai/code/session_012npdp2UDGCWsrnjWPKCB4G
</commit_message>
<xml_diff>
--- a/Резюме_ITFB_Михаил_Н_UX-UI.docx
+++ b/Резюме_ITFB_Михаил_Н_UX-UI.docx
@@ -290,7 +290,7 @@
           <w:sz w:val="20"/>
           <w:szCs w:val="20"/>
         </w:rPr>
-        <w:t xml:space="preserve">AI-assisted design: поддержка дизайн-кита и передача в разработку с помощью ИИ (Claude).</w:t>
+        <w:t xml:space="preserve">AI-assisted design: поддержка дизайн-кита, передача в разработку и высокодетализированные HTML-прототипы с помощью ИИ (Claude).</w:t>
       </w:r>
     </w:p>
     <w:p>
@@ -483,43 +483,7 @@
                       <w:bCs/>
                       <w:color w:val="AEAAAA" w:themeColor="background2" w:themeShade="BF"/>
                     </w:rPr>
-                    <w:t xml:space="preserve">(2 месяца, фаза 2)</w:t>
-                  </w:r>
-                </w:p>
-                <w:p>
-                  <w:pPr>
-                    <w:pStyle w:val="ad"/>
-                    <w:spacing w:before="160" w:line="211" w:lineRule="auto"/>
-                    <w:ind w:left="-108" w:right="77"/>
-                    <w:rPr>
-                      <w:bCs/>
-                      <w:color w:val="AEAAAA" w:themeColor="background2" w:themeShade="BF"/>
-                    </w:rPr>
-                  </w:pPr>
-                  <w:r>
-                    <w:rPr>
-                      <w:bCs/>
-                      <w:color w:val="AEAAAA" w:themeColor="background2" w:themeShade="BF"/>
-                    </w:rPr>
-                    <w:t xml:space="preserve">март 2023 – июль 2023</w:t>
-                  </w:r>
-                </w:p>
-                <w:p>
-                  <w:pPr>
-                    <w:pStyle w:val="ad"/>
-                    <w:spacing w:before="54" w:line="211" w:lineRule="auto"/>
-                    <w:ind w:left="-108" w:right="77"/>
-                    <w:rPr>
-                      <w:bCs/>
-                      <w:color w:val="AEAAAA" w:themeColor="background2" w:themeShade="BF"/>
-                    </w:rPr>
-                  </w:pPr>
-                  <w:r>
-                    <w:rPr>
-                      <w:bCs/>
-                      <w:color w:val="AEAAAA" w:themeColor="background2" w:themeShade="BF"/>
-                    </w:rPr>
-                    <w:t xml:space="preserve">(5 месяцев, фаза 1)</w:t>
+                    <w:t xml:space="preserve">(2 месяца)</w:t>
                   </w:r>
                 </w:p>
               </w:tc>
@@ -543,7 +507,7 @@
                       <w:bCs/>
                       <w:color w:val="404040"/>
                     </w:rPr>
-                    <w:t xml:space="preserve">АО «ОТП Банк» (Web B2B ERP)</w:t>
+                    <w:t xml:space="preserve">АО «ОТП Банк» (Web B2B ERP) · фаза 2</w:t>
                   </w:r>
                 </w:p>
                 <w:p>
@@ -625,7 +589,7 @@
                       <w:sz w:val="20"/>
                       <w:szCs w:val="20"/>
                     </w:rPr>
-                    <w:t xml:space="preserve">Проектирование внутренней HR-системы для формирования и отслеживания командных и индивидуальных целей по всем сотрудникам банка для увеличения эффективности работы. С августа 2026 года — вторая фаза проекта.</w:t>
+                    <w:t xml:space="preserve">Вторая фаза развития внутренней HR-системы банка для формирования и отслеживания командных и индивидуальных целей: обновление интерфейса под новые бизнес-требования и расширение функционала платформы. Проект в процессе.</w:t>
                   </w:r>
                 </w:p>
                 <w:p>
@@ -644,7 +608,7 @@
                     <w:rPr>
                       <w:color w:val="404040" w:themeColor="text1" w:themeTint="BF"/>
                     </w:rPr>
-                    <w:t xml:space="preserve">Проведение интервью с бизнес-заказчиками для выявления реальных проблем и требований.</w:t>
+                    <w:t xml:space="preserve">Обновляю интерфейс на основе новых бизнес-требований и расширения функционала платформы.</w:t>
                   </w:r>
                 </w:p>
                 <w:p>
@@ -663,7 +627,7 @@
                     <w:rPr>
                       <w:color w:val="404040" w:themeColor="text1" w:themeTint="BF"/>
                     </w:rPr>
-                    <w:t xml:space="preserve">Проработка User flow, JTBD.</w:t>
+                    <w:t xml:space="preserve">Проектирую с учётом ролевых моделей пользователей системы.</w:t>
                   </w:r>
                 </w:p>
                 <w:p>
@@ -682,7 +646,7 @@
                     <w:rPr>
                       <w:color w:val="404040" w:themeColor="text1" w:themeTint="BF"/>
                     </w:rPr>
-                    <w:t xml:space="preserve">Разработка UX/UI ERP-системы для формирования и отслеживания выполнения целей для команд и сотрудников.</w:t>
+                    <w:t xml:space="preserve">Валидирую решения с заказчиками на каждом этапе.</w:t>
                   </w:r>
                 </w:p>
                 <w:p>
@@ -701,7 +665,7 @@
                     <w:rPr>
                       <w:color w:val="404040" w:themeColor="text1" w:themeTint="BF"/>
                     </w:rPr>
-                    <w:t xml:space="preserve">Работа с аналитиками и разработчиками, адаптация дизайна под технические ограничения.</w:t>
+                    <w:t xml:space="preserve">Готовлю высокодетализированные прототипы на HTML с помощью Claude для полного погружения пользователя в сценарий.</w:t>
                   </w:r>
                 </w:p>
                 <w:p>
@@ -720,7 +684,7 @@
                     <w:rPr>
                       <w:color w:val="404040" w:themeColor="text1" w:themeTint="BF"/>
                     </w:rPr>
-                    <w:t xml:space="preserve">Постановка задач и менторинг младших дизайнеров.</w:t>
+                    <w:t xml:space="preserve">Итеративно улучшаю решения по результатам проведённых тестирований и интервью с пользователями.</w:t>
                   </w:r>
                 </w:p>
                 <w:p>
@@ -763,7 +727,7 @@
                     <w:rPr>
                       <w:color w:val="404040" w:themeColor="text1" w:themeTint="BF"/>
                     </w:rPr>
-                    <w:t xml:space="preserve">Figma, User flow, JTBD, User Story, UI/UX, UI-kit</w:t>
+                    <w:t xml:space="preserve">Figma, HTML-прототипирование, Claude (AI-assisted design), ролевые модели, usability testing, глубинные интервью</w:t>
                   </w:r>
                 </w:p>
               </w:tc>
@@ -1904,6 +1868,297 @@
                       <w:color w:val="404040" w:themeColor="text1" w:themeTint="BF"/>
                     </w:rPr>
                     <w:t xml:space="preserve">Figma, User flow, JTBD, User Story, CJM, дизайн-системы, прототипирование интерфейсов</w:t>
+                  </w:r>
+                </w:p>
+              </w:tc>
+            </w:tr>
+            <w:tr>
+              <w:trPr>
+                <w:cantSplit/>
+              </w:trPr>
+              <w:tc>
+                <w:tcPr>
+                  <w:tcW w:w="2285" w:type="dxa"/>
+                  <w:vMerge w:val="restart"/>
+                </w:tcPr>
+                <w:p>
+                  <w:pPr>
+                    <w:pStyle w:val="ad"/>
+                    <w:spacing w:before="234" w:line="211" w:lineRule="auto"/>
+                    <w:ind w:left="-108" w:right="77"/>
+                    <w:rPr>
+                      <w:bCs/>
+                      <w:color w:val="AEAAAA" w:themeColor="background2" w:themeShade="BF"/>
+                    </w:rPr>
+                  </w:pPr>
+                  <w:r>
+                    <w:rPr>
+                      <w:bCs/>
+                      <w:color w:val="AEAAAA" w:themeColor="background2" w:themeShade="BF"/>
+                    </w:rPr>
+                    <w:t xml:space="preserve">март 2023 – июль 2023</w:t>
+                  </w:r>
+                </w:p>
+                <w:p>
+                  <w:pPr>
+                    <w:pStyle w:val="ad"/>
+                    <w:spacing w:before="54" w:line="211" w:lineRule="auto"/>
+                    <w:ind w:left="-108" w:right="77"/>
+                    <w:rPr>
+                      <w:bCs/>
+                      <w:color w:val="AEAAAA" w:themeColor="background2" w:themeShade="BF"/>
+                    </w:rPr>
+                  </w:pPr>
+                  <w:r>
+                    <w:rPr>
+                      <w:bCs/>
+                      <w:color w:val="AEAAAA" w:themeColor="background2" w:themeShade="BF"/>
+                    </w:rPr>
+                    <w:t xml:space="preserve">(5 месяцев)</w:t>
+                  </w:r>
+                </w:p>
+              </w:tc>
+              <w:tc>
+                <w:tcPr>
+                  <w:tcW w:w="7672" w:type="dxa"/>
+                </w:tcPr>
+                <w:p>
+                  <w:pPr>
+                    <w:keepNext/>
+                    <w:spacing w:before="200"/>
+                    <w:rPr>
+                      <w:b/>
+                      <w:bCs/>
+                      <w:color w:val="404040"/>
+                    </w:rPr>
+                  </w:pPr>
+                  <w:r>
+                    <w:rPr>
+                      <w:b/>
+                      <w:bCs/>
+                      <w:color w:val="404040"/>
+                    </w:rPr>
+                    <w:t xml:space="preserve">АО «ОТП Банк» (Web B2B ERP) · фаза 1</w:t>
+                  </w:r>
+                </w:p>
+                <w:p>
+                  <w:pPr>
+                    <w:keepNext/>
+                    <w:spacing w:before="20"/>
+                    <w:rPr>
+                      <w:b/>
+                      <w:bCs/>
+                      <w:color w:val="404040"/>
+                    </w:rPr>
+                  </w:pPr>
+                  <w:r>
+                    <w:rPr>
+                      <w:b/>
+                      <w:bCs/>
+                      <w:color w:val="404040"/>
+                    </w:rPr>
+                    <w:t xml:space="preserve">UX/UI Designer</w:t>
+                  </w:r>
+                </w:p>
+              </w:tc>
+            </w:tr>
+            <w:tr>
+              <w:tc>
+                <w:tcPr>
+                  <w:tcW w:w="2285" w:type="dxa"/>
+                  <w:vMerge/>
+                </w:tcPr>
+                <w:p>
+                  <w:pPr>
+                    <w:pStyle w:val="ad"/>
+                    <w:spacing w:before="54" w:line="211" w:lineRule="auto"/>
+                    <w:ind w:left="-108" w:right="77"/>
+                    <w:rPr/>
+                  </w:pPr>
+                </w:p>
+              </w:tc>
+              <w:tc>
+                <w:tcPr>
+                  <w:tcW w:w="7672" w:type="dxa"/>
+                </w:tcPr>
+                <w:p>
+                  <w:pPr>
+                    <w:pStyle w:val="ad"/>
+                    <w:keepNext/>
+                    <w:spacing w:before="72" w:line="211" w:lineRule="auto"/>
+                    <w:rPr>
+                      <w:bCs/>
+                      <w:color w:val="0483F8"/>
+                      <w:spacing w:val="-2"/>
+                      <w:sz w:val="22"/>
+                      <w:szCs w:val="22"/>
+                    </w:rPr>
+                  </w:pPr>
+                  <w:r>
+                    <w:rPr>
+                      <w:bCs/>
+                      <w:color w:val="0483F8"/>
+                      <w:spacing w:val="-2"/>
+                      <w:sz w:val="22"/>
+                      <w:szCs w:val="22"/>
+                    </w:rPr>
+                    <w:t xml:space="preserve">Обязанности</w:t>
+                  </w:r>
+                </w:p>
+                <w:p>
+                  <w:pPr>
+                    <w:spacing w:before="72"/>
+                    <w:rPr>
+                      <w:color w:val="404040" w:themeColor="text1" w:themeTint="BF"/>
+                      <w:sz w:val="20"/>
+                      <w:szCs w:val="20"/>
+                    </w:rPr>
+                  </w:pPr>
+                  <w:r>
+                    <w:rPr>
+                      <w:color w:val="404040" w:themeColor="text1" w:themeTint="BF"/>
+                      <w:sz w:val="20"/>
+                      <w:szCs w:val="20"/>
+                    </w:rPr>
+                    <w:t xml:space="preserve">Проектирование внутренней HR-системы для формирования и отслеживания командных и индивидуальных целей по всем сотрудникам банка для увеличения эффективности работы.</w:t>
+                  </w:r>
+                </w:p>
+                <w:p>
+                  <w:pPr>
+                    <w:pStyle w:val="ad"/>
+                    <w:numPr>
+                      <w:ilvl w:val="0"/>
+                      <w:numId w:val="30"/>
+                    </w:numPr>
+                    <w:spacing w:before="45" w:line="211" w:lineRule="auto"/>
+                    <w:rPr>
+                      <w:color w:val="404040" w:themeColor="text1" w:themeTint="BF"/>
+                    </w:rPr>
+                  </w:pPr>
+                  <w:r>
+                    <w:rPr>
+                      <w:color w:val="404040" w:themeColor="text1" w:themeTint="BF"/>
+                    </w:rPr>
+                    <w:t xml:space="preserve">Проведение интервью с бизнес-заказчиками для выявления реальных проблем и требований.</w:t>
+                  </w:r>
+                </w:p>
+                <w:p>
+                  <w:pPr>
+                    <w:pStyle w:val="ad"/>
+                    <w:numPr>
+                      <w:ilvl w:val="0"/>
+                      <w:numId w:val="30"/>
+                    </w:numPr>
+                    <w:spacing w:before="45" w:line="211" w:lineRule="auto"/>
+                    <w:rPr>
+                      <w:color w:val="404040" w:themeColor="text1" w:themeTint="BF"/>
+                    </w:rPr>
+                  </w:pPr>
+                  <w:r>
+                    <w:rPr>
+                      <w:color w:val="404040" w:themeColor="text1" w:themeTint="BF"/>
+                    </w:rPr>
+                    <w:t xml:space="preserve">Проработка User flow, JTBD.</w:t>
+                  </w:r>
+                </w:p>
+                <w:p>
+                  <w:pPr>
+                    <w:pStyle w:val="ad"/>
+                    <w:numPr>
+                      <w:ilvl w:val="0"/>
+                      <w:numId w:val="30"/>
+                    </w:numPr>
+                    <w:spacing w:before="45" w:line="211" w:lineRule="auto"/>
+                    <w:rPr>
+                      <w:color w:val="404040" w:themeColor="text1" w:themeTint="BF"/>
+                    </w:rPr>
+                  </w:pPr>
+                  <w:r>
+                    <w:rPr>
+                      <w:color w:val="404040" w:themeColor="text1" w:themeTint="BF"/>
+                    </w:rPr>
+                    <w:t xml:space="preserve">Разработка UX/UI ERP-системы для формирования и отслеживания выполнения целей для команд и сотрудников.</w:t>
+                  </w:r>
+                </w:p>
+                <w:p>
+                  <w:pPr>
+                    <w:pStyle w:val="ad"/>
+                    <w:numPr>
+                      <w:ilvl w:val="0"/>
+                      <w:numId w:val="30"/>
+                    </w:numPr>
+                    <w:spacing w:before="45" w:line="211" w:lineRule="auto"/>
+                    <w:rPr>
+                      <w:color w:val="404040" w:themeColor="text1" w:themeTint="BF"/>
+                    </w:rPr>
+                  </w:pPr>
+                  <w:r>
+                    <w:rPr>
+                      <w:color w:val="404040" w:themeColor="text1" w:themeTint="BF"/>
+                    </w:rPr>
+                    <w:t xml:space="preserve">Работа с аналитиками и разработчиками, адаптация дизайна под технические ограничения.</w:t>
+                  </w:r>
+                </w:p>
+                <w:p>
+                  <w:pPr>
+                    <w:pStyle w:val="ad"/>
+                    <w:numPr>
+                      <w:ilvl w:val="0"/>
+                      <w:numId w:val="30"/>
+                    </w:numPr>
+                    <w:spacing w:before="45" w:line="211" w:lineRule="auto"/>
+                    <w:rPr>
+                      <w:color w:val="404040" w:themeColor="text1" w:themeTint="BF"/>
+                    </w:rPr>
+                  </w:pPr>
+                  <w:r>
+                    <w:rPr>
+                      <w:color w:val="404040" w:themeColor="text1" w:themeTint="BF"/>
+                    </w:rPr>
+                    <w:t xml:space="preserve">Постановка задач и менторинг младших дизайнеров.</w:t>
+                  </w:r>
+                </w:p>
+                <w:p>
+                  <w:pPr>
+                    <w:pStyle w:val="ad"/>
+                    <w:keepNext/>
+                    <w:spacing w:before="72" w:line="211" w:lineRule="auto"/>
+                    <w:rPr>
+                      <w:bCs/>
+                      <w:color w:val="0483F8"/>
+                      <w:spacing w:val="-2"/>
+                      <w:sz w:val="22"/>
+                      <w:szCs w:val="22"/>
+                    </w:rPr>
+                  </w:pPr>
+                  <w:r>
+                    <w:rPr>
+                      <w:bCs/>
+                      <w:color w:val="0483F8"/>
+                      <w:spacing w:val="-2"/>
+                      <w:sz w:val="22"/>
+                      <w:szCs w:val="22"/>
+                    </w:rPr>
+                    <w:t xml:space="preserve">Технологии</w:t>
+                  </w:r>
+                </w:p>
+                <w:p>
+                  <w:pPr>
+                    <w:pStyle w:val="ad"/>
+                    <w:numPr>
+                      <w:ilvl w:val="0"/>
+                      <w:numId w:val="23"/>
+                    </w:numPr>
+                    <w:spacing w:before="45" w:line="211" w:lineRule="auto"/>
+                    <w:rPr>
+                      <w:color w:val="404040" w:themeColor="text1" w:themeTint="BF"/>
+                    </w:rPr>
+                  </w:pPr>
+                  <w:r>
+                    <w:rPr>
+                      <w:color w:val="404040" w:themeColor="text1" w:themeTint="BF"/>
+                    </w:rPr>
+                    <w:t xml:space="preserve">Figma, User flow, JTBD, User Story, UI/UX, UI-kit</w:t>
                   </w:r>
                 </w:p>
               </w:tc>

</xml_diff>

<commit_message>
Add Figma + Claude workflow to «Вкусно и точка» and key skills
Co-Authored-By: Claude Opus 5.5 <noreply@anthropic.com>
Claude-Session: https://claude.ai/code/session_012npdp2UDGCWsrnjWPKCB4G
</commit_message>
<xml_diff>
--- a/Резюме_ITFB_Михаил_Н_UX-UI.docx
+++ b/Резюме_ITFB_Михаил_Н_UX-UI.docx
@@ -290,7 +290,7 @@
           <w:sz w:val="20"/>
           <w:szCs w:val="20"/>
         </w:rPr>
-        <w:t xml:space="preserve">AI-assisted design: поддержка дизайн-кита, передача в разработку и высокодетализированные HTML-прототипы с помощью ИИ (Claude).</w:t>
+        <w:t xml:space="preserve">AI-assisted design (Figma + Claude): сборка макетов на основе дизайн-системы, поддержка дизайн-кита, передача в разработку, высокодетализированные HTML-прототипы.</w:t>
       </w:r>
     </w:p>
     <w:p>
@@ -994,6 +994,25 @@
                     <w:rPr>
                       <w:color w:val="404040" w:themeColor="text1" w:themeTint="BF"/>
                     </w:rPr>
+                    <w:t xml:space="preserve">Выстроил связку Figma + Claude для управляемой сборки качественных макетов на основе дизайн-системы и предварительных пользовательских сценариев, сформированных из бизнес-требований и технических ограничений.</w:t>
+                  </w:r>
+                </w:p>
+                <w:p>
+                  <w:pPr>
+                    <w:pStyle w:val="ad"/>
+                    <w:numPr>
+                      <w:ilvl w:val="0"/>
+                      <w:numId w:val="30"/>
+                    </w:numPr>
+                    <w:spacing w:before="45" w:line="211" w:lineRule="auto"/>
+                    <w:rPr>
+                      <w:color w:val="404040" w:themeColor="text1" w:themeTint="BF"/>
+                    </w:rPr>
+                  </w:pPr>
+                  <w:r>
+                    <w:rPr>
+                      <w:color w:val="404040" w:themeColor="text1" w:themeTint="BF"/>
+                    </w:rPr>
                     <w:t xml:space="preserve">Защищал дизайн-решения перед топ-менеджментом заказчика, опираясь на данные интервью и логику бизнес-процессов.</w:t>
                   </w:r>
                 </w:p>
@@ -1142,7 +1161,7 @@
                     <w:rPr>
                       <w:color w:val="404040" w:themeColor="text1" w:themeTint="BF"/>
                     </w:rPr>
-                    <w:t xml:space="preserve">Figma, Draw.io, Claude (AI-assisted design), User flow, JTBD, дизайн-системы, UI-kit, прототипирование интерфейсов, Knowledge Base / FAQ</w:t>
+                    <w:t xml:space="preserve">Figma + Claude (AI-assisted design), Draw.io, User flow, JTBD, дизайн-системы, UI-kit, прототипирование интерфейсов, Knowledge Base / FAQ</w:t>
                   </w:r>
                 </w:p>
               </w:tc>

</xml_diff>

<commit_message>
Rework resume wording for UX/data focus; fix page-break orphans
Co-Authored-By: Claude Opus 5.5 <noreply@anthropic.com>
Claude-Session: https://claude.ai/code/session_012npdp2UDGCWsrnjWPKCB4G
</commit_message>
<xml_diff>
--- a/Резюме_ITFB_Михаил_Н_UX-UI.docx
+++ b/Резюме_ITFB_Михаил_Н_UX-UI.docx
@@ -150,7 +150,7 @@
           <w:sz w:val="20"/>
           <w:szCs w:val="20"/>
         </w:rPr>
-        <w:t xml:space="preserve">Проектирование интерфейсов сложных систем (ERP, CRM, MES, SaaS, B2E), Web и Mobile.</w:t>
+        <w:t xml:space="preserve">UX-исследования: глубинные интервью с пользователями и бизнес-заказчиками, юзабилити-тестирование, формирование гипотез по результатам исследований.</w:t>
       </w:r>
     </w:p>
     <w:p>
@@ -170,7 +170,7 @@
           <w:sz w:val="20"/>
           <w:szCs w:val="20"/>
         </w:rPr>
-        <w:t xml:space="preserve">Figma, Miro, Draw.io, Confluence, Jira; MUI, iOS / Android guidelines.</w:t>
+        <w:t xml:space="preserve">Решения на основе данных: проверка гипотез в итерациях тестирования, оценка по метрикам (ошибки, когнитивная нагрузка, скорость решения задач).</w:t>
       </w:r>
     </w:p>
     <w:p>
@@ -190,7 +190,7 @@
           <w:sz w:val="20"/>
           <w:szCs w:val="20"/>
         </w:rPr>
-        <w:t xml:space="preserve">User flow, JTBD, User Story, CJM, информационная архитектура.</w:t>
+        <w:t xml:space="preserve">UX-проектирование: информационная архитектура, User flow, JTBD, User Story, CJM, ролевые модели, краевые состояния.</w:t>
       </w:r>
     </w:p>
     <w:p>
@@ -210,7 +210,7 @@
           <w:sz w:val="20"/>
           <w:szCs w:val="20"/>
         </w:rPr>
-        <w:t xml:space="preserve">Дизайн-системы и UI-kit: токены, компоненты, масштабирование на модули и продукты.</w:t>
+        <w:t xml:space="preserve">Сложные продукты для крупных компаний: ERP, CRM, MES, HR-системы, B2E — Web и Mobile (ОТП Банк, Лига Ставок, Новатэк, «Вкусно и точка»).</w:t>
       </w:r>
     </w:p>
     <w:p>
@@ -230,7 +230,7 @@
           <w:sz w:val="20"/>
           <w:szCs w:val="20"/>
         </w:rPr>
-        <w:t xml:space="preserve">Прототипирование: wireframes, интерактивные прототипы, дизайн-макеты.</w:t>
+        <w:t xml:space="preserve">Аргументация решений: защита дизайна перед топ-менеджментом и заказчиками на основе данных интервью и логики бизнес-процессов.</w:t>
       </w:r>
     </w:p>
     <w:p>
@@ -250,7 +250,7 @@
           <w:sz w:val="20"/>
           <w:szCs w:val="20"/>
         </w:rPr>
-        <w:t xml:space="preserve">Глубинные интервью с бизнес-заказчиками и пользователями, анализ бизнес-процессов.</w:t>
+        <w:t xml:space="preserve">Прототипирование: wireframes, интерактивные прототипы в Figma, высокодетализированные HTML-прототипы для тестирования сценариев.</w:t>
       </w:r>
     </w:p>
     <w:p>
@@ -270,7 +270,7 @@
           <w:sz w:val="20"/>
           <w:szCs w:val="20"/>
         </w:rPr>
-        <w:t xml:space="preserve">Подготовка и проведение юзабилити-тестов, анализ данных.</w:t>
+        <w:t xml:space="preserve">UI и дизайн-системы: компоненты и токены в Figma, развитие общей дизайн-системы продукта, UI-kit, MUI.</w:t>
       </w:r>
     </w:p>
     <w:p>
@@ -290,7 +290,7 @@
           <w:sz w:val="20"/>
           <w:szCs w:val="20"/>
         </w:rPr>
-        <w:t xml:space="preserve">AI-assisted design (Figma + Claude): сборка макетов на основе дизайн-системы, поддержка дизайн-кита, передача в разработку, высокодетализированные HTML-прототипы.</w:t>
+        <w:t xml:space="preserve">Масштабирование интерфейсов на платформы и устройства: Web, iOS / Android, адаптивность, тёмная тема, доступность.</w:t>
       </w:r>
     </w:p>
     <w:p>
@@ -310,7 +310,7 @@
           <w:sz w:val="20"/>
           <w:szCs w:val="20"/>
         </w:rPr>
-        <w:t xml:space="preserve">Взаимодействие с аналитиками и разработчиками, гибкость в работе с техническими ограничениями.</w:t>
+        <w:t xml:space="preserve">Визуальный язык: перенос брендбука в digital, иконографика, графический дизайн и брендированные материалы, микро-анимации интерфейсов.</w:t>
       </w:r>
     </w:p>
     <w:p>
@@ -330,7 +330,27 @@
           <w:sz w:val="20"/>
           <w:szCs w:val="20"/>
         </w:rPr>
-        <w:t xml:space="preserve">Защита дизайн-решений перед топ-менеджментом заказчика.</w:t>
+        <w:t xml:space="preserve">AI-assisted design (Figma + Claude): сборка макетов на основе дизайн-системы, поддержка дизайн-кита, передача в разработку.</w:t>
+      </w:r>
+    </w:p>
+    <w:p>
+      <w:pPr>
+        <w:pStyle w:val="af"/>
+        <w:numPr>
+          <w:ilvl w:val="0"/>
+          <w:numId w:val="29"/>
+        </w:numPr>
+        <w:rPr>
+          <w:sz w:val="20"/>
+          <w:szCs w:val="20"/>
+        </w:rPr>
+      </w:pPr>
+      <w:r>
+        <w:rPr>
+          <w:sz w:val="20"/>
+          <w:szCs w:val="20"/>
+        </w:rPr>
+        <w:t xml:space="preserve">Передача в разработку и дизайнерское сопровождение реализации; плотная работа с аналитиками, фронтенд- и бэкенд-командами.</w:t>
       </w:r>
     </w:p>
     <w:p>
@@ -380,7 +400,7 @@
           <w:sz w:val="20"/>
           <w:szCs w:val="20"/>
         </w:rPr>
-        <w:t xml:space="preserve">Системное мышление, проработка логики любой сложности.</w:t>
+        <w:t xml:space="preserve">Инструменты: Figma, Miro, Draw.io, Confluence, Jira.</w:t>
       </w:r>
     </w:p>
     <w:p>
@@ -529,27 +549,6 @@
                     <w:t xml:space="preserve">UX/UI Designer</w:t>
                   </w:r>
                 </w:p>
-              </w:tc>
-            </w:tr>
-            <w:tr>
-              <w:tc>
-                <w:tcPr>
-                  <w:tcW w:w="2285" w:type="dxa"/>
-                  <w:vMerge/>
-                </w:tcPr>
-                <w:p>
-                  <w:pPr>
-                    <w:pStyle w:val="ad"/>
-                    <w:spacing w:before="54" w:line="211" w:lineRule="auto"/>
-                    <w:ind w:left="-108" w:right="77"/>
-                    <w:rPr/>
-                  </w:pPr>
-                </w:p>
-              </w:tc>
-              <w:tc>
-                <w:tcPr>
-                  <w:tcW w:w="7672" w:type="dxa"/>
-                </w:tcPr>
                 <w:p>
                   <w:pPr>
                     <w:pStyle w:val="ad"/>
@@ -608,9 +607,34 @@
                     <w:rPr>
                       <w:color w:val="404040" w:themeColor="text1" w:themeTint="BF"/>
                     </w:rPr>
-                    <w:t xml:space="preserve">Обновляю интерфейс на основе новых бизнес-требований и расширения функционала платформы.</w:t>
+                    <w:t xml:space="preserve">Обновляю интерфейс под новые бизнес-требования и расширение функционала платформы.</w:t>
                   </w:r>
                 </w:p>
+              </w:tc>
+            </w:tr>
+            <w:tr>
+              <w:trPr>
+                <w:cantSplit/>
+              </w:trPr>
+              <w:tc>
+                <w:tcPr>
+                  <w:tcW w:w="2285" w:type="dxa"/>
+                  <w:vMerge/>
+                </w:tcPr>
+                <w:p>
+                  <w:pPr>
+                    <w:spacing w:before="0" w:after="0" w:line="20" w:lineRule="exact"/>
+                    <w:rPr>
+                      <w:sz w:val="2"/>
+                      <w:szCs w:val="2"/>
+                    </w:rPr>
+                  </w:pPr>
+                </w:p>
+              </w:tc>
+              <w:tc>
+                <w:tcPr>
+                  <w:tcW w:w="7672" w:type="dxa"/>
+                </w:tcPr>
                 <w:p>
                   <w:pPr>
                     <w:pStyle w:val="ad"/>
@@ -627,9 +651,34 @@
                     <w:rPr>
                       <w:color w:val="404040" w:themeColor="text1" w:themeTint="BF"/>
                     </w:rPr>
-                    <w:t xml:space="preserve">Проектирую с учётом ролевых моделей пользователей системы.</w:t>
+                    <w:t xml:space="preserve">Проектирую сценарии с учётом ролевых моделей пользователей системы.</w:t>
                   </w:r>
                 </w:p>
+              </w:tc>
+            </w:tr>
+            <w:tr>
+              <w:trPr>
+                <w:cantSplit/>
+              </w:trPr>
+              <w:tc>
+                <w:tcPr>
+                  <w:tcW w:w="2285" w:type="dxa"/>
+                  <w:vMerge/>
+                </w:tcPr>
+                <w:p>
+                  <w:pPr>
+                    <w:spacing w:before="0" w:after="0" w:line="20" w:lineRule="exact"/>
+                    <w:rPr>
+                      <w:sz w:val="2"/>
+                      <w:szCs w:val="2"/>
+                    </w:rPr>
+                  </w:pPr>
+                </w:p>
+              </w:tc>
+              <w:tc>
+                <w:tcPr>
+                  <w:tcW w:w="7672" w:type="dxa"/>
+                </w:tcPr>
                 <w:p>
                   <w:pPr>
                     <w:pStyle w:val="ad"/>
@@ -646,9 +695,34 @@
                     <w:rPr>
                       <w:color w:val="404040" w:themeColor="text1" w:themeTint="BF"/>
                     </w:rPr>
-                    <w:t xml:space="preserve">Валидирую решения с заказчиками на каждом этапе.</w:t>
+                    <w:t xml:space="preserve">Готовлю высокодетализированные HTML-прототипы с помощью Claude, чтобы пользователь полностью погружался в сценарий при проверке.</w:t>
                   </w:r>
                 </w:p>
+              </w:tc>
+            </w:tr>
+            <w:tr>
+              <w:trPr>
+                <w:cantSplit/>
+              </w:trPr>
+              <w:tc>
+                <w:tcPr>
+                  <w:tcW w:w="2285" w:type="dxa"/>
+                  <w:vMerge/>
+                </w:tcPr>
+                <w:p>
+                  <w:pPr>
+                    <w:spacing w:before="0" w:after="0" w:line="20" w:lineRule="exact"/>
+                    <w:rPr>
+                      <w:sz w:val="2"/>
+                      <w:szCs w:val="2"/>
+                    </w:rPr>
+                  </w:pPr>
+                </w:p>
+              </w:tc>
+              <w:tc>
+                <w:tcPr>
+                  <w:tcW w:w="7672" w:type="dxa"/>
+                </w:tcPr>
                 <w:p>
                   <w:pPr>
                     <w:pStyle w:val="ad"/>
@@ -665,9 +739,34 @@
                     <w:rPr>
                       <w:color w:val="404040" w:themeColor="text1" w:themeTint="BF"/>
                     </w:rPr>
-                    <w:t xml:space="preserve">Готовлю высокодетализированные прототипы на HTML с помощью Claude для полного погружения пользователя в сценарий.</w:t>
+                    <w:t xml:space="preserve">Итеративно дорабатываю решения по результатам проведённых тестирований и интервью с пользователями.</w:t>
                   </w:r>
                 </w:p>
+              </w:tc>
+            </w:tr>
+            <w:tr>
+              <w:trPr>
+                <w:cantSplit/>
+              </w:trPr>
+              <w:tc>
+                <w:tcPr>
+                  <w:tcW w:w="2285" w:type="dxa"/>
+                  <w:vMerge/>
+                </w:tcPr>
+                <w:p>
+                  <w:pPr>
+                    <w:spacing w:before="0" w:after="0" w:line="20" w:lineRule="exact"/>
+                    <w:rPr>
+                      <w:sz w:val="2"/>
+                      <w:szCs w:val="2"/>
+                    </w:rPr>
+                  </w:pPr>
+                </w:p>
+              </w:tc>
+              <w:tc>
+                <w:tcPr>
+                  <w:tcW w:w="7672" w:type="dxa"/>
+                </w:tcPr>
                 <w:p>
                   <w:pPr>
                     <w:pStyle w:val="ad"/>
@@ -684,9 +783,34 @@
                     <w:rPr>
                       <w:color w:val="404040" w:themeColor="text1" w:themeTint="BF"/>
                     </w:rPr>
-                    <w:t xml:space="preserve">Итеративно улучшаю решения по результатам проведённых тестирований и интервью с пользователями.</w:t>
+                    <w:t xml:space="preserve">Валидирую решения с заказчиками на каждом этапе.</w:t>
                   </w:r>
                 </w:p>
+              </w:tc>
+            </w:tr>
+            <w:tr>
+              <w:trPr>
+                <w:cantSplit/>
+              </w:trPr>
+              <w:tc>
+                <w:tcPr>
+                  <w:tcW w:w="2285" w:type="dxa"/>
+                  <w:vMerge/>
+                </w:tcPr>
+                <w:p>
+                  <w:pPr>
+                    <w:spacing w:before="0" w:after="0" w:line="20" w:lineRule="exact"/>
+                    <w:rPr>
+                      <w:sz w:val="2"/>
+                      <w:szCs w:val="2"/>
+                    </w:rPr>
+                  </w:pPr>
+                </w:p>
+              </w:tc>
+              <w:tc>
+                <w:tcPr>
+                  <w:tcW w:w="7672" w:type="dxa"/>
+                </w:tcPr>
                 <w:p>
                   <w:pPr>
                     <w:pStyle w:val="ad"/>
@@ -820,9 +944,73 @@
                     <w:t xml:space="preserve">UX/UI Designer</w:t>
                   </w:r>
                 </w:p>
+                <w:p>
+                  <w:pPr>
+                    <w:pStyle w:val="ad"/>
+                    <w:keepNext/>
+                    <w:spacing w:before="72" w:line="211" w:lineRule="auto"/>
+                    <w:rPr>
+                      <w:bCs/>
+                      <w:color w:val="0483F8"/>
+                      <w:spacing w:val="-2"/>
+                      <w:sz w:val="22"/>
+                      <w:szCs w:val="22"/>
+                    </w:rPr>
+                  </w:pPr>
+                  <w:r>
+                    <w:rPr>
+                      <w:bCs/>
+                      <w:color w:val="0483F8"/>
+                      <w:spacing w:val="-2"/>
+                      <w:sz w:val="22"/>
+                      <w:szCs w:val="22"/>
+                    </w:rPr>
+                    <w:t xml:space="preserve">Обязанности</w:t>
+                  </w:r>
+                </w:p>
+                <w:p>
+                  <w:pPr>
+                    <w:spacing w:before="72"/>
+                    <w:rPr>
+                      <w:color w:val="404040" w:themeColor="text1" w:themeTint="BF"/>
+                      <w:sz w:val="20"/>
+                      <w:szCs w:val="20"/>
+                    </w:rPr>
+                  </w:pPr>
+                  <w:r>
+                    <w:rPr>
+                      <w:color w:val="404040" w:themeColor="text1" w:themeTint="BF"/>
+                      <w:sz w:val="20"/>
+                      <w:szCs w:val="20"/>
+                    </w:rPr>
+                    <w:t xml:space="preserve">Проектирование с нуля корпоративного мобильного приложения для сотрудников сети ресторанов (20 000+ пользователей) и веб-админ-панели: новостная лента, календарь корпоративных событий, личные кабинеты сотрудника и предприятия, система баллов и поощрений, КЭДО, внутренний помощник (FAQ).</w:t>
+                  </w:r>
+                </w:p>
+                <w:p>
+                  <w:pPr>
+                    <w:pStyle w:val="ad"/>
+                    <w:numPr>
+                      <w:ilvl w:val="0"/>
+                      <w:numId w:val="30"/>
+                    </w:numPr>
+                    <w:spacing w:before="45" w:line="211" w:lineRule="auto"/>
+                    <w:rPr>
+                      <w:color w:val="404040" w:themeColor="text1" w:themeTint="BF"/>
+                    </w:rPr>
+                  </w:pPr>
+                  <w:r>
+                    <w:rPr>
+                      <w:color w:val="404040" w:themeColor="text1" w:themeTint="BF"/>
+                    </w:rPr>
+                    <w:t xml:space="preserve">Провёл серию интервью с сотрудниками ПБО и офиса, проанализировал действующие бизнес-процессы и выявил узкие места, которые закрывает продукт.</w:t>
+                  </w:r>
+                </w:p>
               </w:tc>
             </w:tr>
             <w:tr>
+              <w:trPr>
+                <w:cantSplit/>
+              </w:trPr>
               <w:tc>
                 <w:tcPr>
                   <w:tcW w:w="2285" w:type="dxa"/>
@@ -830,10 +1018,319 @@
                 </w:tcPr>
                 <w:p>
                   <w:pPr>
+                    <w:spacing w:before="0" w:after="0" w:line="20" w:lineRule="exact"/>
+                    <w:rPr>
+                      <w:sz w:val="2"/>
+                      <w:szCs w:val="2"/>
+                    </w:rPr>
+                  </w:pPr>
+                </w:p>
+              </w:tc>
+              <w:tc>
+                <w:tcPr>
+                  <w:tcW w:w="7672" w:type="dxa"/>
+                </w:tcPr>
+                <w:p>
+                  <w:pPr>
                     <w:pStyle w:val="ad"/>
-                    <w:spacing w:before="54" w:line="211" w:lineRule="auto"/>
-                    <w:ind w:left="-108" w:right="77"/>
-                    <w:rPr/>
+                    <w:numPr>
+                      <w:ilvl w:val="0"/>
+                      <w:numId w:val="30"/>
+                    </w:numPr>
+                    <w:spacing w:before="45" w:line="211" w:lineRule="auto"/>
+                    <w:rPr>
+                      <w:color w:val="404040" w:themeColor="text1" w:themeTint="BF"/>
+                    </w:rPr>
+                  </w:pPr>
+                  <w:r>
+                    <w:rPr>
+                      <w:color w:val="404040" w:themeColor="text1" w:themeTint="BF"/>
+                    </w:rPr>
+                    <w:t xml:space="preserve">Спроектировал продукт целиком: информационная архитектура, пользовательские сценарии, интерактивные прототипы в Figma для сборки целостной картины приложения.</w:t>
+                  </w:r>
+                </w:p>
+              </w:tc>
+            </w:tr>
+            <w:tr>
+              <w:trPr>
+                <w:cantSplit/>
+              </w:trPr>
+              <w:tc>
+                <w:tcPr>
+                  <w:tcW w:w="2285" w:type="dxa"/>
+                  <w:vMerge/>
+                </w:tcPr>
+                <w:p>
+                  <w:pPr>
+                    <w:spacing w:before="0" w:after="0" w:line="20" w:lineRule="exact"/>
+                    <w:rPr>
+                      <w:sz w:val="2"/>
+                      <w:szCs w:val="2"/>
+                    </w:rPr>
+                  </w:pPr>
+                </w:p>
+              </w:tc>
+              <w:tc>
+                <w:tcPr>
+                  <w:tcW w:w="7672" w:type="dxa"/>
+                </w:tcPr>
+                <w:p>
+                  <w:pPr>
+                    <w:pStyle w:val="ad"/>
+                    <w:numPr>
+                      <w:ilvl w:val="0"/>
+                      <w:numId w:val="30"/>
+                    </w:numPr>
+                    <w:spacing w:before="45" w:line="211" w:lineRule="auto"/>
+                    <w:rPr>
+                      <w:color w:val="404040" w:themeColor="text1" w:themeTint="BF"/>
+                    </w:rPr>
+                  </w:pPr>
+                  <w:r>
+                    <w:rPr>
+                      <w:color w:val="404040" w:themeColor="text1" w:themeTint="BF"/>
+                    </w:rPr>
+                    <w:t xml:space="preserve">Построил граф-схемы сценариев в Draw.io — путь пользователя от входа в сценарий до целевого действия, с ветвлениями, ролевой видимостью (6 уровней сотрудников) и проработкой краевых состояний.</w:t>
+                  </w:r>
+                </w:p>
+              </w:tc>
+            </w:tr>
+            <w:tr>
+              <w:trPr>
+                <w:cantSplit/>
+              </w:trPr>
+              <w:tc>
+                <w:tcPr>
+                  <w:tcW w:w="2285" w:type="dxa"/>
+                  <w:vMerge/>
+                </w:tcPr>
+                <w:p>
+                  <w:pPr>
+                    <w:spacing w:before="0" w:after="0" w:line="20" w:lineRule="exact"/>
+                    <w:rPr>
+                      <w:sz w:val="2"/>
+                      <w:szCs w:val="2"/>
+                    </w:rPr>
+                  </w:pPr>
+                </w:p>
+              </w:tc>
+              <w:tc>
+                <w:tcPr>
+                  <w:tcW w:w="7672" w:type="dxa"/>
+                </w:tcPr>
+                <w:p>
+                  <w:pPr>
+                    <w:pStyle w:val="ad"/>
+                    <w:numPr>
+                      <w:ilvl w:val="0"/>
+                      <w:numId w:val="30"/>
+                    </w:numPr>
+                    <w:spacing w:before="45" w:line="211" w:lineRule="auto"/>
+                    <w:rPr>
+                      <w:color w:val="404040" w:themeColor="text1" w:themeTint="BF"/>
+                    </w:rPr>
+                  </w:pPr>
+                  <w:r>
+                    <w:rPr>
+                      <w:color w:val="404040" w:themeColor="text1" w:themeTint="BF"/>
+                    </w:rPr>
+                    <w:t xml:space="preserve">Собрал и структурировал контент для внутреннего помощника: провёл интервью с сотрудниками, сформировал таксономию категорий вопросов и наполнение базы знаний FAQ как основу для автоматизации ответов.</w:t>
+                  </w:r>
+                </w:p>
+              </w:tc>
+            </w:tr>
+            <w:tr>
+              <w:trPr>
+                <w:cantSplit/>
+              </w:trPr>
+              <w:tc>
+                <w:tcPr>
+                  <w:tcW w:w="2285" w:type="dxa"/>
+                  <w:vMerge/>
+                </w:tcPr>
+                <w:p>
+                  <w:pPr>
+                    <w:spacing w:before="0" w:after="0" w:line="20" w:lineRule="exact"/>
+                    <w:rPr>
+                      <w:sz w:val="2"/>
+                      <w:szCs w:val="2"/>
+                    </w:rPr>
+                  </w:pPr>
+                </w:p>
+              </w:tc>
+              <w:tc>
+                <w:tcPr>
+                  <w:tcW w:w="7672" w:type="dxa"/>
+                </w:tcPr>
+                <w:p>
+                  <w:pPr>
+                    <w:pStyle w:val="ad"/>
+                    <w:numPr>
+                      <w:ilvl w:val="0"/>
+                      <w:numId w:val="30"/>
+                    </w:numPr>
+                    <w:spacing w:before="45" w:line="211" w:lineRule="auto"/>
+                    <w:rPr>
+                      <w:color w:val="404040" w:themeColor="text1" w:themeTint="BF"/>
+                    </w:rPr>
+                  </w:pPr>
+                  <w:r>
+                    <w:rPr>
+                      <w:color w:val="404040" w:themeColor="text1" w:themeTint="BF"/>
+                    </w:rPr>
+                    <w:t xml:space="preserve">Адаптировал брендбук компании под мобильный формат: перенёс фирменный визуальный язык в digital, собрал UI-kit под задачи приложения.</w:t>
+                  </w:r>
+                </w:p>
+              </w:tc>
+            </w:tr>
+            <w:tr>
+              <w:trPr>
+                <w:cantSplit/>
+              </w:trPr>
+              <w:tc>
+                <w:tcPr>
+                  <w:tcW w:w="2285" w:type="dxa"/>
+                  <w:vMerge/>
+                </w:tcPr>
+                <w:p>
+                  <w:pPr>
+                    <w:spacing w:before="0" w:after="0" w:line="20" w:lineRule="exact"/>
+                    <w:rPr>
+                      <w:sz w:val="2"/>
+                      <w:szCs w:val="2"/>
+                    </w:rPr>
+                  </w:pPr>
+                </w:p>
+              </w:tc>
+              <w:tc>
+                <w:tcPr>
+                  <w:tcW w:w="7672" w:type="dxa"/>
+                </w:tcPr>
+                <w:p>
+                  <w:pPr>
+                    <w:pStyle w:val="ad"/>
+                    <w:numPr>
+                      <w:ilvl w:val="0"/>
+                      <w:numId w:val="30"/>
+                    </w:numPr>
+                    <w:spacing w:before="45" w:line="211" w:lineRule="auto"/>
+                    <w:rPr>
+                      <w:color w:val="404040" w:themeColor="text1" w:themeTint="BF"/>
+                    </w:rPr>
+                  </w:pPr>
+                  <w:r>
+                    <w:rPr>
+                      <w:color w:val="404040" w:themeColor="text1" w:themeTint="BF"/>
+                    </w:rPr>
+                    <w:t xml:space="preserve">Выстроил связку Figma + Claude для управляемой сборки качественных макетов на основе дизайн-системы и предварительных пользовательских сценариев, сформированных из бизнес-требований и технических ограничений.</w:t>
+                  </w:r>
+                </w:p>
+              </w:tc>
+            </w:tr>
+            <w:tr>
+              <w:trPr>
+                <w:cantSplit/>
+              </w:trPr>
+              <w:tc>
+                <w:tcPr>
+                  <w:tcW w:w="2285" w:type="dxa"/>
+                  <w:vMerge/>
+                </w:tcPr>
+                <w:p>
+                  <w:pPr>
+                    <w:spacing w:before="0" w:after="0" w:line="20" w:lineRule="exact"/>
+                    <w:rPr>
+                      <w:sz w:val="2"/>
+                      <w:szCs w:val="2"/>
+                    </w:rPr>
+                  </w:pPr>
+                </w:p>
+              </w:tc>
+              <w:tc>
+                <w:tcPr>
+                  <w:tcW w:w="7672" w:type="dxa"/>
+                </w:tcPr>
+                <w:p>
+                  <w:pPr>
+                    <w:pStyle w:val="ad"/>
+                    <w:numPr>
+                      <w:ilvl w:val="0"/>
+                      <w:numId w:val="30"/>
+                    </w:numPr>
+                    <w:spacing w:before="45" w:line="211" w:lineRule="auto"/>
+                    <w:rPr>
+                      <w:color w:val="404040" w:themeColor="text1" w:themeTint="BF"/>
+                    </w:rPr>
+                  </w:pPr>
+                  <w:r>
+                    <w:rPr>
+                      <w:color w:val="404040" w:themeColor="text1" w:themeTint="BF"/>
+                    </w:rPr>
+                    <w:t xml:space="preserve">Защищал дизайн-решения перед топ-менеджментом заказчика, опираясь на данные интервью и логику бизнес-процессов.</w:t>
+                  </w:r>
+                </w:p>
+              </w:tc>
+            </w:tr>
+            <w:tr>
+              <w:trPr>
+                <w:cantSplit/>
+              </w:trPr>
+              <w:tc>
+                <w:tcPr>
+                  <w:tcW w:w="2285" w:type="dxa"/>
+                  <w:vMerge/>
+                </w:tcPr>
+                <w:p>
+                  <w:pPr>
+                    <w:spacing w:before="0" w:after="0" w:line="20" w:lineRule="exact"/>
+                    <w:rPr>
+                      <w:sz w:val="2"/>
+                      <w:szCs w:val="2"/>
+                    </w:rPr>
+                  </w:pPr>
+                </w:p>
+              </w:tc>
+              <w:tc>
+                <w:tcPr>
+                  <w:tcW w:w="7672" w:type="dxa"/>
+                </w:tcPr>
+                <w:p>
+                  <w:pPr>
+                    <w:pStyle w:val="ad"/>
+                    <w:numPr>
+                      <w:ilvl w:val="0"/>
+                      <w:numId w:val="30"/>
+                    </w:numPr>
+                    <w:spacing w:before="45" w:line="211" w:lineRule="auto"/>
+                    <w:rPr>
+                      <w:color w:val="404040" w:themeColor="text1" w:themeTint="BF"/>
+                    </w:rPr>
+                  </w:pPr>
+                  <w:r>
+                    <w:rPr>
+                      <w:color w:val="404040" w:themeColor="text1" w:themeTint="BF"/>
+                    </w:rPr>
+                    <w:t xml:space="preserve">Объяснял разработчикам логику сценариев, адаптировал дизайн под технические ограничения.</w:t>
+                  </w:r>
+                </w:p>
+              </w:tc>
+            </w:tr>
+            <w:tr>
+              <w:trPr>
+                <w:cantSplit/>
+              </w:trPr>
+              <w:tc>
+                <w:tcPr>
+                  <w:tcW w:w="2285" w:type="dxa"/>
+                  <w:vMerge/>
+                </w:tcPr>
+                <w:p>
+                  <w:pPr>
+                    <w:spacing w:before="0" w:after="0" w:line="20" w:lineRule="exact"/>
+                    <w:rPr>
+                      <w:sz w:val="2"/>
+                      <w:szCs w:val="2"/>
+                    </w:rPr>
                   </w:pPr>
                 </w:p>
               </w:tc>
@@ -862,200 +1359,6 @@
                       <w:sz w:val="22"/>
                       <w:szCs w:val="22"/>
                     </w:rPr>
-                    <w:t xml:space="preserve">Обязанности</w:t>
-                  </w:r>
-                </w:p>
-                <w:p>
-                  <w:pPr>
-                    <w:spacing w:before="72"/>
-                    <w:rPr>
-                      <w:color w:val="404040" w:themeColor="text1" w:themeTint="BF"/>
-                      <w:sz w:val="20"/>
-                      <w:szCs w:val="20"/>
-                    </w:rPr>
-                  </w:pPr>
-                  <w:r>
-                    <w:rPr>
-                      <w:color w:val="404040" w:themeColor="text1" w:themeTint="BF"/>
-                      <w:sz w:val="20"/>
-                      <w:szCs w:val="20"/>
-                    </w:rPr>
-                    <w:t xml:space="preserve">Проектирование с нуля корпоративного мобильного приложения для сотрудников сети ресторанов (20 000+ пользователей) и веб-админ-панели: новостная лента, календарь корпоративных событий, личные кабинеты сотрудника и предприятия, система баллов и поощрений, КЭДО, внутренний помощник (FAQ).</w:t>
-                  </w:r>
-                </w:p>
-                <w:p>
-                  <w:pPr>
-                    <w:pStyle w:val="ad"/>
-                    <w:numPr>
-                      <w:ilvl w:val="0"/>
-                      <w:numId w:val="30"/>
-                    </w:numPr>
-                    <w:spacing w:before="45" w:line="211" w:lineRule="auto"/>
-                    <w:rPr>
-                      <w:color w:val="404040" w:themeColor="text1" w:themeTint="BF"/>
-                    </w:rPr>
-                  </w:pPr>
-                  <w:r>
-                    <w:rPr>
-                      <w:color w:val="404040" w:themeColor="text1" w:themeTint="BF"/>
-                    </w:rPr>
-                    <w:t xml:space="preserve">Спроектировал продукт целиком: информационная архитектура, пользовательские сценарии, интерактивные прототипы в Figma для сборки целостной картины приложения.</w:t>
-                  </w:r>
-                </w:p>
-                <w:p>
-                  <w:pPr>
-                    <w:pStyle w:val="ad"/>
-                    <w:numPr>
-                      <w:ilvl w:val="0"/>
-                      <w:numId w:val="30"/>
-                    </w:numPr>
-                    <w:spacing w:before="45" w:line="211" w:lineRule="auto"/>
-                    <w:rPr>
-                      <w:color w:val="404040" w:themeColor="text1" w:themeTint="BF"/>
-                    </w:rPr>
-                  </w:pPr>
-                  <w:r>
-                    <w:rPr>
-                      <w:color w:val="404040" w:themeColor="text1" w:themeTint="BF"/>
-                    </w:rPr>
-                    <w:t xml:space="preserve">Построил граф-схемы сценариев в Draw.io — путь пользователя от входа в сценарий до целевого действия, с ветвлениями, ролевой видимостью (6 уровней сотрудников) и проработкой краевых состояний.</w:t>
-                  </w:r>
-                </w:p>
-                <w:p>
-                  <w:pPr>
-                    <w:pStyle w:val="ad"/>
-                    <w:numPr>
-                      <w:ilvl w:val="0"/>
-                      <w:numId w:val="30"/>
-                    </w:numPr>
-                    <w:spacing w:before="45" w:line="211" w:lineRule="auto"/>
-                    <w:rPr>
-                      <w:color w:val="404040" w:themeColor="text1" w:themeTint="BF"/>
-                    </w:rPr>
-                  </w:pPr>
-                  <w:r>
-                    <w:rPr>
-                      <w:color w:val="404040" w:themeColor="text1" w:themeTint="BF"/>
-                    </w:rPr>
-                    <w:t xml:space="preserve">Собрал и структурировал контент для внутреннего помощника: провёл интервью с сотрудниками, сформировал таксономию категорий вопросов и наполнение базы знаний FAQ как основу для автоматизации ответов.</w:t>
-                  </w:r>
-                </w:p>
-                <w:p>
-                  <w:pPr>
-                    <w:pStyle w:val="ad"/>
-                    <w:numPr>
-                      <w:ilvl w:val="0"/>
-                      <w:numId w:val="30"/>
-                    </w:numPr>
-                    <w:spacing w:before="45" w:line="211" w:lineRule="auto"/>
-                    <w:rPr>
-                      <w:color w:val="404040" w:themeColor="text1" w:themeTint="BF"/>
-                    </w:rPr>
-                  </w:pPr>
-                  <w:r>
-                    <w:rPr>
-                      <w:color w:val="404040" w:themeColor="text1" w:themeTint="BF"/>
-                    </w:rPr>
-                    <w:t xml:space="preserve">Провёл серию интервью с сотрудниками ПБО и офиса, проанализировал действующие бизнес-процессы и выявил узкие места, которые закрывает продукт.</w:t>
-                  </w:r>
-                </w:p>
-                <w:p>
-                  <w:pPr>
-                    <w:pStyle w:val="ad"/>
-                    <w:numPr>
-                      <w:ilvl w:val="0"/>
-                      <w:numId w:val="30"/>
-                    </w:numPr>
-                    <w:spacing w:before="45" w:line="211" w:lineRule="auto"/>
-                    <w:rPr>
-                      <w:color w:val="404040" w:themeColor="text1" w:themeTint="BF"/>
-                    </w:rPr>
-                  </w:pPr>
-                  <w:r>
-                    <w:rPr>
-                      <w:color w:val="404040" w:themeColor="text1" w:themeTint="BF"/>
-                    </w:rPr>
-                    <w:t xml:space="preserve">Адаптировал брендбук компании под мобильный формат: перенёс фирменный визуальный язык в digital, собрал UI-kit под задачи приложения.</w:t>
-                  </w:r>
-                </w:p>
-                <w:p>
-                  <w:pPr>
-                    <w:pStyle w:val="ad"/>
-                    <w:numPr>
-                      <w:ilvl w:val="0"/>
-                      <w:numId w:val="30"/>
-                    </w:numPr>
-                    <w:spacing w:before="45" w:line="211" w:lineRule="auto"/>
-                    <w:rPr>
-                      <w:color w:val="404040" w:themeColor="text1" w:themeTint="BF"/>
-                    </w:rPr>
-                  </w:pPr>
-                  <w:r>
-                    <w:rPr>
-                      <w:color w:val="404040" w:themeColor="text1" w:themeTint="BF"/>
-                    </w:rPr>
-                    <w:t xml:space="preserve">Выстроил связку Figma + Claude для управляемой сборки качественных макетов на основе дизайн-системы и предварительных пользовательских сценариев, сформированных из бизнес-требований и технических ограничений.</w:t>
-                  </w:r>
-                </w:p>
-                <w:p>
-                  <w:pPr>
-                    <w:pStyle w:val="ad"/>
-                    <w:numPr>
-                      <w:ilvl w:val="0"/>
-                      <w:numId w:val="30"/>
-                    </w:numPr>
-                    <w:spacing w:before="45" w:line="211" w:lineRule="auto"/>
-                    <w:rPr>
-                      <w:color w:val="404040" w:themeColor="text1" w:themeTint="BF"/>
-                    </w:rPr>
-                  </w:pPr>
-                  <w:r>
-                    <w:rPr>
-                      <w:color w:val="404040" w:themeColor="text1" w:themeTint="BF"/>
-                    </w:rPr>
-                    <w:t xml:space="preserve">Защищал дизайн-решения перед топ-менеджментом заказчика, опираясь на данные интервью и логику бизнес-процессов.</w:t>
-                  </w:r>
-                </w:p>
-                <w:p>
-                  <w:pPr>
-                    <w:pStyle w:val="ad"/>
-                    <w:numPr>
-                      <w:ilvl w:val="0"/>
-                      <w:numId w:val="30"/>
-                    </w:numPr>
-                    <w:spacing w:before="45" w:line="211" w:lineRule="auto"/>
-                    <w:rPr>
-                      <w:color w:val="404040" w:themeColor="text1" w:themeTint="BF"/>
-                    </w:rPr>
-                  </w:pPr>
-                  <w:r>
-                    <w:rPr>
-                      <w:color w:val="404040" w:themeColor="text1" w:themeTint="BF"/>
-                    </w:rPr>
-                    <w:t xml:space="preserve">Объяснял разработчикам логику сценариев, адаптировал дизайн под технические ограничения.</w:t>
-                  </w:r>
-                </w:p>
-                <w:p>
-                  <w:pPr>
-                    <w:pStyle w:val="ad"/>
-                    <w:keepNext/>
-                    <w:spacing w:before="72" w:line="211" w:lineRule="auto"/>
-                    <w:rPr>
-                      <w:bCs/>
-                      <w:color w:val="0483F8"/>
-                      <w:spacing w:val="-2"/>
-                      <w:sz w:val="22"/>
-                      <w:szCs w:val="22"/>
-                    </w:rPr>
-                  </w:pPr>
-                  <w:r>
-                    <w:rPr>
-                      <w:bCs/>
-                      <w:color w:val="0483F8"/>
-                      <w:spacing w:val="-2"/>
-                      <w:sz w:val="22"/>
-                      <w:szCs w:val="22"/>
-                    </w:rPr>
                     <w:t xml:space="preserve">Достижения</w:t>
                   </w:r>
                 </w:p>
@@ -1075,9 +1378,34 @@
                     <w:rPr>
                       <w:color w:val="404040" w:themeColor="text1" w:themeTint="BF"/>
                     </w:rPr>
-                    <w:t xml:space="preserve">Выстроил работу с дизайн-китом через ИИ (Claude): автоматизировал поддержку компонентов и передачу в разработку — по оценке команды разработки, сократило время фронтенд-разработки до 40%.</w:t>
+                    <w:t xml:space="preserve">Решение → результат: автоматизировал поддержку дизайн-кита и передачу в разработку через Claude — по оценке команды разработки, время фронтенд-разработки сократилось до 40%.</w:t>
                   </w:r>
                 </w:p>
+              </w:tc>
+            </w:tr>
+            <w:tr>
+              <w:trPr>
+                <w:cantSplit/>
+              </w:trPr>
+              <w:tc>
+                <w:tcPr>
+                  <w:tcW w:w="2285" w:type="dxa"/>
+                  <w:vMerge/>
+                </w:tcPr>
+                <w:p>
+                  <w:pPr>
+                    <w:spacing w:before="0" w:after="0" w:line="20" w:lineRule="exact"/>
+                    <w:rPr>
+                      <w:sz w:val="2"/>
+                      <w:szCs w:val="2"/>
+                    </w:rPr>
+                  </w:pPr>
+                </w:p>
+              </w:tc>
+              <w:tc>
+                <w:tcPr>
+                  <w:tcW w:w="7672" w:type="dxa"/>
+                </w:tcPr>
                 <w:p>
                   <w:pPr>
                     <w:pStyle w:val="ad"/>
@@ -1121,6 +1449,31 @@
                     <w:t xml:space="preserve">Арт-директор, бизнес- и системные аналитики, фронтенд- и бэкенд-команды.</w:t>
                   </w:r>
                 </w:p>
+              </w:tc>
+            </w:tr>
+            <w:tr>
+              <w:trPr>
+                <w:cantSplit/>
+              </w:trPr>
+              <w:tc>
+                <w:tcPr>
+                  <w:tcW w:w="2285" w:type="dxa"/>
+                  <w:vMerge/>
+                </w:tcPr>
+                <w:p>
+                  <w:pPr>
+                    <w:spacing w:before="0" w:after="0" w:line="20" w:lineRule="exact"/>
+                    <w:rPr>
+                      <w:sz w:val="2"/>
+                      <w:szCs w:val="2"/>
+                    </w:rPr>
+                  </w:pPr>
+                </w:p>
+              </w:tc>
+              <w:tc>
+                <w:tcPr>
+                  <w:tcW w:w="7672" w:type="dxa"/>
+                </w:tcPr>
                 <w:p>
                   <w:pPr>
                     <w:pStyle w:val="ad"/>
@@ -1254,9 +1607,73 @@
                     <w:t xml:space="preserve">UX/UI Designer</w:t>
                   </w:r>
                 </w:p>
+                <w:p>
+                  <w:pPr>
+                    <w:pStyle w:val="ad"/>
+                    <w:keepNext/>
+                    <w:spacing w:before="72" w:line="211" w:lineRule="auto"/>
+                    <w:rPr>
+                      <w:bCs/>
+                      <w:color w:val="0483F8"/>
+                      <w:spacing w:val="-2"/>
+                      <w:sz w:val="22"/>
+                      <w:szCs w:val="22"/>
+                    </w:rPr>
+                  </w:pPr>
+                  <w:r>
+                    <w:rPr>
+                      <w:bCs/>
+                      <w:color w:val="0483F8"/>
+                      <w:spacing w:val="-2"/>
+                      <w:sz w:val="22"/>
+                      <w:szCs w:val="22"/>
+                    </w:rPr>
+                    <w:t xml:space="preserve">Обязанности</w:t>
+                  </w:r>
+                </w:p>
+                <w:p>
+                  <w:pPr>
+                    <w:spacing w:before="72"/>
+                    <w:rPr>
+                      <w:color w:val="404040" w:themeColor="text1" w:themeTint="BF"/>
+                      <w:sz w:val="20"/>
+                      <w:szCs w:val="20"/>
+                    </w:rPr>
+                  </w:pPr>
+                  <w:r>
+                    <w:rPr>
+                      <w:color w:val="404040" w:themeColor="text1" w:themeTint="BF"/>
+                      <w:sz w:val="20"/>
+                      <w:szCs w:val="20"/>
+                    </w:rPr>
+                    <w:t xml:space="preserve">Разработка MES-системы для проектирования, планирования и мониторинга производственного процесса строительства и бурения нефтегазовых скважин для инженеров и операторов.</w:t>
+                  </w:r>
+                </w:p>
+                <w:p>
+                  <w:pPr>
+                    <w:pStyle w:val="ad"/>
+                    <w:numPr>
+                      <w:ilvl w:val="0"/>
+                      <w:numId w:val="30"/>
+                    </w:numPr>
+                    <w:spacing w:before="45" w:line="211" w:lineRule="auto"/>
+                    <w:rPr>
+                      <w:color w:val="404040" w:themeColor="text1" w:themeTint="BF"/>
+                    </w:rPr>
+                  </w:pPr>
+                  <w:r>
+                    <w:rPr>
+                      <w:color w:val="404040" w:themeColor="text1" w:themeTint="BF"/>
+                    </w:rPr>
+                    <w:t xml:space="preserve">Погрузился в узкопрофильный продукт со сложной информационной архитектурой.</w:t>
+                  </w:r>
+                </w:p>
               </w:tc>
             </w:tr>
             <w:tr>
+              <w:trPr>
+                <w:cantSplit/>
+              </w:trPr>
               <w:tc>
                 <w:tcPr>
                   <w:tcW w:w="2285" w:type="dxa"/>
@@ -1264,10 +1681,275 @@
                 </w:tcPr>
                 <w:p>
                   <w:pPr>
+                    <w:spacing w:before="0" w:after="0" w:line="20" w:lineRule="exact"/>
+                    <w:rPr>
+                      <w:sz w:val="2"/>
+                      <w:szCs w:val="2"/>
+                    </w:rPr>
+                  </w:pPr>
+                </w:p>
+              </w:tc>
+              <w:tc>
+                <w:tcPr>
+                  <w:tcW w:w="7672" w:type="dxa"/>
+                </w:tcPr>
+                <w:p>
+                  <w:pPr>
                     <w:pStyle w:val="ad"/>
-                    <w:spacing w:before="54" w:line="211" w:lineRule="auto"/>
-                    <w:ind w:left="-108" w:right="77"/>
-                    <w:rPr/>
+                    <w:numPr>
+                      <w:ilvl w:val="0"/>
+                      <w:numId w:val="30"/>
+                    </w:numPr>
+                    <w:spacing w:before="45" w:line="211" w:lineRule="auto"/>
+                    <w:rPr>
+                      <w:color w:val="404040" w:themeColor="text1" w:themeTint="BF"/>
+                    </w:rPr>
+                  </w:pPr>
+                  <w:r>
+                    <w:rPr>
+                      <w:color w:val="404040" w:themeColor="text1" w:themeTint="BF"/>
+                    </w:rPr>
+                    <w:t xml:space="preserve">Провёл серию глубинных интервью с пользователями.</w:t>
+                  </w:r>
+                </w:p>
+              </w:tc>
+            </w:tr>
+            <w:tr>
+              <w:trPr>
+                <w:cantSplit/>
+              </w:trPr>
+              <w:tc>
+                <w:tcPr>
+                  <w:tcW w:w="2285" w:type="dxa"/>
+                  <w:vMerge/>
+                </w:tcPr>
+                <w:p>
+                  <w:pPr>
+                    <w:spacing w:before="0" w:after="0" w:line="20" w:lineRule="exact"/>
+                    <w:rPr>
+                      <w:sz w:val="2"/>
+                      <w:szCs w:val="2"/>
+                    </w:rPr>
+                  </w:pPr>
+                </w:p>
+              </w:tc>
+              <w:tc>
+                <w:tcPr>
+                  <w:tcW w:w="7672" w:type="dxa"/>
+                </w:tcPr>
+                <w:p>
+                  <w:pPr>
+                    <w:pStyle w:val="ad"/>
+                    <w:numPr>
+                      <w:ilvl w:val="0"/>
+                      <w:numId w:val="30"/>
+                    </w:numPr>
+                    <w:spacing w:before="45" w:line="211" w:lineRule="auto"/>
+                    <w:rPr>
+                      <w:color w:val="404040" w:themeColor="text1" w:themeTint="BF"/>
+                    </w:rPr>
+                  </w:pPr>
+                  <w:r>
+                    <w:rPr>
+                      <w:color w:val="404040" w:themeColor="text1" w:themeTint="BF"/>
+                    </w:rPr>
+                    <w:t xml:space="preserve">Проанализировал и оптимизировал пользовательские сценарии текущего легаси-софта.</w:t>
+                  </w:r>
+                </w:p>
+              </w:tc>
+            </w:tr>
+            <w:tr>
+              <w:trPr>
+                <w:cantSplit/>
+              </w:trPr>
+              <w:tc>
+                <w:tcPr>
+                  <w:tcW w:w="2285" w:type="dxa"/>
+                  <w:vMerge/>
+                </w:tcPr>
+                <w:p>
+                  <w:pPr>
+                    <w:spacing w:before="0" w:after="0" w:line="20" w:lineRule="exact"/>
+                    <w:rPr>
+                      <w:sz w:val="2"/>
+                      <w:szCs w:val="2"/>
+                    </w:rPr>
+                  </w:pPr>
+                </w:p>
+              </w:tc>
+              <w:tc>
+                <w:tcPr>
+                  <w:tcW w:w="7672" w:type="dxa"/>
+                </w:tcPr>
+                <w:p>
+                  <w:pPr>
+                    <w:pStyle w:val="ad"/>
+                    <w:numPr>
+                      <w:ilvl w:val="0"/>
+                      <w:numId w:val="30"/>
+                    </w:numPr>
+                    <w:spacing w:before="45" w:line="211" w:lineRule="auto"/>
+                    <w:rPr>
+                      <w:color w:val="404040" w:themeColor="text1" w:themeTint="BF"/>
+                    </w:rPr>
+                  </w:pPr>
+                  <w:r>
+                    <w:rPr>
+                      <w:color w:val="404040" w:themeColor="text1" w:themeTint="BF"/>
+                    </w:rPr>
+                    <w:t xml:space="preserve">Спроектировал UX веб-интерфейса для инженеров по бурению.</w:t>
+                  </w:r>
+                </w:p>
+              </w:tc>
+            </w:tr>
+            <w:tr>
+              <w:trPr>
+                <w:cantSplit/>
+              </w:trPr>
+              <w:tc>
+                <w:tcPr>
+                  <w:tcW w:w="2285" w:type="dxa"/>
+                  <w:vMerge/>
+                </w:tcPr>
+                <w:p>
+                  <w:pPr>
+                    <w:spacing w:before="0" w:after="0" w:line="20" w:lineRule="exact"/>
+                    <w:rPr>
+                      <w:sz w:val="2"/>
+                      <w:szCs w:val="2"/>
+                    </w:rPr>
+                  </w:pPr>
+                </w:p>
+              </w:tc>
+              <w:tc>
+                <w:tcPr>
+                  <w:tcW w:w="7672" w:type="dxa"/>
+                </w:tcPr>
+                <w:p>
+                  <w:pPr>
+                    <w:pStyle w:val="ad"/>
+                    <w:numPr>
+                      <w:ilvl w:val="0"/>
+                      <w:numId w:val="30"/>
+                    </w:numPr>
+                    <w:spacing w:before="45" w:line="211" w:lineRule="auto"/>
+                    <w:rPr>
+                      <w:color w:val="404040" w:themeColor="text1" w:themeTint="BF"/>
+                    </w:rPr>
+                  </w:pPr>
+                  <w:r>
+                    <w:rPr>
+                      <w:color w:val="404040" w:themeColor="text1" w:themeTint="BF"/>
+                    </w:rPr>
+                    <w:t xml:space="preserve">Разработал гибкую палитру на основе токенов под запрос клиента для масштабирования на модули проекта.</w:t>
+                  </w:r>
+                </w:p>
+              </w:tc>
+            </w:tr>
+            <w:tr>
+              <w:trPr>
+                <w:cantSplit/>
+              </w:trPr>
+              <w:tc>
+                <w:tcPr>
+                  <w:tcW w:w="2285" w:type="dxa"/>
+                  <w:vMerge/>
+                </w:tcPr>
+                <w:p>
+                  <w:pPr>
+                    <w:spacing w:before="0" w:after="0" w:line="20" w:lineRule="exact"/>
+                    <w:rPr>
+                      <w:sz w:val="2"/>
+                      <w:szCs w:val="2"/>
+                    </w:rPr>
+                  </w:pPr>
+                </w:p>
+              </w:tc>
+              <w:tc>
+                <w:tcPr>
+                  <w:tcW w:w="7672" w:type="dxa"/>
+                </w:tcPr>
+                <w:p>
+                  <w:pPr>
+                    <w:pStyle w:val="ad"/>
+                    <w:numPr>
+                      <w:ilvl w:val="0"/>
+                      <w:numId w:val="30"/>
+                    </w:numPr>
+                    <w:spacing w:before="45" w:line="211" w:lineRule="auto"/>
+                    <w:rPr>
+                      <w:color w:val="404040" w:themeColor="text1" w:themeTint="BF"/>
+                    </w:rPr>
+                  </w:pPr>
+                  <w:r>
+                    <w:rPr>
+                      <w:color w:val="404040" w:themeColor="text1" w:themeTint="BF"/>
+                    </w:rPr>
+                    <w:t xml:space="preserve">Создал уникальную иконографику для проекта.</w:t>
+                  </w:r>
+                </w:p>
+              </w:tc>
+            </w:tr>
+            <w:tr>
+              <w:trPr>
+                <w:cantSplit/>
+              </w:trPr>
+              <w:tc>
+                <w:tcPr>
+                  <w:tcW w:w="2285" w:type="dxa"/>
+                  <w:vMerge/>
+                </w:tcPr>
+                <w:p>
+                  <w:pPr>
+                    <w:spacing w:before="0" w:after="0" w:line="20" w:lineRule="exact"/>
+                    <w:rPr>
+                      <w:sz w:val="2"/>
+                      <w:szCs w:val="2"/>
+                    </w:rPr>
+                  </w:pPr>
+                </w:p>
+              </w:tc>
+              <w:tc>
+                <w:tcPr>
+                  <w:tcW w:w="7672" w:type="dxa"/>
+                </w:tcPr>
+                <w:p>
+                  <w:pPr>
+                    <w:pStyle w:val="ad"/>
+                    <w:numPr>
+                      <w:ilvl w:val="0"/>
+                      <w:numId w:val="30"/>
+                    </w:numPr>
+                    <w:spacing w:before="45" w:line="211" w:lineRule="auto"/>
+                    <w:rPr>
+                      <w:color w:val="404040" w:themeColor="text1" w:themeTint="BF"/>
+                    </w:rPr>
+                  </w:pPr>
+                  <w:r>
+                    <w:rPr>
+                      <w:color w:val="404040" w:themeColor="text1" w:themeTint="BF"/>
+                    </w:rPr>
+                    <w:t xml:space="preserve">Менторил и координировал младших дизайнеров на проекте.</w:t>
+                  </w:r>
+                </w:p>
+              </w:tc>
+            </w:tr>
+            <w:tr>
+              <w:trPr>
+                <w:cantSplit/>
+              </w:trPr>
+              <w:tc>
+                <w:tcPr>
+                  <w:tcW w:w="2285" w:type="dxa"/>
+                  <w:vMerge/>
+                </w:tcPr>
+                <w:p>
+                  <w:pPr>
+                    <w:spacing w:before="0" w:after="0" w:line="20" w:lineRule="exact"/>
+                    <w:rPr>
+                      <w:sz w:val="2"/>
+                      <w:szCs w:val="2"/>
+                    </w:rPr>
                   </w:pPr>
                 </w:p>
               </w:tc>
@@ -1296,181 +1978,6 @@
                       <w:sz w:val="22"/>
                       <w:szCs w:val="22"/>
                     </w:rPr>
-                    <w:t xml:space="preserve">Обязанности</w:t>
-                  </w:r>
-                </w:p>
-                <w:p>
-                  <w:pPr>
-                    <w:spacing w:before="72"/>
-                    <w:rPr>
-                      <w:color w:val="404040" w:themeColor="text1" w:themeTint="BF"/>
-                      <w:sz w:val="20"/>
-                      <w:szCs w:val="20"/>
-                    </w:rPr>
-                  </w:pPr>
-                  <w:r>
-                    <w:rPr>
-                      <w:color w:val="404040" w:themeColor="text1" w:themeTint="BF"/>
-                      <w:sz w:val="20"/>
-                      <w:szCs w:val="20"/>
-                    </w:rPr>
-                    <w:t xml:space="preserve">Разработка MES-системы для проектирования, планирования и мониторинга производственного процесса строительства и бурения нефтегазовых скважин для инженеров и операторов.</w:t>
-                  </w:r>
-                </w:p>
-                <w:p>
-                  <w:pPr>
-                    <w:pStyle w:val="ad"/>
-                    <w:numPr>
-                      <w:ilvl w:val="0"/>
-                      <w:numId w:val="30"/>
-                    </w:numPr>
-                    <w:spacing w:before="45" w:line="211" w:lineRule="auto"/>
-                    <w:rPr>
-                      <w:color w:val="404040" w:themeColor="text1" w:themeTint="BF"/>
-                    </w:rPr>
-                  </w:pPr>
-                  <w:r>
-                    <w:rPr>
-                      <w:color w:val="404040" w:themeColor="text1" w:themeTint="BF"/>
-                    </w:rPr>
-                    <w:t xml:space="preserve">Онбординг в узкопрофильный продукт со сложной информационной архитектурой.</w:t>
-                  </w:r>
-                </w:p>
-                <w:p>
-                  <w:pPr>
-                    <w:pStyle w:val="ad"/>
-                    <w:numPr>
-                      <w:ilvl w:val="0"/>
-                      <w:numId w:val="30"/>
-                    </w:numPr>
-                    <w:spacing w:before="45" w:line="211" w:lineRule="auto"/>
-                    <w:rPr>
-                      <w:color w:val="404040" w:themeColor="text1" w:themeTint="BF"/>
-                    </w:rPr>
-                  </w:pPr>
-                  <w:r>
-                    <w:rPr>
-                      <w:color w:val="404040" w:themeColor="text1" w:themeTint="BF"/>
-                    </w:rPr>
-                    <w:t xml:space="preserve">Проведение серии глубинных интервью.</w:t>
-                  </w:r>
-                </w:p>
-                <w:p>
-                  <w:pPr>
-                    <w:pStyle w:val="ad"/>
-                    <w:numPr>
-                      <w:ilvl w:val="0"/>
-                      <w:numId w:val="30"/>
-                    </w:numPr>
-                    <w:spacing w:before="45" w:line="211" w:lineRule="auto"/>
-                    <w:rPr>
-                      <w:color w:val="404040" w:themeColor="text1" w:themeTint="BF"/>
-                    </w:rPr>
-                  </w:pPr>
-                  <w:r>
-                    <w:rPr>
-                      <w:color w:val="404040" w:themeColor="text1" w:themeTint="BF"/>
-                    </w:rPr>
-                    <w:t xml:space="preserve">Оптимизация пользовательских сценариев текущего легаси-софта.</w:t>
-                  </w:r>
-                </w:p>
-                <w:p>
-                  <w:pPr>
-                    <w:pStyle w:val="ad"/>
-                    <w:numPr>
-                      <w:ilvl w:val="0"/>
-                      <w:numId w:val="30"/>
-                    </w:numPr>
-                    <w:spacing w:before="45" w:line="211" w:lineRule="auto"/>
-                    <w:rPr>
-                      <w:color w:val="404040" w:themeColor="text1" w:themeTint="BF"/>
-                    </w:rPr>
-                  </w:pPr>
-                  <w:r>
-                    <w:rPr>
-                      <w:color w:val="404040" w:themeColor="text1" w:themeTint="BF"/>
-                    </w:rPr>
-                    <w:t xml:space="preserve">Проработка UX-решения для веб-интерфейса инженеров по бурению.</w:t>
-                  </w:r>
-                </w:p>
-                <w:p>
-                  <w:pPr>
-                    <w:pStyle w:val="ad"/>
-                    <w:numPr>
-                      <w:ilvl w:val="0"/>
-                      <w:numId w:val="30"/>
-                    </w:numPr>
-                    <w:spacing w:before="45" w:line="211" w:lineRule="auto"/>
-                    <w:rPr>
-                      <w:color w:val="404040" w:themeColor="text1" w:themeTint="BF"/>
-                    </w:rPr>
-                  </w:pPr>
-                  <w:r>
-                    <w:rPr>
-                      <w:color w:val="404040" w:themeColor="text1" w:themeTint="BF"/>
-                    </w:rPr>
-                    <w:t xml:space="preserve">Работа с иконографикой: создание уникальных иконок для проекта.</w:t>
-                  </w:r>
-                </w:p>
-                <w:p>
-                  <w:pPr>
-                    <w:pStyle w:val="ad"/>
-                    <w:numPr>
-                      <w:ilvl w:val="0"/>
-                      <w:numId w:val="30"/>
-                    </w:numPr>
-                    <w:spacing w:before="45" w:line="211" w:lineRule="auto"/>
-                    <w:rPr>
-                      <w:color w:val="404040" w:themeColor="text1" w:themeTint="BF"/>
-                    </w:rPr>
-                  </w:pPr>
-                  <w:r>
-                    <w:rPr>
-                      <w:color w:val="404040" w:themeColor="text1" w:themeTint="BF"/>
-                    </w:rPr>
-                    <w:t xml:space="preserve">Работа с UI: создание гибкой палитры на основе токенов под запрос клиента для масштабирования в рамках модулей проекта.</w:t>
-                  </w:r>
-                </w:p>
-                <w:p>
-                  <w:pPr>
-                    <w:pStyle w:val="ad"/>
-                    <w:numPr>
-                      <w:ilvl w:val="0"/>
-                      <w:numId w:val="30"/>
-                    </w:numPr>
-                    <w:spacing w:before="45" w:line="211" w:lineRule="auto"/>
-                    <w:rPr>
-                      <w:color w:val="404040" w:themeColor="text1" w:themeTint="BF"/>
-                    </w:rPr>
-                  </w:pPr>
-                  <w:r>
-                    <w:rPr>
-                      <w:color w:val="404040" w:themeColor="text1" w:themeTint="BF"/>
-                    </w:rPr>
-                    <w:t xml:space="preserve">Менторинг и координация младших дизайнеров на проекте.</w:t>
-                  </w:r>
-                </w:p>
-                <w:p>
-                  <w:pPr>
-                    <w:pStyle w:val="ad"/>
-                    <w:keepNext/>
-                    <w:spacing w:before="72" w:line="211" w:lineRule="auto"/>
-                    <w:rPr>
-                      <w:bCs/>
-                      <w:color w:val="0483F8"/>
-                      <w:spacing w:val="-2"/>
-                      <w:sz w:val="22"/>
-                      <w:szCs w:val="22"/>
-                    </w:rPr>
-                  </w:pPr>
-                  <w:r>
-                    <w:rPr>
-                      <w:bCs/>
-                      <w:color w:val="0483F8"/>
-                      <w:spacing w:val="-2"/>
-                      <w:sz w:val="22"/>
-                      <w:szCs w:val="22"/>
-                    </w:rPr>
                     <w:t xml:space="preserve">Достижения</w:t>
                   </w:r>
                 </w:p>
@@ -1490,9 +1997,34 @@
                     <w:rPr>
                       <w:color w:val="404040" w:themeColor="text1" w:themeTint="BF"/>
                     </w:rPr>
-                    <w:t xml:space="preserve">Собрал кастомизируемый интерфейс на основе MUI, что позволило сократить затраты на разработку и упростить масштабирование на другие подразделения и смежные продукты.</w:t>
+                    <w:t xml:space="preserve">Собрал кастомизируемый интерфейс на основе MUI — сократил затраты на разработку и упростил масштабирование на другие подразделения и смежные продукты.</w:t>
                   </w:r>
                 </w:p>
+              </w:tc>
+            </w:tr>
+            <w:tr>
+              <w:trPr>
+                <w:cantSplit/>
+              </w:trPr>
+              <w:tc>
+                <w:tcPr>
+                  <w:tcW w:w="2285" w:type="dxa"/>
+                  <w:vMerge/>
+                </w:tcPr>
+                <w:p>
+                  <w:pPr>
+                    <w:spacing w:before="0" w:after="0" w:line="20" w:lineRule="exact"/>
+                    <w:rPr>
+                      <w:sz w:val="2"/>
+                      <w:szCs w:val="2"/>
+                    </w:rPr>
+                  </w:pPr>
+                </w:p>
+              </w:tc>
+              <w:tc>
+                <w:tcPr>
+                  <w:tcW w:w="7672" w:type="dxa"/>
+                </w:tcPr>
                 <w:p>
                   <w:pPr>
                     <w:pStyle w:val="ad"/>
@@ -1533,7 +2065,7 @@
                     <w:rPr>
                       <w:color w:val="404040" w:themeColor="text1" w:themeTint="BF"/>
                     </w:rPr>
-                    <w:t xml:space="preserve">Figma, MUI, JTBD, User Story, UI-kit, прототипирование интерфейсов</w:t>
+                    <w:t xml:space="preserve">Figma, MUI, JTBD, User Story, UI-kit, токены, прототипирование интерфейсов</w:t>
                   </w:r>
                 </w:p>
               </w:tc>
@@ -1626,9 +2158,73 @@
                     <w:t xml:space="preserve">UX/UI Designer</w:t>
                   </w:r>
                 </w:p>
+                <w:p>
+                  <w:pPr>
+                    <w:pStyle w:val="ad"/>
+                    <w:keepNext/>
+                    <w:spacing w:before="72" w:line="211" w:lineRule="auto"/>
+                    <w:rPr>
+                      <w:bCs/>
+                      <w:color w:val="0483F8"/>
+                      <w:spacing w:val="-2"/>
+                      <w:sz w:val="22"/>
+                      <w:szCs w:val="22"/>
+                    </w:rPr>
+                  </w:pPr>
+                  <w:r>
+                    <w:rPr>
+                      <w:bCs/>
+                      <w:color w:val="0483F8"/>
+                      <w:spacing w:val="-2"/>
+                      <w:sz w:val="22"/>
+                      <w:szCs w:val="22"/>
+                    </w:rPr>
+                    <w:t xml:space="preserve">Обязанности</w:t>
+                  </w:r>
+                </w:p>
+                <w:p>
+                  <w:pPr>
+                    <w:spacing w:before="72"/>
+                    <w:rPr>
+                      <w:color w:val="404040" w:themeColor="text1" w:themeTint="BF"/>
+                      <w:sz w:val="20"/>
+                      <w:szCs w:val="20"/>
+                    </w:rPr>
+                  </w:pPr>
+                  <w:r>
+                    <w:rPr>
+                      <w:color w:val="404040" w:themeColor="text1" w:themeTint="BF"/>
+                      <w:sz w:val="20"/>
+                      <w:szCs w:val="20"/>
+                    </w:rPr>
+                    <w:t xml:space="preserve">Проектирование для ядра букмекерского бизнеса — внутренней системы для управления коэффициентами, обработки ставок и другими бизнес-процессами.</w:t>
+                  </w:r>
+                </w:p>
+                <w:p>
+                  <w:pPr>
+                    <w:pStyle w:val="ad"/>
+                    <w:numPr>
+                      <w:ilvl w:val="0"/>
+                      <w:numId w:val="30"/>
+                    </w:numPr>
+                    <w:spacing w:before="45" w:line="211" w:lineRule="auto"/>
+                    <w:rPr>
+                      <w:color w:val="404040" w:themeColor="text1" w:themeTint="BF"/>
+                    </w:rPr>
+                  </w:pPr>
+                  <w:r>
+                    <w:rPr>
+                      <w:color w:val="404040" w:themeColor="text1" w:themeTint="BF"/>
+                    </w:rPr>
+                    <w:t xml:space="preserve">Погрузился в узкопрофильный продукт со сложной информационной архитектурой.</w:t>
+                  </w:r>
+                </w:p>
               </w:tc>
             </w:tr>
             <w:tr>
+              <w:trPr>
+                <w:cantSplit/>
+              </w:trPr>
               <w:tc>
                 <w:tcPr>
                   <w:tcW w:w="2285" w:type="dxa"/>
@@ -1636,10 +2232,231 @@
                 </w:tcPr>
                 <w:p>
                   <w:pPr>
+                    <w:spacing w:before="0" w:after="0" w:line="20" w:lineRule="exact"/>
+                    <w:rPr>
+                      <w:sz w:val="2"/>
+                      <w:szCs w:val="2"/>
+                    </w:rPr>
+                  </w:pPr>
+                </w:p>
+              </w:tc>
+              <w:tc>
+                <w:tcPr>
+                  <w:tcW w:w="7672" w:type="dxa"/>
+                </w:tcPr>
+                <w:p>
+                  <w:pPr>
                     <w:pStyle w:val="ad"/>
-                    <w:spacing w:before="54" w:line="211" w:lineRule="auto"/>
-                    <w:ind w:left="-108" w:right="77"/>
-                    <w:rPr/>
+                    <w:numPr>
+                      <w:ilvl w:val="0"/>
+                      <w:numId w:val="30"/>
+                    </w:numPr>
+                    <w:spacing w:before="45" w:line="211" w:lineRule="auto"/>
+                    <w:rPr>
+                      <w:color w:val="404040" w:themeColor="text1" w:themeTint="BF"/>
+                    </w:rPr>
+                  </w:pPr>
+                  <w:r>
+                    <w:rPr>
+                      <w:color w:val="404040" w:themeColor="text1" w:themeTint="BF"/>
+                    </w:rPr>
+                    <w:t xml:space="preserve">Настроил дизайн-процесс в команде разработки продукта.</w:t>
+                  </w:r>
+                </w:p>
+              </w:tc>
+            </w:tr>
+            <w:tr>
+              <w:trPr>
+                <w:cantSplit/>
+              </w:trPr>
+              <w:tc>
+                <w:tcPr>
+                  <w:tcW w:w="2285" w:type="dxa"/>
+                  <w:vMerge/>
+                </w:tcPr>
+                <w:p>
+                  <w:pPr>
+                    <w:spacing w:before="0" w:after="0" w:line="20" w:lineRule="exact"/>
+                    <w:rPr>
+                      <w:sz w:val="2"/>
+                      <w:szCs w:val="2"/>
+                    </w:rPr>
+                  </w:pPr>
+                </w:p>
+              </w:tc>
+              <w:tc>
+                <w:tcPr>
+                  <w:tcW w:w="7672" w:type="dxa"/>
+                </w:tcPr>
+                <w:p>
+                  <w:pPr>
+                    <w:pStyle w:val="ad"/>
+                    <w:numPr>
+                      <w:ilvl w:val="0"/>
+                      <w:numId w:val="30"/>
+                    </w:numPr>
+                    <w:spacing w:before="45" w:line="211" w:lineRule="auto"/>
+                    <w:rPr>
+                      <w:color w:val="404040" w:themeColor="text1" w:themeTint="BF"/>
+                    </w:rPr>
+                  </w:pPr>
+                  <w:r>
+                    <w:rPr>
+                      <w:color w:val="404040" w:themeColor="text1" w:themeTint="BF"/>
+                    </w:rPr>
+                    <w:t xml:space="preserve">Провёл серии глубинных интервью с пользователями и сформировал на их основе гипотезы.</w:t>
+                  </w:r>
+                </w:p>
+              </w:tc>
+            </w:tr>
+            <w:tr>
+              <w:trPr>
+                <w:cantSplit/>
+              </w:trPr>
+              <w:tc>
+                <w:tcPr>
+                  <w:tcW w:w="2285" w:type="dxa"/>
+                  <w:vMerge/>
+                </w:tcPr>
+                <w:p>
+                  <w:pPr>
+                    <w:spacing w:before="0" w:after="0" w:line="20" w:lineRule="exact"/>
+                    <w:rPr>
+                      <w:sz w:val="2"/>
+                      <w:szCs w:val="2"/>
+                    </w:rPr>
+                  </w:pPr>
+                </w:p>
+              </w:tc>
+              <w:tc>
+                <w:tcPr>
+                  <w:tcW w:w="7672" w:type="dxa"/>
+                </w:tcPr>
+                <w:p>
+                  <w:pPr>
+                    <w:pStyle w:val="ad"/>
+                    <w:numPr>
+                      <w:ilvl w:val="0"/>
+                      <w:numId w:val="30"/>
+                    </w:numPr>
+                    <w:spacing w:before="45" w:line="211" w:lineRule="auto"/>
+                    <w:rPr>
+                      <w:color w:val="404040" w:themeColor="text1" w:themeTint="BF"/>
+                    </w:rPr>
+                  </w:pPr>
+                  <w:r>
+                    <w:rPr>
+                      <w:color w:val="404040" w:themeColor="text1" w:themeTint="BF"/>
+                    </w:rPr>
+                    <w:t xml:space="preserve">Спроектировал UX для 3 групп пользователей (250+ человек) в рамках бизнес-задач.</w:t>
+                  </w:r>
+                </w:p>
+              </w:tc>
+            </w:tr>
+            <w:tr>
+              <w:trPr>
+                <w:cantSplit/>
+              </w:trPr>
+              <w:tc>
+                <w:tcPr>
+                  <w:tcW w:w="2285" w:type="dxa"/>
+                  <w:vMerge/>
+                </w:tcPr>
+                <w:p>
+                  <w:pPr>
+                    <w:spacing w:before="0" w:after="0" w:line="20" w:lineRule="exact"/>
+                    <w:rPr>
+                      <w:sz w:val="2"/>
+                      <w:szCs w:val="2"/>
+                    </w:rPr>
+                  </w:pPr>
+                </w:p>
+              </w:tc>
+              <w:tc>
+                <w:tcPr>
+                  <w:tcW w:w="7672" w:type="dxa"/>
+                </w:tcPr>
+                <w:p>
+                  <w:pPr>
+                    <w:pStyle w:val="ad"/>
+                    <w:numPr>
+                      <w:ilvl w:val="0"/>
+                      <w:numId w:val="30"/>
+                    </w:numPr>
+                    <w:spacing w:before="45" w:line="211" w:lineRule="auto"/>
+                    <w:rPr>
+                      <w:color w:val="404040" w:themeColor="text1" w:themeTint="BF"/>
+                    </w:rPr>
+                  </w:pPr>
+                  <w:r>
+                    <w:rPr>
+                      <w:color w:val="404040" w:themeColor="text1" w:themeTint="BF"/>
+                    </w:rPr>
+                    <w:t xml:space="preserve">Описывал и заводил новые компоненты и виджеты в общую дизайн-систему компании.</w:t>
+                  </w:r>
+                </w:p>
+              </w:tc>
+            </w:tr>
+            <w:tr>
+              <w:trPr>
+                <w:cantSplit/>
+              </w:trPr>
+              <w:tc>
+                <w:tcPr>
+                  <w:tcW w:w="2285" w:type="dxa"/>
+                  <w:vMerge/>
+                </w:tcPr>
+                <w:p>
+                  <w:pPr>
+                    <w:spacing w:before="0" w:after="0" w:line="20" w:lineRule="exact"/>
+                    <w:rPr>
+                      <w:sz w:val="2"/>
+                      <w:szCs w:val="2"/>
+                    </w:rPr>
+                  </w:pPr>
+                </w:p>
+              </w:tc>
+              <w:tc>
+                <w:tcPr>
+                  <w:tcW w:w="7672" w:type="dxa"/>
+                </w:tcPr>
+                <w:p>
+                  <w:pPr>
+                    <w:pStyle w:val="ad"/>
+                    <w:numPr>
+                      <w:ilvl w:val="0"/>
+                      <w:numId w:val="30"/>
+                    </w:numPr>
+                    <w:spacing w:before="45" w:line="211" w:lineRule="auto"/>
+                    <w:rPr>
+                      <w:color w:val="404040" w:themeColor="text1" w:themeTint="BF"/>
+                    </w:rPr>
+                  </w:pPr>
+                  <w:r>
+                    <w:rPr>
+                      <w:color w:val="404040" w:themeColor="text1" w:themeTint="BF"/>
+                    </w:rPr>
+                    <w:t xml:space="preserve">Синхронизировался с кросс-командами: тесно работал с аналитиками, пользователями и командой разработки.</w:t>
+                  </w:r>
+                </w:p>
+              </w:tc>
+            </w:tr>
+            <w:tr>
+              <w:trPr>
+                <w:cantSplit/>
+              </w:trPr>
+              <w:tc>
+                <w:tcPr>
+                  <w:tcW w:w="2285" w:type="dxa"/>
+                  <w:vMerge/>
+                </w:tcPr>
+                <w:p>
+                  <w:pPr>
+                    <w:spacing w:before="0" w:after="0" w:line="20" w:lineRule="exact"/>
+                    <w:rPr>
+                      <w:sz w:val="2"/>
+                      <w:szCs w:val="2"/>
+                    </w:rPr>
                   </w:pPr>
                 </w:p>
               </w:tc>
@@ -1668,162 +2485,6 @@
                       <w:sz w:val="22"/>
                       <w:szCs w:val="22"/>
                     </w:rPr>
-                    <w:t xml:space="preserve">Обязанности</w:t>
-                  </w:r>
-                </w:p>
-                <w:p>
-                  <w:pPr>
-                    <w:spacing w:before="72"/>
-                    <w:rPr>
-                      <w:color w:val="404040" w:themeColor="text1" w:themeTint="BF"/>
-                      <w:sz w:val="20"/>
-                      <w:szCs w:val="20"/>
-                    </w:rPr>
-                  </w:pPr>
-                  <w:r>
-                    <w:rPr>
-                      <w:color w:val="404040" w:themeColor="text1" w:themeTint="BF"/>
-                      <w:sz w:val="20"/>
-                      <w:szCs w:val="20"/>
-                    </w:rPr>
-                    <w:t xml:space="preserve">Проектирование для ядра букмекерского бизнеса — внутренней системы для управления коэффициентами, обработки ставок и другими бизнес-процессами.</w:t>
-                  </w:r>
-                </w:p>
-                <w:p>
-                  <w:pPr>
-                    <w:pStyle w:val="ad"/>
-                    <w:numPr>
-                      <w:ilvl w:val="0"/>
-                      <w:numId w:val="30"/>
-                    </w:numPr>
-                    <w:spacing w:before="45" w:line="211" w:lineRule="auto"/>
-                    <w:rPr>
-                      <w:color w:val="404040" w:themeColor="text1" w:themeTint="BF"/>
-                    </w:rPr>
-                  </w:pPr>
-                  <w:r>
-                    <w:rPr>
-                      <w:color w:val="404040" w:themeColor="text1" w:themeTint="BF"/>
-                    </w:rPr>
-                    <w:t xml:space="preserve">Онбординг в узкопрофильный продукт со сложной информационной архитектурой.</w:t>
-                  </w:r>
-                </w:p>
-                <w:p>
-                  <w:pPr>
-                    <w:pStyle w:val="ad"/>
-                    <w:numPr>
-                      <w:ilvl w:val="0"/>
-                      <w:numId w:val="30"/>
-                    </w:numPr>
-                    <w:spacing w:before="45" w:line="211" w:lineRule="auto"/>
-                    <w:rPr>
-                      <w:color w:val="404040" w:themeColor="text1" w:themeTint="BF"/>
-                    </w:rPr>
-                  </w:pPr>
-                  <w:r>
-                    <w:rPr>
-                      <w:color w:val="404040" w:themeColor="text1" w:themeTint="BF"/>
-                    </w:rPr>
-                    <w:t xml:space="preserve">Настройка дизайн-процесса в команде разработки продукта.</w:t>
-                  </w:r>
-                </w:p>
-                <w:p>
-                  <w:pPr>
-                    <w:pStyle w:val="ad"/>
-                    <w:numPr>
-                      <w:ilvl w:val="0"/>
-                      <w:numId w:val="30"/>
-                    </w:numPr>
-                    <w:spacing w:before="45" w:line="211" w:lineRule="auto"/>
-                    <w:rPr>
-                      <w:color w:val="404040" w:themeColor="text1" w:themeTint="BF"/>
-                    </w:rPr>
-                  </w:pPr>
-                  <w:r>
-                    <w:rPr>
-                      <w:color w:val="404040" w:themeColor="text1" w:themeTint="BF"/>
-                    </w:rPr>
-                    <w:t xml:space="preserve">Проведение серий глубинных интервью, на основе которых сформировал гипотезы.</w:t>
-                  </w:r>
-                </w:p>
-                <w:p>
-                  <w:pPr>
-                    <w:pStyle w:val="ad"/>
-                    <w:numPr>
-                      <w:ilvl w:val="0"/>
-                      <w:numId w:val="30"/>
-                    </w:numPr>
-                    <w:spacing w:before="45" w:line="211" w:lineRule="auto"/>
-                    <w:rPr>
-                      <w:color w:val="404040" w:themeColor="text1" w:themeTint="BF"/>
-                    </w:rPr>
-                  </w:pPr>
-                  <w:r>
-                    <w:rPr>
-                      <w:color w:val="404040" w:themeColor="text1" w:themeTint="BF"/>
-                    </w:rPr>
-                    <w:t xml:space="preserve">Проектирование UX для 3-х групп пользователей (250+ человек) в рамках бизнес-задач.</w:t>
-                  </w:r>
-                </w:p>
-                <w:p>
-                  <w:pPr>
-                    <w:pStyle w:val="ad"/>
-                    <w:numPr>
-                      <w:ilvl w:val="0"/>
-                      <w:numId w:val="30"/>
-                    </w:numPr>
-                    <w:spacing w:before="45" w:line="211" w:lineRule="auto"/>
-                    <w:rPr>
-                      <w:color w:val="404040" w:themeColor="text1" w:themeTint="BF"/>
-                    </w:rPr>
-                  </w:pPr>
-                  <w:r>
-                    <w:rPr>
-                      <w:color w:val="404040" w:themeColor="text1" w:themeTint="BF"/>
-                    </w:rPr>
-                    <w:t xml:space="preserve">Описание и заведение новых компонентов и виджетов в общую дизайн-систему компании.</w:t>
-                  </w:r>
-                </w:p>
-                <w:p>
-                  <w:pPr>
-                    <w:pStyle w:val="ad"/>
-                    <w:numPr>
-                      <w:ilvl w:val="0"/>
-                      <w:numId w:val="30"/>
-                    </w:numPr>
-                    <w:spacing w:before="45" w:line="211" w:lineRule="auto"/>
-                    <w:rPr>
-                      <w:color w:val="404040" w:themeColor="text1" w:themeTint="BF"/>
-                    </w:rPr>
-                  </w:pPr>
-                  <w:r>
-                    <w:rPr>
-                      <w:color w:val="404040" w:themeColor="text1" w:themeTint="BF"/>
-                    </w:rPr>
-                    <w:t xml:space="preserve">Синхронизация с кросс-командами, тесное взаимодействие с аналитиками, пользователями и командой разработки.</w:t>
-                  </w:r>
-                </w:p>
-                <w:p>
-                  <w:pPr>
-                    <w:pStyle w:val="ad"/>
-                    <w:keepNext/>
-                    <w:spacing w:before="72" w:line="211" w:lineRule="auto"/>
-                    <w:rPr>
-                      <w:bCs/>
-                      <w:color w:val="0483F8"/>
-                      <w:spacing w:val="-2"/>
-                      <w:sz w:val="22"/>
-                      <w:szCs w:val="22"/>
-                    </w:rPr>
-                  </w:pPr>
-                  <w:r>
-                    <w:rPr>
-                      <w:bCs/>
-                      <w:color w:val="0483F8"/>
-                      <w:spacing w:val="-2"/>
-                      <w:sz w:val="22"/>
-                      <w:szCs w:val="22"/>
-                    </w:rPr>
                     <w:t xml:space="preserve">Достижения</w:t>
                   </w:r>
                 </w:p>
@@ -1843,9 +2504,102 @@
                     <w:rPr>
                       <w:color w:val="404040" w:themeColor="text1" w:themeTint="BF"/>
                     </w:rPr>
-                    <w:t xml:space="preserve">Провёл несколько итераций usability-тестирований: сократил количество ошибок на 24% и когнитивную нагрузку на 36% — повысил скорость решения задач.</w:t>
+                    <w:t xml:space="preserve">Исследование → гипотезы → решение → проверка → результат: по итогам глубинных интервью сформировал гипотезы, спроектировал решения и проверил их в нескольких итерациях usability-тестирований — количество ошибок снизилось на 24%, когнитивная нагрузка на 36%, скорость решения задач выросла.</w:t>
                   </w:r>
                 </w:p>
+              </w:tc>
+            </w:tr>
+            <w:tr>
+              <w:trPr>
+                <w:cantSplit/>
+              </w:trPr>
+              <w:tc>
+                <w:tcPr>
+                  <w:tcW w:w="2285" w:type="dxa"/>
+                  <w:vMerge/>
+                </w:tcPr>
+                <w:p>
+                  <w:pPr>
+                    <w:spacing w:before="0" w:after="0" w:line="20" w:lineRule="exact"/>
+                    <w:rPr>
+                      <w:sz w:val="2"/>
+                      <w:szCs w:val="2"/>
+                    </w:rPr>
+                  </w:pPr>
+                </w:p>
+              </w:tc>
+              <w:tc>
+                <w:tcPr>
+                  <w:tcW w:w="7672" w:type="dxa"/>
+                </w:tcPr>
+                <w:p>
+                  <w:pPr>
+                    <w:pStyle w:val="ad"/>
+                    <w:keepNext/>
+                    <w:spacing w:before="72" w:line="211" w:lineRule="auto"/>
+                    <w:rPr>
+                      <w:bCs/>
+                      <w:color w:val="0483F8"/>
+                      <w:spacing w:val="-2"/>
+                      <w:sz w:val="22"/>
+                      <w:szCs w:val="22"/>
+                    </w:rPr>
+                  </w:pPr>
+                  <w:r>
+                    <w:rPr>
+                      <w:bCs/>
+                      <w:color w:val="0483F8"/>
+                      <w:spacing w:val="-2"/>
+                      <w:sz w:val="22"/>
+                      <w:szCs w:val="22"/>
+                    </w:rPr>
+                    <w:t xml:space="preserve">Состав команды</w:t>
+                  </w:r>
+                </w:p>
+                <w:p>
+                  <w:pPr>
+                    <w:pStyle w:val="ad"/>
+                    <w:numPr>
+                      <w:ilvl w:val="0"/>
+                      <w:numId w:val="34"/>
+                    </w:numPr>
+                    <w:spacing w:before="45" w:line="211" w:lineRule="auto"/>
+                    <w:rPr>
+                      <w:color w:val="404040" w:themeColor="text1" w:themeTint="BF"/>
+                    </w:rPr>
+                  </w:pPr>
+                  <w:r>
+                    <w:rPr>
+                      <w:color w:val="404040" w:themeColor="text1" w:themeTint="BF"/>
+                    </w:rPr>
+                    <w:t xml:space="preserve">Аналитики, команда разработки, кросс-функциональные продуктовые команды.</w:t>
+                  </w:r>
+                </w:p>
+              </w:tc>
+            </w:tr>
+            <w:tr>
+              <w:trPr>
+                <w:cantSplit/>
+              </w:trPr>
+              <w:tc>
+                <w:tcPr>
+                  <w:tcW w:w="2285" w:type="dxa"/>
+                  <w:vMerge/>
+                </w:tcPr>
+                <w:p>
+                  <w:pPr>
+                    <w:spacing w:before="0" w:after="0" w:line="20" w:lineRule="exact"/>
+                    <w:rPr>
+                      <w:sz w:val="2"/>
+                      <w:szCs w:val="2"/>
+                    </w:rPr>
+                  </w:pPr>
+                </w:p>
+              </w:tc>
+              <w:tc>
+                <w:tcPr>
+                  <w:tcW w:w="7672" w:type="dxa"/>
+                </w:tcPr>
                 <w:p>
                   <w:pPr>
                     <w:pStyle w:val="ad"/>
@@ -1886,7 +2640,7 @@
                     <w:rPr>
                       <w:color w:val="404040" w:themeColor="text1" w:themeTint="BF"/>
                     </w:rPr>
-                    <w:t xml:space="preserve">Figma, User flow, JTBD, User Story, CJM, дизайн-системы, прототипирование интерфейсов</w:t>
+                    <w:t xml:space="preserve">Figma, User flow, JTBD, User Story, CJM, дизайн-системы, usability testing, прототипирование интерфейсов</w:t>
                   </w:r>
                 </w:p>
               </w:tc>
@@ -1979,9 +2733,73 @@
                     <w:t xml:space="preserve">UX/UI Designer</w:t>
                   </w:r>
                 </w:p>
+                <w:p>
+                  <w:pPr>
+                    <w:pStyle w:val="ad"/>
+                    <w:keepNext/>
+                    <w:spacing w:before="72" w:line="211" w:lineRule="auto"/>
+                    <w:rPr>
+                      <w:bCs/>
+                      <w:color w:val="0483F8"/>
+                      <w:spacing w:val="-2"/>
+                      <w:sz w:val="22"/>
+                      <w:szCs w:val="22"/>
+                    </w:rPr>
+                  </w:pPr>
+                  <w:r>
+                    <w:rPr>
+                      <w:bCs/>
+                      <w:color w:val="0483F8"/>
+                      <w:spacing w:val="-2"/>
+                      <w:sz w:val="22"/>
+                      <w:szCs w:val="22"/>
+                    </w:rPr>
+                    <w:t xml:space="preserve">Обязанности</w:t>
+                  </w:r>
+                </w:p>
+                <w:p>
+                  <w:pPr>
+                    <w:spacing w:before="72"/>
+                    <w:rPr>
+                      <w:color w:val="404040" w:themeColor="text1" w:themeTint="BF"/>
+                      <w:sz w:val="20"/>
+                      <w:szCs w:val="20"/>
+                    </w:rPr>
+                  </w:pPr>
+                  <w:r>
+                    <w:rPr>
+                      <w:color w:val="404040" w:themeColor="text1" w:themeTint="BF"/>
+                      <w:sz w:val="20"/>
+                      <w:szCs w:val="20"/>
+                    </w:rPr>
+                    <w:t xml:space="preserve">Проектирование внутренней HR-системы для формирования и отслеживания командных и индивидуальных целей по всем сотрудникам банка для увеличения эффективности работы.</w:t>
+                  </w:r>
+                </w:p>
+                <w:p>
+                  <w:pPr>
+                    <w:pStyle w:val="ad"/>
+                    <w:numPr>
+                      <w:ilvl w:val="0"/>
+                      <w:numId w:val="30"/>
+                    </w:numPr>
+                    <w:spacing w:before="45" w:line="211" w:lineRule="auto"/>
+                    <w:rPr>
+                      <w:color w:val="404040" w:themeColor="text1" w:themeTint="BF"/>
+                    </w:rPr>
+                  </w:pPr>
+                  <w:r>
+                    <w:rPr>
+                      <w:color w:val="404040" w:themeColor="text1" w:themeTint="BF"/>
+                    </w:rPr>
+                    <w:t xml:space="preserve">Провёл интервью с бизнес-заказчиками для выявления реальных проблем и требований.</w:t>
+                  </w:r>
+                </w:p>
               </w:tc>
             </w:tr>
             <w:tr>
+              <w:trPr>
+                <w:cantSplit/>
+              </w:trPr>
               <w:tc>
                 <w:tcPr>
                   <w:tcW w:w="2285" w:type="dxa"/>
@@ -1989,10 +2807,187 @@
                 </w:tcPr>
                 <w:p>
                   <w:pPr>
+                    <w:spacing w:before="0" w:after="0" w:line="20" w:lineRule="exact"/>
+                    <w:rPr>
+                      <w:sz w:val="2"/>
+                      <w:szCs w:val="2"/>
+                    </w:rPr>
+                  </w:pPr>
+                </w:p>
+              </w:tc>
+              <w:tc>
+                <w:tcPr>
+                  <w:tcW w:w="7672" w:type="dxa"/>
+                </w:tcPr>
+                <w:p>
+                  <w:pPr>
                     <w:pStyle w:val="ad"/>
-                    <w:spacing w:before="54" w:line="211" w:lineRule="auto"/>
-                    <w:ind w:left="-108" w:right="77"/>
-                    <w:rPr/>
+                    <w:numPr>
+                      <w:ilvl w:val="0"/>
+                      <w:numId w:val="30"/>
+                    </w:numPr>
+                    <w:spacing w:before="45" w:line="211" w:lineRule="auto"/>
+                    <w:rPr>
+                      <w:color w:val="404040" w:themeColor="text1" w:themeTint="BF"/>
+                    </w:rPr>
+                  </w:pPr>
+                  <w:r>
+                    <w:rPr>
+                      <w:color w:val="404040" w:themeColor="text1" w:themeTint="BF"/>
+                    </w:rPr>
+                    <w:t xml:space="preserve">Проработал User flow и JTBD.</w:t>
+                  </w:r>
+                </w:p>
+              </w:tc>
+            </w:tr>
+            <w:tr>
+              <w:trPr>
+                <w:cantSplit/>
+              </w:trPr>
+              <w:tc>
+                <w:tcPr>
+                  <w:tcW w:w="2285" w:type="dxa"/>
+                  <w:vMerge/>
+                </w:tcPr>
+                <w:p>
+                  <w:pPr>
+                    <w:spacing w:before="0" w:after="0" w:line="20" w:lineRule="exact"/>
+                    <w:rPr>
+                      <w:sz w:val="2"/>
+                      <w:szCs w:val="2"/>
+                    </w:rPr>
+                  </w:pPr>
+                </w:p>
+              </w:tc>
+              <w:tc>
+                <w:tcPr>
+                  <w:tcW w:w="7672" w:type="dxa"/>
+                </w:tcPr>
+                <w:p>
+                  <w:pPr>
+                    <w:pStyle w:val="ad"/>
+                    <w:numPr>
+                      <w:ilvl w:val="0"/>
+                      <w:numId w:val="30"/>
+                    </w:numPr>
+                    <w:spacing w:before="45" w:line="211" w:lineRule="auto"/>
+                    <w:rPr>
+                      <w:color w:val="404040" w:themeColor="text1" w:themeTint="BF"/>
+                    </w:rPr>
+                  </w:pPr>
+                  <w:r>
+                    <w:rPr>
+                      <w:color w:val="404040" w:themeColor="text1" w:themeTint="BF"/>
+                    </w:rPr>
+                    <w:t xml:space="preserve">Спроектировал UX/UI ERP-системы для формирования и отслеживания выполнения целей команд и сотрудников.</w:t>
+                  </w:r>
+                </w:p>
+              </w:tc>
+            </w:tr>
+            <w:tr>
+              <w:trPr>
+                <w:cantSplit/>
+              </w:trPr>
+              <w:tc>
+                <w:tcPr>
+                  <w:tcW w:w="2285" w:type="dxa"/>
+                  <w:vMerge/>
+                </w:tcPr>
+                <w:p>
+                  <w:pPr>
+                    <w:spacing w:before="0" w:after="0" w:line="20" w:lineRule="exact"/>
+                    <w:rPr>
+                      <w:sz w:val="2"/>
+                      <w:szCs w:val="2"/>
+                    </w:rPr>
+                  </w:pPr>
+                </w:p>
+              </w:tc>
+              <w:tc>
+                <w:tcPr>
+                  <w:tcW w:w="7672" w:type="dxa"/>
+                </w:tcPr>
+                <w:p>
+                  <w:pPr>
+                    <w:pStyle w:val="ad"/>
+                    <w:numPr>
+                      <w:ilvl w:val="0"/>
+                      <w:numId w:val="30"/>
+                    </w:numPr>
+                    <w:spacing w:before="45" w:line="211" w:lineRule="auto"/>
+                    <w:rPr>
+                      <w:color w:val="404040" w:themeColor="text1" w:themeTint="BF"/>
+                    </w:rPr>
+                  </w:pPr>
+                  <w:r>
+                    <w:rPr>
+                      <w:color w:val="404040" w:themeColor="text1" w:themeTint="BF"/>
+                    </w:rPr>
+                    <w:t xml:space="preserve">Адаптировал дизайн под технические ограничения совместно с аналитиками и разработчиками.</w:t>
+                  </w:r>
+                </w:p>
+              </w:tc>
+            </w:tr>
+            <w:tr>
+              <w:trPr>
+                <w:cantSplit/>
+              </w:trPr>
+              <w:tc>
+                <w:tcPr>
+                  <w:tcW w:w="2285" w:type="dxa"/>
+                  <w:vMerge/>
+                </w:tcPr>
+                <w:p>
+                  <w:pPr>
+                    <w:spacing w:before="0" w:after="0" w:line="20" w:lineRule="exact"/>
+                    <w:rPr>
+                      <w:sz w:val="2"/>
+                      <w:szCs w:val="2"/>
+                    </w:rPr>
+                  </w:pPr>
+                </w:p>
+              </w:tc>
+              <w:tc>
+                <w:tcPr>
+                  <w:tcW w:w="7672" w:type="dxa"/>
+                </w:tcPr>
+                <w:p>
+                  <w:pPr>
+                    <w:pStyle w:val="ad"/>
+                    <w:numPr>
+                      <w:ilvl w:val="0"/>
+                      <w:numId w:val="30"/>
+                    </w:numPr>
+                    <w:spacing w:before="45" w:line="211" w:lineRule="auto"/>
+                    <w:rPr>
+                      <w:color w:val="404040" w:themeColor="text1" w:themeTint="BF"/>
+                    </w:rPr>
+                  </w:pPr>
+                  <w:r>
+                    <w:rPr>
+                      <w:color w:val="404040" w:themeColor="text1" w:themeTint="BF"/>
+                    </w:rPr>
+                    <w:t xml:space="preserve">Ставил задачи младшим дизайнерам и менторил их.</w:t>
+                  </w:r>
+                </w:p>
+              </w:tc>
+            </w:tr>
+            <w:tr>
+              <w:trPr>
+                <w:cantSplit/>
+              </w:trPr>
+              <w:tc>
+                <w:tcPr>
+                  <w:tcW w:w="2285" w:type="dxa"/>
+                  <w:vMerge/>
+                </w:tcPr>
+                <w:p>
+                  <w:pPr>
+                    <w:spacing w:before="0" w:after="0" w:line="20" w:lineRule="exact"/>
+                    <w:rPr>
+                      <w:sz w:val="2"/>
+                      <w:szCs w:val="2"/>
+                    </w:rPr>
                   </w:pPr>
                 </w:p>
               </w:tc>
@@ -2021,25 +3016,7 @@
                       <w:sz w:val="22"/>
                       <w:szCs w:val="22"/>
                     </w:rPr>
-                    <w:t xml:space="preserve">Обязанности</w:t>
-                  </w:r>
-                </w:p>
-                <w:p>
-                  <w:pPr>
-                    <w:spacing w:before="72"/>
-                    <w:rPr>
-                      <w:color w:val="404040" w:themeColor="text1" w:themeTint="BF"/>
-                      <w:sz w:val="20"/>
-                      <w:szCs w:val="20"/>
-                    </w:rPr>
-                  </w:pPr>
-                  <w:r>
-                    <w:rPr>
-                      <w:color w:val="404040" w:themeColor="text1" w:themeTint="BF"/>
-                      <w:sz w:val="20"/>
-                      <w:szCs w:val="20"/>
-                    </w:rPr>
-                    <w:t xml:space="preserve">Проектирование внутренней HR-системы для формирования и отслеживания командных и индивидуальных целей по всем сотрудникам банка для увеличения эффективности работы.</w:t>
+                    <w:t xml:space="preserve">Состав команды</w:t>
                   </w:r>
                 </w:p>
                 <w:p>
@@ -2047,7 +3024,7 @@
                     <w:pStyle w:val="ad"/>
                     <w:numPr>
                       <w:ilvl w:val="0"/>
-                      <w:numId w:val="30"/>
+                      <w:numId w:val="34"/>
                     </w:numPr>
                     <w:spacing w:before="45" w:line="211" w:lineRule="auto"/>
                     <w:rPr>
@@ -2058,85 +3035,34 @@
                     <w:rPr>
                       <w:color w:val="404040" w:themeColor="text1" w:themeTint="BF"/>
                     </w:rPr>
-                    <w:t xml:space="preserve">Проведение интервью с бизнес-заказчиками для выявления реальных проблем и требований.</w:t>
+                    <w:t xml:space="preserve">Аналитики, разработчики, младшие дизайнеры.</w:t>
                   </w:r>
                 </w:p>
+              </w:tc>
+            </w:tr>
+            <w:tr>
+              <w:trPr>
+                <w:cantSplit/>
+              </w:trPr>
+              <w:tc>
+                <w:tcPr>
+                  <w:tcW w:w="2285" w:type="dxa"/>
+                  <w:vMerge/>
+                </w:tcPr>
                 <w:p>
                   <w:pPr>
-                    <w:pStyle w:val="ad"/>
-                    <w:numPr>
-                      <w:ilvl w:val="0"/>
-                      <w:numId w:val="30"/>
-                    </w:numPr>
-                    <w:spacing w:before="45" w:line="211" w:lineRule="auto"/>
-                    <w:rPr>
-                      <w:color w:val="404040" w:themeColor="text1" w:themeTint="BF"/>
+                    <w:spacing w:before="0" w:after="0" w:line="20" w:lineRule="exact"/>
+                    <w:rPr>
+                      <w:sz w:val="2"/>
+                      <w:szCs w:val="2"/>
                     </w:rPr>
                   </w:pPr>
-                  <w:r>
-                    <w:rPr>
-                      <w:color w:val="404040" w:themeColor="text1" w:themeTint="BF"/>
-                    </w:rPr>
-                    <w:t xml:space="preserve">Проработка User flow, JTBD.</w:t>
-                  </w:r>
                 </w:p>
-                <w:p>
-                  <w:pPr>
-                    <w:pStyle w:val="ad"/>
-                    <w:numPr>
-                      <w:ilvl w:val="0"/>
-                      <w:numId w:val="30"/>
-                    </w:numPr>
-                    <w:spacing w:before="45" w:line="211" w:lineRule="auto"/>
-                    <w:rPr>
-                      <w:color w:val="404040" w:themeColor="text1" w:themeTint="BF"/>
-                    </w:rPr>
-                  </w:pPr>
-                  <w:r>
-                    <w:rPr>
-                      <w:color w:val="404040" w:themeColor="text1" w:themeTint="BF"/>
-                    </w:rPr>
-                    <w:t xml:space="preserve">Разработка UX/UI ERP-системы для формирования и отслеживания выполнения целей для команд и сотрудников.</w:t>
-                  </w:r>
-                </w:p>
-                <w:p>
-                  <w:pPr>
-                    <w:pStyle w:val="ad"/>
-                    <w:numPr>
-                      <w:ilvl w:val="0"/>
-                      <w:numId w:val="30"/>
-                    </w:numPr>
-                    <w:spacing w:before="45" w:line="211" w:lineRule="auto"/>
-                    <w:rPr>
-                      <w:color w:val="404040" w:themeColor="text1" w:themeTint="BF"/>
-                    </w:rPr>
-                  </w:pPr>
-                  <w:r>
-                    <w:rPr>
-                      <w:color w:val="404040" w:themeColor="text1" w:themeTint="BF"/>
-                    </w:rPr>
-                    <w:t xml:space="preserve">Работа с аналитиками и разработчиками, адаптация дизайна под технические ограничения.</w:t>
-                  </w:r>
-                </w:p>
-                <w:p>
-                  <w:pPr>
-                    <w:pStyle w:val="ad"/>
-                    <w:numPr>
-                      <w:ilvl w:val="0"/>
-                      <w:numId w:val="30"/>
-                    </w:numPr>
-                    <w:spacing w:before="45" w:line="211" w:lineRule="auto"/>
-                    <w:rPr>
-                      <w:color w:val="404040" w:themeColor="text1" w:themeTint="BF"/>
-                    </w:rPr>
-                  </w:pPr>
-                  <w:r>
-                    <w:rPr>
-                      <w:color w:val="404040" w:themeColor="text1" w:themeTint="BF"/>
-                    </w:rPr>
-                    <w:t xml:space="preserve">Постановка задач и менторинг младших дизайнеров.</w:t>
-                  </w:r>
-                </w:p>
+              </w:tc>
+              <w:tc>
+                <w:tcPr>
+                  <w:tcW w:w="7672" w:type="dxa"/>
+                </w:tcPr>
                 <w:p>
                   <w:pPr>
                     <w:pStyle w:val="ad"/>
@@ -2270,9 +3196,73 @@
                     <w:t xml:space="preserve">UX/UI Designer</w:t>
                   </w:r>
                 </w:p>
+                <w:p>
+                  <w:pPr>
+                    <w:pStyle w:val="ad"/>
+                    <w:keepNext/>
+                    <w:spacing w:before="72" w:line="211" w:lineRule="auto"/>
+                    <w:rPr>
+                      <w:bCs/>
+                      <w:color w:val="0483F8"/>
+                      <w:spacing w:val="-2"/>
+                      <w:sz w:val="22"/>
+                      <w:szCs w:val="22"/>
+                    </w:rPr>
+                  </w:pPr>
+                  <w:r>
+                    <w:rPr>
+                      <w:bCs/>
+                      <w:color w:val="0483F8"/>
+                      <w:spacing w:val="-2"/>
+                      <w:sz w:val="22"/>
+                      <w:szCs w:val="22"/>
+                    </w:rPr>
+                    <w:t xml:space="preserve">Обязанности</w:t>
+                  </w:r>
+                </w:p>
+                <w:p>
+                  <w:pPr>
+                    <w:spacing w:before="72"/>
+                    <w:rPr>
+                      <w:color w:val="404040" w:themeColor="text1" w:themeTint="BF"/>
+                      <w:sz w:val="20"/>
+                      <w:szCs w:val="20"/>
+                    </w:rPr>
+                  </w:pPr>
+                  <w:r>
+                    <w:rPr>
+                      <w:color w:val="404040" w:themeColor="text1" w:themeTint="BF"/>
+                      <w:sz w:val="20"/>
+                      <w:szCs w:val="20"/>
+                    </w:rPr>
+                    <w:t xml:space="preserve">Проектирование автоматизированной системы мониторинга процессов на всех промышленных объектах НТЦ — «Производственная сводка».</w:t>
+                  </w:r>
+                </w:p>
+                <w:p>
+                  <w:pPr>
+                    <w:pStyle w:val="ad"/>
+                    <w:numPr>
+                      <w:ilvl w:val="0"/>
+                      <w:numId w:val="30"/>
+                    </w:numPr>
+                    <w:spacing w:before="45" w:line="211" w:lineRule="auto"/>
+                    <w:rPr>
+                      <w:color w:val="404040" w:themeColor="text1" w:themeTint="BF"/>
+                    </w:rPr>
+                  </w:pPr>
+                  <w:r>
+                    <w:rPr>
+                      <w:color w:val="404040" w:themeColor="text1" w:themeTint="BF"/>
+                    </w:rPr>
+                    <w:t xml:space="preserve">Проанализировал функциональные требования и технические ограничения, погрузился в предметную область.</w:t>
+                  </w:r>
+                </w:p>
               </w:tc>
             </w:tr>
             <w:tr>
+              <w:trPr>
+                <w:cantSplit/>
+              </w:trPr>
               <w:tc>
                 <w:tcPr>
                   <w:tcW w:w="2285" w:type="dxa"/>
@@ -2280,10 +3270,407 @@
                 </w:tcPr>
                 <w:p>
                   <w:pPr>
+                    <w:spacing w:before="0" w:after="0" w:line="20" w:lineRule="exact"/>
+                    <w:rPr>
+                      <w:sz w:val="2"/>
+                      <w:szCs w:val="2"/>
+                    </w:rPr>
+                  </w:pPr>
+                </w:p>
+              </w:tc>
+              <w:tc>
+                <w:tcPr>
+                  <w:tcW w:w="7672" w:type="dxa"/>
+                </w:tcPr>
+                <w:p>
+                  <w:pPr>
                     <w:pStyle w:val="ad"/>
-                    <w:spacing w:before="54" w:line="211" w:lineRule="auto"/>
-                    <w:ind w:left="-108" w:right="77"/>
-                    <w:rPr/>
+                    <w:numPr>
+                      <w:ilvl w:val="0"/>
+                      <w:numId w:val="30"/>
+                    </w:numPr>
+                    <w:spacing w:before="45" w:line="211" w:lineRule="auto"/>
+                    <w:rPr>
+                      <w:color w:val="404040" w:themeColor="text1" w:themeTint="BF"/>
+                    </w:rPr>
+                  </w:pPr>
+                  <w:r>
+                    <w:rPr>
+                      <w:color w:val="404040" w:themeColor="text1" w:themeTint="BF"/>
+                    </w:rPr>
+                    <w:t xml:space="preserve">Провёл глубинные интервью с сотрудниками Научно-технического центра и описал JTBD.</w:t>
+                  </w:r>
+                </w:p>
+              </w:tc>
+            </w:tr>
+            <w:tr>
+              <w:trPr>
+                <w:cantSplit/>
+              </w:trPr>
+              <w:tc>
+                <w:tcPr>
+                  <w:tcW w:w="2285" w:type="dxa"/>
+                  <w:vMerge/>
+                </w:tcPr>
+                <w:p>
+                  <w:pPr>
+                    <w:spacing w:before="0" w:after="0" w:line="20" w:lineRule="exact"/>
+                    <w:rPr>
+                      <w:sz w:val="2"/>
+                      <w:szCs w:val="2"/>
+                    </w:rPr>
+                  </w:pPr>
+                </w:p>
+              </w:tc>
+              <w:tc>
+                <w:tcPr>
+                  <w:tcW w:w="7672" w:type="dxa"/>
+                </w:tcPr>
+                <w:p>
+                  <w:pPr>
+                    <w:pStyle w:val="ad"/>
+                    <w:numPr>
+                      <w:ilvl w:val="0"/>
+                      <w:numId w:val="30"/>
+                    </w:numPr>
+                    <w:spacing w:before="45" w:line="211" w:lineRule="auto"/>
+                    <w:rPr>
+                      <w:color w:val="404040" w:themeColor="text1" w:themeTint="BF"/>
+                    </w:rPr>
+                  </w:pPr>
+                  <w:r>
+                    <w:rPr>
+                      <w:color w:val="404040" w:themeColor="text1" w:themeTint="BF"/>
+                    </w:rPr>
+                    <w:t xml:space="preserve">Спроектировал универсальный каркас для представления оперативной информации о состоянии работ на всех объектах НТЦ.</w:t>
+                  </w:r>
+                </w:p>
+              </w:tc>
+            </w:tr>
+            <w:tr>
+              <w:trPr>
+                <w:cantSplit/>
+              </w:trPr>
+              <w:tc>
+                <w:tcPr>
+                  <w:tcW w:w="2285" w:type="dxa"/>
+                  <w:vMerge/>
+                </w:tcPr>
+                <w:p>
+                  <w:pPr>
+                    <w:spacing w:before="0" w:after="0" w:line="20" w:lineRule="exact"/>
+                    <w:rPr>
+                      <w:sz w:val="2"/>
+                      <w:szCs w:val="2"/>
+                    </w:rPr>
+                  </w:pPr>
+                </w:p>
+              </w:tc>
+              <w:tc>
+                <w:tcPr>
+                  <w:tcW w:w="7672" w:type="dxa"/>
+                </w:tcPr>
+                <w:p>
+                  <w:pPr>
+                    <w:pStyle w:val="ad"/>
+                    <w:numPr>
+                      <w:ilvl w:val="0"/>
+                      <w:numId w:val="30"/>
+                    </w:numPr>
+                    <w:spacing w:before="45" w:line="211" w:lineRule="auto"/>
+                    <w:rPr>
+                      <w:color w:val="404040" w:themeColor="text1" w:themeTint="BF"/>
+                    </w:rPr>
+                  </w:pPr>
+                  <w:r>
+                    <w:rPr>
+                      <w:color w:val="404040" w:themeColor="text1" w:themeTint="BF"/>
+                    </w:rPr>
+                    <w:t xml:space="preserve">Унифицировал и стандартизировал отображаемые данные, визуализировал ключевые показатели.</w:t>
+                  </w:r>
+                </w:p>
+              </w:tc>
+            </w:tr>
+            <w:tr>
+              <w:trPr>
+                <w:cantSplit/>
+              </w:trPr>
+              <w:tc>
+                <w:tcPr>
+                  <w:tcW w:w="2285" w:type="dxa"/>
+                  <w:vMerge/>
+                </w:tcPr>
+                <w:p>
+                  <w:pPr>
+                    <w:spacing w:before="0" w:after="0" w:line="20" w:lineRule="exact"/>
+                    <w:rPr>
+                      <w:sz w:val="2"/>
+                      <w:szCs w:val="2"/>
+                    </w:rPr>
+                  </w:pPr>
+                </w:p>
+              </w:tc>
+              <w:tc>
+                <w:tcPr>
+                  <w:tcW w:w="7672" w:type="dxa"/>
+                </w:tcPr>
+                <w:p>
+                  <w:pPr>
+                    <w:pStyle w:val="ad"/>
+                    <w:numPr>
+                      <w:ilvl w:val="0"/>
+                      <w:numId w:val="30"/>
+                    </w:numPr>
+                    <w:spacing w:before="45" w:line="211" w:lineRule="auto"/>
+                    <w:rPr>
+                      <w:color w:val="404040" w:themeColor="text1" w:themeTint="BF"/>
+                    </w:rPr>
+                  </w:pPr>
+                  <w:r>
+                    <w:rPr>
+                      <w:color w:val="404040" w:themeColor="text1" w:themeTint="BF"/>
+                    </w:rPr>
+                    <w:t xml:space="preserve">Спроектировал модульный принцип поведения основных смысловых блоков и разделов Производственной сводки.</w:t>
+                  </w:r>
+                </w:p>
+              </w:tc>
+            </w:tr>
+            <w:tr>
+              <w:trPr>
+                <w:cantSplit/>
+              </w:trPr>
+              <w:tc>
+                <w:tcPr>
+                  <w:tcW w:w="2285" w:type="dxa"/>
+                  <w:vMerge/>
+                </w:tcPr>
+                <w:p>
+                  <w:pPr>
+                    <w:spacing w:before="0" w:after="0" w:line="20" w:lineRule="exact"/>
+                    <w:rPr>
+                      <w:sz w:val="2"/>
+                      <w:szCs w:val="2"/>
+                    </w:rPr>
+                  </w:pPr>
+                </w:p>
+              </w:tc>
+              <w:tc>
+                <w:tcPr>
+                  <w:tcW w:w="7672" w:type="dxa"/>
+                </w:tcPr>
+                <w:p>
+                  <w:pPr>
+                    <w:pStyle w:val="ad"/>
+                    <w:numPr>
+                      <w:ilvl w:val="0"/>
+                      <w:numId w:val="30"/>
+                    </w:numPr>
+                    <w:spacing w:before="45" w:line="211" w:lineRule="auto"/>
+                    <w:rPr>
+                      <w:color w:val="404040" w:themeColor="text1" w:themeTint="BF"/>
+                    </w:rPr>
+                  </w:pPr>
+                  <w:r>
+                    <w:rPr>
+                      <w:color w:val="404040" w:themeColor="text1" w:themeTint="BF"/>
+                    </w:rPr>
+                    <w:t xml:space="preserve">Спроектировал интерфейс взаимодействия оператора с системой.</w:t>
+                  </w:r>
+                </w:p>
+              </w:tc>
+            </w:tr>
+            <w:tr>
+              <w:trPr>
+                <w:cantSplit/>
+              </w:trPr>
+              <w:tc>
+                <w:tcPr>
+                  <w:tcW w:w="2285" w:type="dxa"/>
+                  <w:vMerge/>
+                </w:tcPr>
+                <w:p>
+                  <w:pPr>
+                    <w:spacing w:before="0" w:after="0" w:line="20" w:lineRule="exact"/>
+                    <w:rPr>
+                      <w:sz w:val="2"/>
+                      <w:szCs w:val="2"/>
+                    </w:rPr>
+                  </w:pPr>
+                </w:p>
+              </w:tc>
+              <w:tc>
+                <w:tcPr>
+                  <w:tcW w:w="7672" w:type="dxa"/>
+                </w:tcPr>
+                <w:p>
+                  <w:pPr>
+                    <w:pStyle w:val="ad"/>
+                    <w:numPr>
+                      <w:ilvl w:val="0"/>
+                      <w:numId w:val="30"/>
+                    </w:numPr>
+                    <w:spacing w:before="45" w:line="211" w:lineRule="auto"/>
+                    <w:rPr>
+                      <w:color w:val="404040" w:themeColor="text1" w:themeTint="BF"/>
+                    </w:rPr>
+                  </w:pPr>
+                  <w:r>
+                    <w:rPr>
+                      <w:color w:val="404040" w:themeColor="text1" w:themeTint="BF"/>
+                    </w:rPr>
+                    <w:t xml:space="preserve">Адаптировал интерфейс под мобильные устройства и для людей с ограниченными возможностями; проработал тёмную тему, масштабирование и краевые состояния.</w:t>
+                  </w:r>
+                </w:p>
+              </w:tc>
+            </w:tr>
+            <w:tr>
+              <w:trPr>
+                <w:cantSplit/>
+              </w:trPr>
+              <w:tc>
+                <w:tcPr>
+                  <w:tcW w:w="2285" w:type="dxa"/>
+                  <w:vMerge/>
+                </w:tcPr>
+                <w:p>
+                  <w:pPr>
+                    <w:spacing w:before="0" w:after="0" w:line="20" w:lineRule="exact"/>
+                    <w:rPr>
+                      <w:sz w:val="2"/>
+                      <w:szCs w:val="2"/>
+                    </w:rPr>
+                  </w:pPr>
+                </w:p>
+              </w:tc>
+              <w:tc>
+                <w:tcPr>
+                  <w:tcW w:w="7672" w:type="dxa"/>
+                </w:tcPr>
+                <w:p>
+                  <w:pPr>
+                    <w:pStyle w:val="ad"/>
+                    <w:numPr>
+                      <w:ilvl w:val="0"/>
+                      <w:numId w:val="30"/>
+                    </w:numPr>
+                    <w:spacing w:before="45" w:line="211" w:lineRule="auto"/>
+                    <w:rPr>
+                      <w:color w:val="404040" w:themeColor="text1" w:themeTint="BF"/>
+                    </w:rPr>
+                  </w:pPr>
+                  <w:r>
+                    <w:rPr>
+                      <w:color w:val="404040" w:themeColor="text1" w:themeTint="BF"/>
+                    </w:rPr>
+                    <w:t xml:space="preserve">Разработал интерфейсные микро-анимации.</w:t>
+                  </w:r>
+                </w:p>
+              </w:tc>
+            </w:tr>
+            <w:tr>
+              <w:trPr>
+                <w:cantSplit/>
+              </w:trPr>
+              <w:tc>
+                <w:tcPr>
+                  <w:tcW w:w="2285" w:type="dxa"/>
+                  <w:vMerge/>
+                </w:tcPr>
+                <w:p>
+                  <w:pPr>
+                    <w:spacing w:before="0" w:after="0" w:line="20" w:lineRule="exact"/>
+                    <w:rPr>
+                      <w:sz w:val="2"/>
+                      <w:szCs w:val="2"/>
+                    </w:rPr>
+                  </w:pPr>
+                </w:p>
+              </w:tc>
+              <w:tc>
+                <w:tcPr>
+                  <w:tcW w:w="7672" w:type="dxa"/>
+                </w:tcPr>
+                <w:p>
+                  <w:pPr>
+                    <w:pStyle w:val="ad"/>
+                    <w:numPr>
+                      <w:ilvl w:val="0"/>
+                      <w:numId w:val="30"/>
+                    </w:numPr>
+                    <w:spacing w:before="45" w:line="211" w:lineRule="auto"/>
+                    <w:rPr>
+                      <w:color w:val="404040" w:themeColor="text1" w:themeTint="BF"/>
+                    </w:rPr>
+                  </w:pPr>
+                  <w:r>
+                    <w:rPr>
+                      <w:color w:val="404040" w:themeColor="text1" w:themeTint="BF"/>
+                    </w:rPr>
+                    <w:t xml:space="preserve">Создал кликабельные прототипы и протестировал их с конечными пользователями.</w:t>
+                  </w:r>
+                </w:p>
+              </w:tc>
+            </w:tr>
+            <w:tr>
+              <w:trPr>
+                <w:cantSplit/>
+              </w:trPr>
+              <w:tc>
+                <w:tcPr>
+                  <w:tcW w:w="2285" w:type="dxa"/>
+                  <w:vMerge/>
+                </w:tcPr>
+                <w:p>
+                  <w:pPr>
+                    <w:spacing w:before="0" w:after="0" w:line="20" w:lineRule="exact"/>
+                    <w:rPr>
+                      <w:sz w:val="2"/>
+                      <w:szCs w:val="2"/>
+                    </w:rPr>
+                  </w:pPr>
+                </w:p>
+              </w:tc>
+              <w:tc>
+                <w:tcPr>
+                  <w:tcW w:w="7672" w:type="dxa"/>
+                </w:tcPr>
+                <w:p>
+                  <w:pPr>
+                    <w:pStyle w:val="ad"/>
+                    <w:numPr>
+                      <w:ilvl w:val="0"/>
+                      <w:numId w:val="30"/>
+                    </w:numPr>
+                    <w:spacing w:before="45" w:line="211" w:lineRule="auto"/>
+                    <w:rPr>
+                      <w:color w:val="404040" w:themeColor="text1" w:themeTint="BF"/>
+                    </w:rPr>
+                  </w:pPr>
+                  <w:r>
+                    <w:rPr>
+                      <w:color w:val="404040" w:themeColor="text1" w:themeTint="BF"/>
+                    </w:rPr>
+                    <w:t xml:space="preserve">Подготовил и передал макеты в разработку, сопровождал реализацию.</w:t>
+                  </w:r>
+                </w:p>
+              </w:tc>
+            </w:tr>
+            <w:tr>
+              <w:trPr>
+                <w:cantSplit/>
+              </w:trPr>
+              <w:tc>
+                <w:tcPr>
+                  <w:tcW w:w="2285" w:type="dxa"/>
+                  <w:vMerge/>
+                </w:tcPr>
+                <w:p>
+                  <w:pPr>
+                    <w:spacing w:before="0" w:after="0" w:line="20" w:lineRule="exact"/>
+                    <w:rPr>
+                      <w:sz w:val="2"/>
+                      <w:szCs w:val="2"/>
+                    </w:rPr>
                   </w:pPr>
                 </w:p>
               </w:tc>
@@ -2312,238 +3699,6 @@
                       <w:sz w:val="22"/>
                       <w:szCs w:val="22"/>
                     </w:rPr>
-                    <w:t xml:space="preserve">Обязанности</w:t>
-                  </w:r>
-                </w:p>
-                <w:p>
-                  <w:pPr>
-                    <w:spacing w:before="72"/>
-                    <w:rPr>
-                      <w:color w:val="404040" w:themeColor="text1" w:themeTint="BF"/>
-                      <w:sz w:val="20"/>
-                      <w:szCs w:val="20"/>
-                    </w:rPr>
-                  </w:pPr>
-                  <w:r>
-                    <w:rPr>
-                      <w:color w:val="404040" w:themeColor="text1" w:themeTint="BF"/>
-                      <w:sz w:val="20"/>
-                      <w:szCs w:val="20"/>
-                    </w:rPr>
-                    <w:t xml:space="preserve">Проектирование автоматизированной системы мониторинга процессов на всех промышленных объектах НТЦ — «Производственная сводка».</w:t>
-                  </w:r>
-                </w:p>
-                <w:p>
-                  <w:pPr>
-                    <w:pStyle w:val="ad"/>
-                    <w:numPr>
-                      <w:ilvl w:val="0"/>
-                      <w:numId w:val="30"/>
-                    </w:numPr>
-                    <w:spacing w:before="45" w:line="211" w:lineRule="auto"/>
-                    <w:rPr>
-                      <w:color w:val="404040" w:themeColor="text1" w:themeTint="BF"/>
-                    </w:rPr>
-                  </w:pPr>
-                  <w:r>
-                    <w:rPr>
-                      <w:color w:val="404040" w:themeColor="text1" w:themeTint="BF"/>
-                    </w:rPr>
-                    <w:t xml:space="preserve">Анализ функциональных требований и технических ограничений, погружение в предметную область.</w:t>
-                  </w:r>
-                </w:p>
-                <w:p>
-                  <w:pPr>
-                    <w:pStyle w:val="ad"/>
-                    <w:numPr>
-                      <w:ilvl w:val="0"/>
-                      <w:numId w:val="30"/>
-                    </w:numPr>
-                    <w:spacing w:before="45" w:line="211" w:lineRule="auto"/>
-                    <w:rPr>
-                      <w:color w:val="404040" w:themeColor="text1" w:themeTint="BF"/>
-                    </w:rPr>
-                  </w:pPr>
-                  <w:r>
-                    <w:rPr>
-                      <w:color w:val="404040" w:themeColor="text1" w:themeTint="BF"/>
-                    </w:rPr>
-                    <w:t xml:space="preserve">Проведение глубинных интервью с сотрудниками Научно-технического центра, описание JTBD.</w:t>
-                  </w:r>
-                </w:p>
-                <w:p>
-                  <w:pPr>
-                    <w:pStyle w:val="ad"/>
-                    <w:numPr>
-                      <w:ilvl w:val="0"/>
-                      <w:numId w:val="30"/>
-                    </w:numPr>
-                    <w:spacing w:before="45" w:line="211" w:lineRule="auto"/>
-                    <w:rPr>
-                      <w:color w:val="404040" w:themeColor="text1" w:themeTint="BF"/>
-                    </w:rPr>
-                  </w:pPr>
-                  <w:r>
-                    <w:rPr>
-                      <w:color w:val="404040" w:themeColor="text1" w:themeTint="BF"/>
-                    </w:rPr>
-                    <w:t xml:space="preserve">Проектирование универсального каркаса для представления оперативной информации о состоянии работ на всех объектах НТЦ.</w:t>
-                  </w:r>
-                </w:p>
-                <w:p>
-                  <w:pPr>
-                    <w:pStyle w:val="ad"/>
-                    <w:numPr>
-                      <w:ilvl w:val="0"/>
-                      <w:numId w:val="30"/>
-                    </w:numPr>
-                    <w:spacing w:before="45" w:line="211" w:lineRule="auto"/>
-                    <w:rPr>
-                      <w:color w:val="404040" w:themeColor="text1" w:themeTint="BF"/>
-                    </w:rPr>
-                  </w:pPr>
-                  <w:r>
-                    <w:rPr>
-                      <w:color w:val="404040" w:themeColor="text1" w:themeTint="BF"/>
-                    </w:rPr>
-                    <w:t xml:space="preserve">Унификация и стандартизация отображаемых данных, визуализация ключевых данных.</w:t>
-                  </w:r>
-                </w:p>
-                <w:p>
-                  <w:pPr>
-                    <w:pStyle w:val="ad"/>
-                    <w:numPr>
-                      <w:ilvl w:val="0"/>
-                      <w:numId w:val="30"/>
-                    </w:numPr>
-                    <w:spacing w:before="45" w:line="211" w:lineRule="auto"/>
-                    <w:rPr>
-                      <w:color w:val="404040" w:themeColor="text1" w:themeTint="BF"/>
-                    </w:rPr>
-                  </w:pPr>
-                  <w:r>
-                    <w:rPr>
-                      <w:color w:val="404040" w:themeColor="text1" w:themeTint="BF"/>
-                    </w:rPr>
-                    <w:t xml:space="preserve">Проектирование модульного принципа поведения основных смысловых блоков и разделов Производственной сводки.</w:t>
-                  </w:r>
-                </w:p>
-                <w:p>
-                  <w:pPr>
-                    <w:pStyle w:val="ad"/>
-                    <w:numPr>
-                      <w:ilvl w:val="0"/>
-                      <w:numId w:val="30"/>
-                    </w:numPr>
-                    <w:spacing w:before="45" w:line="211" w:lineRule="auto"/>
-                    <w:rPr>
-                      <w:color w:val="404040" w:themeColor="text1" w:themeTint="BF"/>
-                    </w:rPr>
-                  </w:pPr>
-                  <w:r>
-                    <w:rPr>
-                      <w:color w:val="404040" w:themeColor="text1" w:themeTint="BF"/>
-                    </w:rPr>
-                    <w:t xml:space="preserve">Проектирование интерфейса взаимодействия оператора с системой.</w:t>
-                  </w:r>
-                </w:p>
-                <w:p>
-                  <w:pPr>
-                    <w:pStyle w:val="ad"/>
-                    <w:numPr>
-                      <w:ilvl w:val="0"/>
-                      <w:numId w:val="30"/>
-                    </w:numPr>
-                    <w:spacing w:before="45" w:line="211" w:lineRule="auto"/>
-                    <w:rPr>
-                      <w:color w:val="404040" w:themeColor="text1" w:themeTint="BF"/>
-                    </w:rPr>
-                  </w:pPr>
-                  <w:r>
-                    <w:rPr>
-                      <w:color w:val="404040" w:themeColor="text1" w:themeTint="BF"/>
-                    </w:rPr>
-                    <w:t xml:space="preserve">Адаптация интерфейса под мобильные устройства и для людей с ограниченными возможностями.</w:t>
-                  </w:r>
-                </w:p>
-                <w:p>
-                  <w:pPr>
-                    <w:pStyle w:val="ad"/>
-                    <w:numPr>
-                      <w:ilvl w:val="0"/>
-                      <w:numId w:val="30"/>
-                    </w:numPr>
-                    <w:spacing w:before="45" w:line="211" w:lineRule="auto"/>
-                    <w:rPr>
-                      <w:color w:val="404040" w:themeColor="text1" w:themeTint="BF"/>
-                    </w:rPr>
-                  </w:pPr>
-                  <w:r>
-                    <w:rPr>
-                      <w:color w:val="404040" w:themeColor="text1" w:themeTint="BF"/>
-                    </w:rPr>
-                    <w:t xml:space="preserve">Тёмная тема, масштабирование, обработка краевых состояний, интерфейсные микро-анимации.</w:t>
-                  </w:r>
-                </w:p>
-                <w:p>
-                  <w:pPr>
-                    <w:pStyle w:val="ad"/>
-                    <w:numPr>
-                      <w:ilvl w:val="0"/>
-                      <w:numId w:val="30"/>
-                    </w:numPr>
-                    <w:spacing w:before="45" w:line="211" w:lineRule="auto"/>
-                    <w:rPr>
-                      <w:color w:val="404040" w:themeColor="text1" w:themeTint="BF"/>
-                    </w:rPr>
-                  </w:pPr>
-                  <w:r>
-                    <w:rPr>
-                      <w:color w:val="404040" w:themeColor="text1" w:themeTint="BF"/>
-                    </w:rPr>
-                    <w:t xml:space="preserve">Создание кликабельных прототипов и тестирование с участием конечных пользователей.</w:t>
-                  </w:r>
-                </w:p>
-                <w:p>
-                  <w:pPr>
-                    <w:pStyle w:val="ad"/>
-                    <w:numPr>
-                      <w:ilvl w:val="0"/>
-                      <w:numId w:val="30"/>
-                    </w:numPr>
-                    <w:spacing w:before="45" w:line="211" w:lineRule="auto"/>
-                    <w:rPr>
-                      <w:color w:val="404040" w:themeColor="text1" w:themeTint="BF"/>
-                    </w:rPr>
-                  </w:pPr>
-                  <w:r>
-                    <w:rPr>
-                      <w:color w:val="404040" w:themeColor="text1" w:themeTint="BF"/>
-                    </w:rPr>
-                    <w:t xml:space="preserve">Подготовка и передача макетов в разработку, дизайнерское сопровождение разработки.</w:t>
-                  </w:r>
-                </w:p>
-                <w:p>
-                  <w:pPr>
-                    <w:pStyle w:val="ad"/>
-                    <w:keepNext/>
-                    <w:spacing w:before="72" w:line="211" w:lineRule="auto"/>
-                    <w:rPr>
-                      <w:bCs/>
-                      <w:color w:val="0483F8"/>
-                      <w:spacing w:val="-2"/>
-                      <w:sz w:val="22"/>
-                      <w:szCs w:val="22"/>
-                    </w:rPr>
-                  </w:pPr>
-                  <w:r>
-                    <w:rPr>
-                      <w:bCs/>
-                      <w:color w:val="0483F8"/>
-                      <w:spacing w:val="-2"/>
-                      <w:sz w:val="22"/>
-                      <w:szCs w:val="22"/>
-                    </w:rPr>
                     <w:t xml:space="preserve">Технологии</w:t>
                   </w:r>
                 </w:p>
@@ -2563,7 +3718,7 @@
                     <w:rPr>
                       <w:color w:val="404040" w:themeColor="text1" w:themeTint="BF"/>
                     </w:rPr>
-                    <w:t xml:space="preserve">Figma, CJM, UI/UX, UI-kit, прототипирование интерфейсов, iOS / Android guidelines, usability testing</w:t>
+                    <w:t xml:space="preserve">Figma, JTBD, CJM, UI/UX, UI-kit, прототипирование интерфейсов, iOS / Android guidelines, usability testing</w:t>
                   </w:r>
                 </w:p>
               </w:tc>
@@ -2656,9 +3811,73 @@
                     <w:t xml:space="preserve">UX/UI Designer</w:t>
                   </w:r>
                 </w:p>
+                <w:p>
+                  <w:pPr>
+                    <w:pStyle w:val="ad"/>
+                    <w:keepNext/>
+                    <w:spacing w:before="72" w:line="211" w:lineRule="auto"/>
+                    <w:rPr>
+                      <w:bCs/>
+                      <w:color w:val="0483F8"/>
+                      <w:spacing w:val="-2"/>
+                      <w:sz w:val="22"/>
+                      <w:szCs w:val="22"/>
+                    </w:rPr>
+                  </w:pPr>
+                  <w:r>
+                    <w:rPr>
+                      <w:bCs/>
+                      <w:color w:val="0483F8"/>
+                      <w:spacing w:val="-2"/>
+                      <w:sz w:val="22"/>
+                      <w:szCs w:val="22"/>
+                    </w:rPr>
+                    <w:t xml:space="preserve">Обязанности</w:t>
+                  </w:r>
+                </w:p>
+                <w:p>
+                  <w:pPr>
+                    <w:spacing w:before="72"/>
+                    <w:rPr>
+                      <w:color w:val="404040" w:themeColor="text1" w:themeTint="BF"/>
+                      <w:sz w:val="20"/>
+                      <w:szCs w:val="20"/>
+                    </w:rPr>
+                  </w:pPr>
+                  <w:r>
+                    <w:rPr>
+                      <w:color w:val="404040" w:themeColor="text1" w:themeTint="BF"/>
+                      <w:sz w:val="20"/>
+                      <w:szCs w:val="20"/>
+                    </w:rPr>
+                    <w:t xml:space="preserve">Работа в продуктовой команде CRM-системы для компании из сферы услуг по установке и сборке товаров для ритейлеров и производителей.</w:t>
+                  </w:r>
+                </w:p>
+                <w:p>
+                  <w:pPr>
+                    <w:pStyle w:val="ad"/>
+                    <w:numPr>
+                      <w:ilvl w:val="0"/>
+                      <w:numId w:val="30"/>
+                    </w:numPr>
+                    <w:spacing w:before="45" w:line="211" w:lineRule="auto"/>
+                    <w:rPr>
+                      <w:color w:val="404040" w:themeColor="text1" w:themeTint="BF"/>
+                    </w:rPr>
+                  </w:pPr>
+                  <w:r>
+                    <w:rPr>
+                      <w:color w:val="404040" w:themeColor="text1" w:themeTint="BF"/>
+                    </w:rPr>
+                    <w:t xml:space="preserve">Спроектировал интерфейсы системы создания и контроля заказов для монтажников и операторов.</w:t>
+                  </w:r>
+                </w:p>
               </w:tc>
             </w:tr>
             <w:tr>
+              <w:trPr>
+                <w:cantSplit/>
+              </w:trPr>
               <w:tc>
                 <w:tcPr>
                   <w:tcW w:w="2285" w:type="dxa"/>
@@ -2666,10 +3885,99 @@
                 </w:tcPr>
                 <w:p>
                   <w:pPr>
+                    <w:spacing w:before="0" w:after="0" w:line="20" w:lineRule="exact"/>
+                    <w:rPr>
+                      <w:sz w:val="2"/>
+                      <w:szCs w:val="2"/>
+                    </w:rPr>
+                  </w:pPr>
+                </w:p>
+              </w:tc>
+              <w:tc>
+                <w:tcPr>
+                  <w:tcW w:w="7672" w:type="dxa"/>
+                </w:tcPr>
+                <w:p>
+                  <w:pPr>
                     <w:pStyle w:val="ad"/>
-                    <w:spacing w:before="54" w:line="211" w:lineRule="auto"/>
-                    <w:ind w:left="-108" w:right="77"/>
-                    <w:rPr/>
+                    <w:numPr>
+                      <w:ilvl w:val="0"/>
+                      <w:numId w:val="30"/>
+                    </w:numPr>
+                    <w:spacing w:before="45" w:line="211" w:lineRule="auto"/>
+                    <w:rPr>
+                      <w:color w:val="404040" w:themeColor="text1" w:themeTint="BF"/>
+                    </w:rPr>
+                  </w:pPr>
+                  <w:r>
+                    <w:rPr>
+                      <w:color w:val="404040" w:themeColor="text1" w:themeTint="BF"/>
+                    </w:rPr>
+                    <w:t xml:space="preserve">Провёл глубинные интервью с представителями бизнеса и пользователями, сформировал user flow и информационную архитектуру проекта.</w:t>
+                  </w:r>
+                </w:p>
+              </w:tc>
+            </w:tr>
+            <w:tr>
+              <w:trPr>
+                <w:cantSplit/>
+              </w:trPr>
+              <w:tc>
+                <w:tcPr>
+                  <w:tcW w:w="2285" w:type="dxa"/>
+                  <w:vMerge/>
+                </w:tcPr>
+                <w:p>
+                  <w:pPr>
+                    <w:spacing w:before="0" w:after="0" w:line="20" w:lineRule="exact"/>
+                    <w:rPr>
+                      <w:sz w:val="2"/>
+                      <w:szCs w:val="2"/>
+                    </w:rPr>
+                  </w:pPr>
+                </w:p>
+              </w:tc>
+              <w:tc>
+                <w:tcPr>
+                  <w:tcW w:w="7672" w:type="dxa"/>
+                </w:tcPr>
+                <w:p>
+                  <w:pPr>
+                    <w:pStyle w:val="ad"/>
+                    <w:numPr>
+                      <w:ilvl w:val="0"/>
+                      <w:numId w:val="30"/>
+                    </w:numPr>
+                    <w:spacing w:before="45" w:line="211" w:lineRule="auto"/>
+                    <w:rPr>
+                      <w:color w:val="404040" w:themeColor="text1" w:themeTint="BF"/>
+                    </w:rPr>
+                  </w:pPr>
+                  <w:r>
+                    <w:rPr>
+                      <w:color w:val="404040" w:themeColor="text1" w:themeTint="BF"/>
+                    </w:rPr>
+                    <w:t xml:space="preserve">Итеративно улучшал UX на основе фидбека пользователей и бизнес-целей.</w:t>
+                  </w:r>
+                </w:p>
+              </w:tc>
+            </w:tr>
+            <w:tr>
+              <w:trPr>
+                <w:cantSplit/>
+              </w:trPr>
+              <w:tc>
+                <w:tcPr>
+                  <w:tcW w:w="2285" w:type="dxa"/>
+                  <w:vMerge/>
+                </w:tcPr>
+                <w:p>
+                  <w:pPr>
+                    <w:spacing w:before="0" w:after="0" w:line="20" w:lineRule="exact"/>
+                    <w:rPr>
+                      <w:sz w:val="2"/>
+                      <w:szCs w:val="2"/>
+                    </w:rPr>
                   </w:pPr>
                 </w:p>
               </w:tc>
@@ -2698,105 +4006,6 @@
                       <w:sz w:val="22"/>
                       <w:szCs w:val="22"/>
                     </w:rPr>
-                    <w:t xml:space="preserve">Обязанности</w:t>
-                  </w:r>
-                </w:p>
-                <w:p>
-                  <w:pPr>
-                    <w:spacing w:before="72"/>
-                    <w:rPr>
-                      <w:color w:val="404040" w:themeColor="text1" w:themeTint="BF"/>
-                      <w:sz w:val="20"/>
-                      <w:szCs w:val="20"/>
-                    </w:rPr>
-                  </w:pPr>
-                  <w:r>
-                    <w:rPr>
-                      <w:color w:val="404040" w:themeColor="text1" w:themeTint="BF"/>
-                      <w:sz w:val="20"/>
-                      <w:szCs w:val="20"/>
-                    </w:rPr>
-                    <w:t xml:space="preserve">Работа в продуктовой команде CRM-системы для компании из сферы услуг по установке и сборке товаров для ритейлеров и производителей.</w:t>
-                  </w:r>
-                </w:p>
-                <w:p>
-                  <w:pPr>
-                    <w:pStyle w:val="ad"/>
-                    <w:numPr>
-                      <w:ilvl w:val="0"/>
-                      <w:numId w:val="30"/>
-                    </w:numPr>
-                    <w:spacing w:before="45" w:line="211" w:lineRule="auto"/>
-                    <w:rPr>
-                      <w:color w:val="404040" w:themeColor="text1" w:themeTint="BF"/>
-                    </w:rPr>
-                  </w:pPr>
-                  <w:r>
-                    <w:rPr>
-                      <w:color w:val="404040" w:themeColor="text1" w:themeTint="BF"/>
-                    </w:rPr>
-                    <w:t xml:space="preserve">Проектирование интерфейсов системы создания и контроля заказов для монтажников и операторов.</w:t>
-                  </w:r>
-                </w:p>
-                <w:p>
-                  <w:pPr>
-                    <w:pStyle w:val="ad"/>
-                    <w:numPr>
-                      <w:ilvl w:val="0"/>
-                      <w:numId w:val="30"/>
-                    </w:numPr>
-                    <w:spacing w:before="45" w:line="211" w:lineRule="auto"/>
-                    <w:rPr>
-                      <w:color w:val="404040" w:themeColor="text1" w:themeTint="BF"/>
-                    </w:rPr>
-                  </w:pPr>
-                  <w:r>
-                    <w:rPr>
-                      <w:color w:val="404040" w:themeColor="text1" w:themeTint="BF"/>
-                    </w:rPr>
-                    <w:t xml:space="preserve">Проведение глубинных интервью с представителями бизнеса и пользователями, формирование user flow и информационной архитектуры проекта.</w:t>
-                  </w:r>
-                </w:p>
-                <w:p>
-                  <w:pPr>
-                    <w:pStyle w:val="ad"/>
-                    <w:numPr>
-                      <w:ilvl w:val="0"/>
-                      <w:numId w:val="30"/>
-                    </w:numPr>
-                    <w:spacing w:before="45" w:line="211" w:lineRule="auto"/>
-                    <w:rPr>
-                      <w:color w:val="404040" w:themeColor="text1" w:themeTint="BF"/>
-                    </w:rPr>
-                  </w:pPr>
-                  <w:r>
-                    <w:rPr>
-                      <w:color w:val="404040" w:themeColor="text1" w:themeTint="BF"/>
-                    </w:rPr>
-                    <w:t xml:space="preserve">Работа над итеративными улучшениями UX на основе фидбека пользователей и бизнес-целей.</w:t>
-                  </w:r>
-                </w:p>
-                <w:p>
-                  <w:pPr>
-                    <w:pStyle w:val="ad"/>
-                    <w:keepNext/>
-                    <w:spacing w:before="72" w:line="211" w:lineRule="auto"/>
-                    <w:rPr>
-                      <w:bCs/>
-                      <w:color w:val="0483F8"/>
-                      <w:spacing w:val="-2"/>
-                      <w:sz w:val="22"/>
-                      <w:szCs w:val="22"/>
-                    </w:rPr>
-                  </w:pPr>
-                  <w:r>
-                    <w:rPr>
-                      <w:bCs/>
-                      <w:color w:val="0483F8"/>
-                      <w:spacing w:val="-2"/>
-                      <w:sz w:val="22"/>
-                      <w:szCs w:val="22"/>
-                    </w:rPr>
                     <w:t xml:space="preserve">Достижения</w:t>
                   </w:r>
                 </w:p>
@@ -2816,9 +4025,34 @@
                     <w:rPr>
                       <w:color w:val="404040" w:themeColor="text1" w:themeTint="BF"/>
                     </w:rPr>
-                    <w:t xml:space="preserve">Собрал UX/UI-систему на основе компонентов под React Native для ускорения разработки.</w:t>
+                    <w:t xml:space="preserve">Собрал UX/UI-систему на основе компонентов под React Native, что ускорило разработку.</w:t>
                   </w:r>
                 </w:p>
+              </w:tc>
+            </w:tr>
+            <w:tr>
+              <w:trPr>
+                <w:cantSplit/>
+              </w:trPr>
+              <w:tc>
+                <w:tcPr>
+                  <w:tcW w:w="2285" w:type="dxa"/>
+                  <w:vMerge/>
+                </w:tcPr>
+                <w:p>
+                  <w:pPr>
+                    <w:spacing w:before="0" w:after="0" w:line="20" w:lineRule="exact"/>
+                    <w:rPr>
+                      <w:sz w:val="2"/>
+                      <w:szCs w:val="2"/>
+                    </w:rPr>
+                  </w:pPr>
+                </w:p>
+              </w:tc>
+              <w:tc>
+                <w:tcPr>
+                  <w:tcW w:w="7672" w:type="dxa"/>
+                </w:tcPr>
                 <w:p>
                   <w:pPr>
                     <w:pStyle w:val="ad"/>
@@ -2952,27 +4186,6 @@
                     <w:t xml:space="preserve">Ментор / UX/UI Designer</w:t>
                   </w:r>
                 </w:p>
-              </w:tc>
-            </w:tr>
-            <w:tr>
-              <w:tc>
-                <w:tcPr>
-                  <w:tcW w:w="2285" w:type="dxa"/>
-                  <w:vMerge/>
-                </w:tcPr>
-                <w:p>
-                  <w:pPr>
-                    <w:pStyle w:val="ad"/>
-                    <w:spacing w:before="54" w:line="211" w:lineRule="auto"/>
-                    <w:ind w:left="-108" w:right="77"/>
-                    <w:rPr/>
-                  </w:pPr>
-                </w:p>
-              </w:tc>
-              <w:tc>
-                <w:tcPr>
-                  <w:tcW w:w="7672" w:type="dxa"/>
-                </w:tcPr>
                 <w:p>
                   <w:pPr>
                     <w:pStyle w:val="ad"/>
@@ -3013,9 +4226,34 @@
                     <w:rPr>
                       <w:color w:val="404040" w:themeColor="text1" w:themeTint="BF"/>
                     </w:rPr>
-                    <w:t xml:space="preserve">Работа ментором в сервисе для прокачки молодых дизайнеров.</w:t>
+                    <w:t xml:space="preserve">Менторил начинающих дизайнеров в сервисе для их профессионального развития.</w:t>
                   </w:r>
                 </w:p>
+              </w:tc>
+            </w:tr>
+            <w:tr>
+              <w:trPr>
+                <w:cantSplit/>
+              </w:trPr>
+              <w:tc>
+                <w:tcPr>
+                  <w:tcW w:w="2285" w:type="dxa"/>
+                  <w:vMerge/>
+                </w:tcPr>
+                <w:p>
+                  <w:pPr>
+                    <w:spacing w:before="0" w:after="0" w:line="20" w:lineRule="exact"/>
+                    <w:rPr>
+                      <w:sz w:val="2"/>
+                      <w:szCs w:val="2"/>
+                    </w:rPr>
+                  </w:pPr>
+                </w:p>
+              </w:tc>
+              <w:tc>
+                <w:tcPr>
+                  <w:tcW w:w="7672" w:type="dxa"/>
+                </w:tcPr>
                 <w:p>
                   <w:pPr>
                     <w:pStyle w:val="ad"/>
@@ -3149,27 +4387,6 @@
                     <w:t xml:space="preserve">UX/UI Designer / Graphic Designer</w:t>
                   </w:r>
                 </w:p>
-              </w:tc>
-            </w:tr>
-            <w:tr>
-              <w:tc>
-                <w:tcPr>
-                  <w:tcW w:w="2285" w:type="dxa"/>
-                  <w:vMerge/>
-                </w:tcPr>
-                <w:p>
-                  <w:pPr>
-                    <w:pStyle w:val="ad"/>
-                    <w:spacing w:before="54" w:line="211" w:lineRule="auto"/>
-                    <w:ind w:left="-108" w:right="77"/>
-                    <w:rPr/>
-                  </w:pPr>
-                </w:p>
-              </w:tc>
-              <w:tc>
-                <w:tcPr>
-                  <w:tcW w:w="7672" w:type="dxa"/>
-                </w:tcPr>
                 <w:p>
                   <w:pPr>
                     <w:pStyle w:val="ad"/>
@@ -3210,9 +4427,34 @@
                     <w:rPr>
                       <w:color w:val="404040" w:themeColor="text1" w:themeTint="BF"/>
                     </w:rPr>
-                    <w:t xml:space="preserve">Разработка коммуникационного дизайна: лендинги, рекламные креативы и баннеры.</w:t>
+                    <w:t xml:space="preserve">Разрабатывал коммуникационный дизайн: лендинги, рекламные креативы и баннеры.</w:t>
                   </w:r>
                 </w:p>
+              </w:tc>
+            </w:tr>
+            <w:tr>
+              <w:trPr>
+                <w:cantSplit/>
+              </w:trPr>
+              <w:tc>
+                <w:tcPr>
+                  <w:tcW w:w="2285" w:type="dxa"/>
+                  <w:vMerge/>
+                </w:tcPr>
+                <w:p>
+                  <w:pPr>
+                    <w:spacing w:before="0" w:after="0" w:line="20" w:lineRule="exact"/>
+                    <w:rPr>
+                      <w:sz w:val="2"/>
+                      <w:szCs w:val="2"/>
+                    </w:rPr>
+                  </w:pPr>
+                </w:p>
+              </w:tc>
+              <w:tc>
+                <w:tcPr>
+                  <w:tcW w:w="7672" w:type="dxa"/>
+                </w:tcPr>
                 <w:p>
                   <w:pPr>
                     <w:pStyle w:val="ad"/>
@@ -3229,9 +4471,34 @@
                     <w:rPr>
                       <w:color w:val="404040" w:themeColor="text1" w:themeTint="BF"/>
                     </w:rPr>
-                    <w:t xml:space="preserve">Создание айдентики для брендов и проектов.</w:t>
+                    <w:t xml:space="preserve">Создавал айдентику для брендов и проектов.</w:t>
                   </w:r>
                 </w:p>
+              </w:tc>
+            </w:tr>
+            <w:tr>
+              <w:trPr>
+                <w:cantSplit/>
+              </w:trPr>
+              <w:tc>
+                <w:tcPr>
+                  <w:tcW w:w="2285" w:type="dxa"/>
+                  <w:vMerge/>
+                </w:tcPr>
+                <w:p>
+                  <w:pPr>
+                    <w:spacing w:before="0" w:after="0" w:line="20" w:lineRule="exact"/>
+                    <w:rPr>
+                      <w:sz w:val="2"/>
+                      <w:szCs w:val="2"/>
+                    </w:rPr>
+                  </w:pPr>
+                </w:p>
+              </w:tc>
+              <w:tc>
+                <w:tcPr>
+                  <w:tcW w:w="7672" w:type="dxa"/>
+                </w:tcPr>
                 <w:p>
                   <w:pPr>
                     <w:pStyle w:val="ad"/>
@@ -3248,9 +4515,34 @@
                     <w:rPr>
                       <w:color w:val="404040" w:themeColor="text1" w:themeTint="BF"/>
                     </w:rPr>
-                    <w:t xml:space="preserve">Веб-дизайн с акцентом на современные тренды и пользовательский опыт.</w:t>
+                    <w:t xml:space="preserve">Проектировал сайты с акцентом на пользовательский опыт и современные тренды.</w:t>
                   </w:r>
                 </w:p>
+              </w:tc>
+            </w:tr>
+            <w:tr>
+              <w:trPr>
+                <w:cantSplit/>
+              </w:trPr>
+              <w:tc>
+                <w:tcPr>
+                  <w:tcW w:w="2285" w:type="dxa"/>
+                  <w:vMerge/>
+                </w:tcPr>
+                <w:p>
+                  <w:pPr>
+                    <w:spacing w:before="0" w:after="0" w:line="20" w:lineRule="exact"/>
+                    <w:rPr>
+                      <w:sz w:val="2"/>
+                      <w:szCs w:val="2"/>
+                    </w:rPr>
+                  </w:pPr>
+                </w:p>
+              </w:tc>
+              <w:tc>
+                <w:tcPr>
+                  <w:tcW w:w="7672" w:type="dxa"/>
+                </w:tcPr>
                 <w:p>
                   <w:pPr>
                     <w:pStyle w:val="ad"/>
@@ -3267,9 +4559,34 @@
                     <w:rPr>
                       <w:color w:val="404040" w:themeColor="text1" w:themeTint="BF"/>
                     </w:rPr>
-                    <w:t xml:space="preserve">Сборка сайтов на платформах Tilda, Readymag и Webflow.</w:t>
+                    <w:t xml:space="preserve">Собирал сайты на платформах Tilda, Readymag и Webflow.</w:t>
                   </w:r>
                 </w:p>
+              </w:tc>
+            </w:tr>
+            <w:tr>
+              <w:trPr>
+                <w:cantSplit/>
+              </w:trPr>
+              <w:tc>
+                <w:tcPr>
+                  <w:tcW w:w="2285" w:type="dxa"/>
+                  <w:vMerge/>
+                </w:tcPr>
+                <w:p>
+                  <w:pPr>
+                    <w:spacing w:before="0" w:after="0" w:line="20" w:lineRule="exact"/>
+                    <w:rPr>
+                      <w:sz w:val="2"/>
+                      <w:szCs w:val="2"/>
+                    </w:rPr>
+                  </w:pPr>
+                </w:p>
+              </w:tc>
+              <w:tc>
+                <w:tcPr>
+                  <w:tcW w:w="7672" w:type="dxa"/>
+                </w:tcPr>
                 <w:p>
                   <w:pPr>
                     <w:pStyle w:val="ad"/>
@@ -3403,27 +4720,6 @@
                     <w:t xml:space="preserve">UX/UI Designer</w:t>
                   </w:r>
                 </w:p>
-              </w:tc>
-            </w:tr>
-            <w:tr>
-              <w:tc>
-                <w:tcPr>
-                  <w:tcW w:w="2285" w:type="dxa"/>
-                  <w:vMerge/>
-                </w:tcPr>
-                <w:p>
-                  <w:pPr>
-                    <w:pStyle w:val="ad"/>
-                    <w:spacing w:before="54" w:line="211" w:lineRule="auto"/>
-                    <w:ind w:left="-108" w:right="77"/>
-                    <w:rPr/>
-                  </w:pPr>
-                </w:p>
-              </w:tc>
-              <w:tc>
-                <w:tcPr>
-                  <w:tcW w:w="7672" w:type="dxa"/>
-                </w:tcPr>
                 <w:p>
                   <w:pPr>
                     <w:pStyle w:val="ad"/>
@@ -3464,9 +4760,34 @@
                     <w:rPr>
                       <w:color w:val="404040" w:themeColor="text1" w:themeTint="BF"/>
                     </w:rPr>
-                    <w:t xml:space="preserve">Разработка прототипов интерфейсов.</w:t>
+                    <w:t xml:space="preserve">Разрабатывал прототипы интерфейсов.</w:t>
                   </w:r>
                 </w:p>
+              </w:tc>
+            </w:tr>
+            <w:tr>
+              <w:trPr>
+                <w:cantSplit/>
+              </w:trPr>
+              <w:tc>
+                <w:tcPr>
+                  <w:tcW w:w="2285" w:type="dxa"/>
+                  <w:vMerge/>
+                </w:tcPr>
+                <w:p>
+                  <w:pPr>
+                    <w:spacing w:before="0" w:after="0" w:line="20" w:lineRule="exact"/>
+                    <w:rPr>
+                      <w:sz w:val="2"/>
+                      <w:szCs w:val="2"/>
+                    </w:rPr>
+                  </w:pPr>
+                </w:p>
+              </w:tc>
+              <w:tc>
+                <w:tcPr>
+                  <w:tcW w:w="7672" w:type="dxa"/>
+                </w:tcPr>
                 <w:p>
                   <w:pPr>
                     <w:pStyle w:val="ad"/>
@@ -3483,9 +4804,34 @@
                     <w:rPr>
                       <w:color w:val="404040" w:themeColor="text1" w:themeTint="BF"/>
                     </w:rPr>
-                    <w:t xml:space="preserve">Дизайн интерфейсов с учётом пользовательского опыта.</w:t>
+                    <w:t xml:space="preserve">Проектировал интерфейсы с учётом пользовательского опыта.</w:t>
                   </w:r>
                 </w:p>
+              </w:tc>
+            </w:tr>
+            <w:tr>
+              <w:trPr>
+                <w:cantSplit/>
+              </w:trPr>
+              <w:tc>
+                <w:tcPr>
+                  <w:tcW w:w="2285" w:type="dxa"/>
+                  <w:vMerge/>
+                </w:tcPr>
+                <w:p>
+                  <w:pPr>
+                    <w:spacing w:before="0" w:after="0" w:line="20" w:lineRule="exact"/>
+                    <w:rPr>
+                      <w:sz w:val="2"/>
+                      <w:szCs w:val="2"/>
+                    </w:rPr>
+                  </w:pPr>
+                </w:p>
+              </w:tc>
+              <w:tc>
+                <w:tcPr>
+                  <w:tcW w:w="7672" w:type="dxa"/>
+                </w:tcPr>
                 <w:p>
                   <w:pPr>
                     <w:pStyle w:val="ad"/>
@@ -3502,9 +4848,34 @@
                     <w:rPr>
                       <w:color w:val="404040" w:themeColor="text1" w:themeTint="BF"/>
                     </w:rPr>
-                    <w:t xml:space="preserve">Создание иллюстраций и иконок для использования в интерфейсах.</w:t>
+                    <w:t xml:space="preserve">Создавал иллюстрации и иконки для интерфейсов.</w:t>
                   </w:r>
                 </w:p>
+              </w:tc>
+            </w:tr>
+            <w:tr>
+              <w:trPr>
+                <w:cantSplit/>
+              </w:trPr>
+              <w:tc>
+                <w:tcPr>
+                  <w:tcW w:w="2285" w:type="dxa"/>
+                  <w:vMerge/>
+                </w:tcPr>
+                <w:p>
+                  <w:pPr>
+                    <w:spacing w:before="0" w:after="0" w:line="20" w:lineRule="exact"/>
+                    <w:rPr>
+                      <w:sz w:val="2"/>
+                      <w:szCs w:val="2"/>
+                    </w:rPr>
+                  </w:pPr>
+                </w:p>
+              </w:tc>
+              <w:tc>
+                <w:tcPr>
+                  <w:tcW w:w="7672" w:type="dxa"/>
+                </w:tcPr>
                 <w:p>
                   <w:pPr>
                     <w:pStyle w:val="ad"/>

</xml_diff>

<commit_message>
6 years; PMs, design review, senior roles; Лига Ставок problem chain; MUI 600h
Co-Authored-By: Claude Opus 5.5 <noreply@anthropic.com>
Claude-Session: https://claude.ai/code/session_012npdp2UDGCWsrnjWPKCB4G
</commit_message>
<xml_diff>
--- a/Резюме_ITFB_Михаил_Н_UX-UI.docx
+++ b/Резюме_ITFB_Михаил_Н_UX-UI.docx
@@ -19,7 +19,7 @@
           <w:sz w:val="44"/>
           <w:szCs w:val="44"/>
         </w:rPr>
-        <w:t xml:space="preserve">Senior UX/UI-дизайнер, 9 лет опыта</w:t>
+        <w:t xml:space="preserve">Senior UX/UI-дизайнер, 6 лет опыта</w:t>
       </w:r>
     </w:p>
     <w:p>
@@ -170,7 +170,7 @@
           <w:sz w:val="20"/>
           <w:szCs w:val="20"/>
         </w:rPr>
-        <w:t xml:space="preserve">Решения на основе данных: проверка гипотез в итерациях тестирования, оценка по метрикам (ошибки, когнитивная нагрузка, скорость решения задач).</w:t>
+        <w:t xml:space="preserve">Решения на основе данных: проверка гипотез в итерациях тестирования, оценка по метрикам (время онбординга, ошибки, когнитивная нагрузка, скорость решения задач, трудозатраты разработки).</w:t>
       </w:r>
     </w:p>
     <w:p>
@@ -350,7 +350,7 @@
           <w:sz w:val="20"/>
           <w:szCs w:val="20"/>
         </w:rPr>
-        <w:t xml:space="preserve">Передача в разработку и дизайнерское сопровождение реализации; плотная работа с аналитиками, фронтенд- и бэкенд-командами.</w:t>
+        <w:t xml:space="preserve">Передача в разработку и дизайнерское сопровождение реализации; плотная работа с продакт-менеджерами, аналитиками, фронтенд- и бэкенд-командами.</w:t>
       </w:r>
     </w:p>
     <w:p>
@@ -370,7 +370,7 @@
           <w:sz w:val="20"/>
           <w:szCs w:val="20"/>
         </w:rPr>
-        <w:t xml:space="preserve">Менторинг и координация младших дизайнеров.</w:t>
+        <w:t xml:space="preserve">Дизайн-ревью, менторинг и координация младших дизайнеров (роль старшего дизайнера в Лиге Ставок и ОТП Банке).</w:t>
       </w:r>
     </w:p>
     <w:p>
@@ -442,7 +442,7 @@
                 <w:bCs/>
                 <w:color w:val="0483F8"/>
               </w:rPr>
-              <w:t xml:space="preserve">ПРОЕКТЫ В ITFB И ПРЕДЫДУЩИЙ ОПЫТ – 9 лет</w:t>
+              <w:t xml:space="preserve">ПРОЕКТЫ В ITFB И ПРЕДЫДУЩИЙ ОПЫТ – 6 лет</w:t>
             </w:r>
           </w:p>
         </w:tc>
@@ -546,7 +546,7 @@
                       <w:bCs/>
                       <w:color w:val="404040"/>
                     </w:rPr>
-                    <w:t xml:space="preserve">UX/UI Designer</w:t>
+                    <w:t xml:space="preserve">Senior UX/UI Designer</w:t>
                   </w:r>
                 </w:p>
                 <w:p>
@@ -832,6 +832,74 @@
                       <w:sz w:val="22"/>
                       <w:szCs w:val="22"/>
                     </w:rPr>
+                    <w:t xml:space="preserve">Состав команды</w:t>
+                  </w:r>
+                </w:p>
+                <w:p>
+                  <w:pPr>
+                    <w:pStyle w:val="ad"/>
+                    <w:numPr>
+                      <w:ilvl w:val="0"/>
+                      <w:numId w:val="34"/>
+                    </w:numPr>
+                    <w:spacing w:before="45" w:line="211" w:lineRule="auto"/>
+                    <w:rPr>
+                      <w:color w:val="404040" w:themeColor="text1" w:themeTint="BF"/>
+                    </w:rPr>
+                  </w:pPr>
+                  <w:r>
+                    <w:rPr>
+                      <w:color w:val="404040" w:themeColor="text1" w:themeTint="BF"/>
+                    </w:rPr>
+                    <w:t xml:space="preserve">Продакт-менеджеры.</w:t>
+                  </w:r>
+                </w:p>
+              </w:tc>
+            </w:tr>
+            <w:tr>
+              <w:trPr>
+                <w:cantSplit/>
+              </w:trPr>
+              <w:tc>
+                <w:tcPr>
+                  <w:tcW w:w="2285" w:type="dxa"/>
+                  <w:vMerge/>
+                </w:tcPr>
+                <w:p>
+                  <w:pPr>
+                    <w:spacing w:before="0" w:after="0" w:line="20" w:lineRule="exact"/>
+                    <w:rPr>
+                      <w:sz w:val="2"/>
+                      <w:szCs w:val="2"/>
+                    </w:rPr>
+                  </w:pPr>
+                </w:p>
+              </w:tc>
+              <w:tc>
+                <w:tcPr>
+                  <w:tcW w:w="7672" w:type="dxa"/>
+                </w:tcPr>
+                <w:p>
+                  <w:pPr>
+                    <w:pStyle w:val="ad"/>
+                    <w:keepNext/>
+                    <w:spacing w:before="72" w:line="211" w:lineRule="auto"/>
+                    <w:rPr>
+                      <w:bCs/>
+                      <w:color w:val="0483F8"/>
+                      <w:spacing w:val="-2"/>
+                      <w:sz w:val="22"/>
+                      <w:szCs w:val="22"/>
+                    </w:rPr>
+                  </w:pPr>
+                  <w:r>
+                    <w:rPr>
+                      <w:bCs/>
+                      <w:color w:val="0483F8"/>
+                      <w:spacing w:val="-2"/>
+                      <w:sz w:val="22"/>
+                      <w:szCs w:val="22"/>
+                    </w:rPr>
                     <w:t xml:space="preserve">Технологии</w:t>
                   </w:r>
                 </w:p>
@@ -868,7 +936,7 @@
                 <w:p>
                   <w:pPr>
                     <w:pStyle w:val="ad"/>
-                    <w:spacing w:before="234" w:line="211" w:lineRule="auto"/>
+                    <w:spacing w:before="184" w:line="211" w:lineRule="auto"/>
                     <w:ind w:left="-108" w:right="77"/>
                     <w:rPr>
                       <w:bCs/>
@@ -909,7 +977,7 @@
                 <w:p>
                   <w:pPr>
                     <w:keepNext/>
-                    <w:spacing w:before="200"/>
+                    <w:spacing w:before="150"/>
                     <w:rPr>
                       <w:b/>
                       <w:bCs/>
@@ -1446,7 +1514,7 @@
                     <w:rPr>
                       <w:color w:val="404040" w:themeColor="text1" w:themeTint="BF"/>
                     </w:rPr>
-                    <w:t xml:space="preserve">Арт-директор, бизнес- и системные аналитики, фронтенд- и бэкенд-команды.</w:t>
+                    <w:t xml:space="preserve">Продакт-менеджеры, арт-директор, бизнес- и системные аналитики, фронтенд- и бэкенд-команды.</w:t>
                   </w:r>
                 </w:p>
               </w:tc>
@@ -1531,7 +1599,7 @@
                 <w:p>
                   <w:pPr>
                     <w:pStyle w:val="ad"/>
-                    <w:spacing w:before="234" w:line="211" w:lineRule="auto"/>
+                    <w:spacing w:before="184" w:line="211" w:lineRule="auto"/>
                     <w:ind w:left="-108" w:right="77"/>
                     <w:rPr>
                       <w:bCs/>
@@ -1572,7 +1640,7 @@
                 <w:p>
                   <w:pPr>
                     <w:keepNext/>
-                    <w:spacing w:before="200"/>
+                    <w:spacing w:before="150"/>
                     <w:rPr>
                       <w:b/>
                       <w:bCs/>
@@ -1997,7 +2065,7 @@
                     <w:rPr>
                       <w:color w:val="404040" w:themeColor="text1" w:themeTint="BF"/>
                     </w:rPr>
-                    <w:t xml:space="preserve">Собрал кастомизируемый интерфейс на основе MUI — сократил затраты на разработку и упростил масштабирование на другие подразделения и смежные продукты.</w:t>
+                    <w:t xml:space="preserve">Собрал кастомизируемый интерфейс на основе MUI — сократил сроки разработки примерно на 600 часов и упростил масштабирование на другие подразделения и смежные продукты.</w:t>
                   </w:r>
                 </w:p>
               </w:tc>
@@ -2082,7 +2150,7 @@
                 <w:p>
                   <w:pPr>
                     <w:pStyle w:val="ad"/>
-                    <w:spacing w:before="234" w:line="211" w:lineRule="auto"/>
+                    <w:spacing w:before="184" w:line="211" w:lineRule="auto"/>
                     <w:ind w:left="-108" w:right="77"/>
                     <w:rPr>
                       <w:bCs/>
@@ -2123,7 +2191,7 @@
                 <w:p>
                   <w:pPr>
                     <w:keepNext/>
-                    <w:spacing w:before="200"/>
+                    <w:spacing w:before="150"/>
                     <w:rPr>
                       <w:b/>
                       <w:bCs/>
@@ -2155,7 +2223,7 @@
                       <w:bCs/>
                       <w:color w:val="404040"/>
                     </w:rPr>
-                    <w:t xml:space="preserve">UX/UI Designer</w:t>
+                    <w:t xml:space="preserve">Senior UX/UI Designer</w:t>
                   </w:r>
                 </w:p>
                 <w:p>
@@ -2304,94 +2372,6 @@
                     <w:rPr>
                       <w:color w:val="404040" w:themeColor="text1" w:themeTint="BF"/>
                     </w:rPr>
-                    <w:t xml:space="preserve">Провёл серии глубинных интервью с пользователями и сформировал на их основе гипотезы.</w:t>
-                  </w:r>
-                </w:p>
-              </w:tc>
-            </w:tr>
-            <w:tr>
-              <w:trPr>
-                <w:cantSplit/>
-              </w:trPr>
-              <w:tc>
-                <w:tcPr>
-                  <w:tcW w:w="2285" w:type="dxa"/>
-                  <w:vMerge/>
-                </w:tcPr>
-                <w:p>
-                  <w:pPr>
-                    <w:spacing w:before="0" w:after="0" w:line="20" w:lineRule="exact"/>
-                    <w:rPr>
-                      <w:sz w:val="2"/>
-                      <w:szCs w:val="2"/>
-                    </w:rPr>
-                  </w:pPr>
-                </w:p>
-              </w:tc>
-              <w:tc>
-                <w:tcPr>
-                  <w:tcW w:w="7672" w:type="dxa"/>
-                </w:tcPr>
-                <w:p>
-                  <w:pPr>
-                    <w:pStyle w:val="ad"/>
-                    <w:numPr>
-                      <w:ilvl w:val="0"/>
-                      <w:numId w:val="30"/>
-                    </w:numPr>
-                    <w:spacing w:before="45" w:line="211" w:lineRule="auto"/>
-                    <w:rPr>
-                      <w:color w:val="404040" w:themeColor="text1" w:themeTint="BF"/>
-                    </w:rPr>
-                  </w:pPr>
-                  <w:r>
-                    <w:rPr>
-                      <w:color w:val="404040" w:themeColor="text1" w:themeTint="BF"/>
-                    </w:rPr>
-                    <w:t xml:space="preserve">Спроектировал UX для 3 групп пользователей (250+ человек) в рамках бизнес-задач.</w:t>
-                  </w:r>
-                </w:p>
-              </w:tc>
-            </w:tr>
-            <w:tr>
-              <w:trPr>
-                <w:cantSplit/>
-              </w:trPr>
-              <w:tc>
-                <w:tcPr>
-                  <w:tcW w:w="2285" w:type="dxa"/>
-                  <w:vMerge/>
-                </w:tcPr>
-                <w:p>
-                  <w:pPr>
-                    <w:spacing w:before="0" w:after="0" w:line="20" w:lineRule="exact"/>
-                    <w:rPr>
-                      <w:sz w:val="2"/>
-                      <w:szCs w:val="2"/>
-                    </w:rPr>
-                  </w:pPr>
-                </w:p>
-              </w:tc>
-              <w:tc>
-                <w:tcPr>
-                  <w:tcW w:w="7672" w:type="dxa"/>
-                </w:tcPr>
-                <w:p>
-                  <w:pPr>
-                    <w:pStyle w:val="ad"/>
-                    <w:numPr>
-                      <w:ilvl w:val="0"/>
-                      <w:numId w:val="30"/>
-                    </w:numPr>
-                    <w:spacing w:before="45" w:line="211" w:lineRule="auto"/>
-                    <w:rPr>
-                      <w:color w:val="404040" w:themeColor="text1" w:themeTint="BF"/>
-                    </w:rPr>
-                  </w:pPr>
-                  <w:r>
-                    <w:rPr>
-                      <w:color w:val="404040" w:themeColor="text1" w:themeTint="BF"/>
-                    </w:rPr>
                     <w:t xml:space="preserve">Описывал и заводил новые компоненты и виджеты в общую дизайн-систему компании.</w:t>
                   </w:r>
                 </w:p>
@@ -2436,7 +2416,7 @@
                     <w:rPr>
                       <w:color w:val="404040" w:themeColor="text1" w:themeTint="BF"/>
                     </w:rPr>
-                    <w:t xml:space="preserve">Синхронизировался с кросс-командами: тесно работал с аналитиками, пользователями и командой разработки.</w:t>
+                    <w:t xml:space="preserve">Проводил дизайн-ревью макетов как старший дизайнер.</w:t>
                   </w:r>
                 </w:p>
               </w:tc>
@@ -2467,44 +2447,20 @@
                 <w:p>
                   <w:pPr>
                     <w:pStyle w:val="ad"/>
-                    <w:keepNext/>
-                    <w:spacing w:before="72" w:line="211" w:lineRule="auto"/>
-                    <w:rPr>
-                      <w:bCs/>
-                      <w:color w:val="0483F8"/>
-                      <w:spacing w:val="-2"/>
-                      <w:sz w:val="22"/>
-                      <w:szCs w:val="22"/>
+                    <w:numPr>
+                      <w:ilvl w:val="0"/>
+                      <w:numId w:val="30"/>
+                    </w:numPr>
+                    <w:spacing w:before="45" w:line="211" w:lineRule="auto"/>
+                    <w:rPr>
+                      <w:color w:val="404040" w:themeColor="text1" w:themeTint="BF"/>
                     </w:rPr>
                   </w:pPr>
                   <w:r>
                     <w:rPr>
-                      <w:bCs/>
-                      <w:color w:val="0483F8"/>
-                      <w:spacing w:val="-2"/>
-                      <w:sz w:val="22"/>
-                      <w:szCs w:val="22"/>
-                    </w:rPr>
-                    <w:t xml:space="preserve">Достижения</w:t>
-                  </w:r>
-                </w:p>
-                <w:p>
-                  <w:pPr>
-                    <w:pStyle w:val="ad"/>
-                    <w:numPr>
-                      <w:ilvl w:val="0"/>
-                      <w:numId w:val="34"/>
-                    </w:numPr>
-                    <w:spacing w:before="45" w:line="211" w:lineRule="auto"/>
-                    <w:rPr>
                       <w:color w:val="404040" w:themeColor="text1" w:themeTint="BF"/>
                     </w:rPr>
-                  </w:pPr>
-                  <w:r>
-                    <w:rPr>
-                      <w:color w:val="404040" w:themeColor="text1" w:themeTint="BF"/>
-                    </w:rPr>
-                    <w:t xml:space="preserve">Исследование → гипотезы → решение → проверка → результат: по итогам глубинных интервью сформировал гипотезы, спроектировал решения и проверил их в нескольких итерациях usability-тестирований — количество ошибок снизилось на 24%, когнитивная нагрузка на 36%, скорость решения задач выросла.</w:t>
+                    <w:t xml:space="preserve">Синхронизировался с кросс-командами: тесно работал с продакт-менеджерами, аналитиками, пользователями и командой разработки.</w:t>
                   </w:r>
                 </w:p>
               </w:tc>
@@ -2553,6 +2509,290 @@
                       <w:sz w:val="22"/>
                       <w:szCs w:val="22"/>
                     </w:rPr>
+                    <w:t xml:space="preserve">Достижения</w:t>
+                  </w:r>
+                </w:p>
+                <w:p>
+                  <w:pPr>
+                    <w:pStyle w:val="ad"/>
+                    <w:numPr>
+                      <w:ilvl w:val="0"/>
+                      <w:numId w:val="34"/>
+                    </w:numPr>
+                    <w:spacing w:before="45" w:line="211" w:lineRule="auto"/>
+                    <w:rPr>
+                      <w:color w:val="404040" w:themeColor="text1" w:themeTint="BF"/>
+                    </w:rPr>
+                  </w:pPr>
+                  <w:r>
+                    <w:rPr>
+                      <w:b/>
+                      <w:bCs/>
+                      <w:color w:val="404040" w:themeColor="text1" w:themeTint="BF"/>
+                    </w:rPr>
+                    <w:t xml:space="preserve">Проблема: </w:t>
+                  </w:r>
+                  <w:r>
+                    <w:rPr>
+                      <w:color w:val="404040" w:themeColor="text1" w:themeTint="BF"/>
+                    </w:rPr>
+                    <w:t xml:space="preserve">сложный онбординг в систему занимал много времени и требовал высокой когнитивной нагрузки при обучении.</w:t>
+                  </w:r>
+                </w:p>
+              </w:tc>
+            </w:tr>
+            <w:tr>
+              <w:trPr>
+                <w:cantSplit/>
+              </w:trPr>
+              <w:tc>
+                <w:tcPr>
+                  <w:tcW w:w="2285" w:type="dxa"/>
+                  <w:vMerge/>
+                </w:tcPr>
+                <w:p>
+                  <w:pPr>
+                    <w:spacing w:before="0" w:after="0" w:line="20" w:lineRule="exact"/>
+                    <w:rPr>
+                      <w:sz w:val="2"/>
+                      <w:szCs w:val="2"/>
+                    </w:rPr>
+                  </w:pPr>
+                </w:p>
+              </w:tc>
+              <w:tc>
+                <w:tcPr>
+                  <w:tcW w:w="7672" w:type="dxa"/>
+                </w:tcPr>
+                <w:p>
+                  <w:pPr>
+                    <w:pStyle w:val="ad"/>
+                    <w:numPr>
+                      <w:ilvl w:val="0"/>
+                      <w:numId w:val="34"/>
+                    </w:numPr>
+                    <w:spacing w:before="45" w:line="211" w:lineRule="auto"/>
+                    <w:rPr>
+                      <w:color w:val="404040" w:themeColor="text1" w:themeTint="BF"/>
+                    </w:rPr>
+                  </w:pPr>
+                  <w:r>
+                    <w:rPr>
+                      <w:b/>
+                      <w:bCs/>
+                      <w:color w:val="404040" w:themeColor="text1" w:themeTint="BF"/>
+                    </w:rPr>
+                    <w:t xml:space="preserve">Гипотезы: </w:t>
+                  </w:r>
+                  <w:r>
+                    <w:rPr>
+                      <w:color w:val="404040" w:themeColor="text1" w:themeTint="BF"/>
+                    </w:rPr>
+                    <w:t xml:space="preserve">сформировал по итогам серии глубинных интервью с пользователями.</w:t>
+                  </w:r>
+                </w:p>
+              </w:tc>
+            </w:tr>
+            <w:tr>
+              <w:trPr>
+                <w:cantSplit/>
+              </w:trPr>
+              <w:tc>
+                <w:tcPr>
+                  <w:tcW w:w="2285" w:type="dxa"/>
+                  <w:vMerge/>
+                </w:tcPr>
+                <w:p>
+                  <w:pPr>
+                    <w:spacing w:before="0" w:after="0" w:line="20" w:lineRule="exact"/>
+                    <w:rPr>
+                      <w:sz w:val="2"/>
+                      <w:szCs w:val="2"/>
+                    </w:rPr>
+                  </w:pPr>
+                </w:p>
+              </w:tc>
+              <w:tc>
+                <w:tcPr>
+                  <w:tcW w:w="7672" w:type="dxa"/>
+                </w:tcPr>
+                <w:p>
+                  <w:pPr>
+                    <w:pStyle w:val="ad"/>
+                    <w:numPr>
+                      <w:ilvl w:val="0"/>
+                      <w:numId w:val="34"/>
+                    </w:numPr>
+                    <w:spacing w:before="45" w:line="211" w:lineRule="auto"/>
+                    <w:rPr>
+                      <w:color w:val="404040" w:themeColor="text1" w:themeTint="BF"/>
+                    </w:rPr>
+                  </w:pPr>
+                  <w:r>
+                    <w:rPr>
+                      <w:b/>
+                      <w:bCs/>
+                      <w:color w:val="404040" w:themeColor="text1" w:themeTint="BF"/>
+                    </w:rPr>
+                    <w:t xml:space="preserve">Решение: </w:t>
+                  </w:r>
+                  <w:r>
+                    <w:rPr>
+                      <w:color w:val="404040" w:themeColor="text1" w:themeTint="BF"/>
+                    </w:rPr>
+                    <w:t xml:space="preserve">спроектировал UX для 3 групп пользователей (250+ человек) с упором на упрощение онбординга.</w:t>
+                  </w:r>
+                </w:p>
+              </w:tc>
+            </w:tr>
+            <w:tr>
+              <w:trPr>
+                <w:cantSplit/>
+              </w:trPr>
+              <w:tc>
+                <w:tcPr>
+                  <w:tcW w:w="2285" w:type="dxa"/>
+                  <w:vMerge/>
+                </w:tcPr>
+                <w:p>
+                  <w:pPr>
+                    <w:spacing w:before="0" w:after="0" w:line="20" w:lineRule="exact"/>
+                    <w:rPr>
+                      <w:sz w:val="2"/>
+                      <w:szCs w:val="2"/>
+                    </w:rPr>
+                  </w:pPr>
+                </w:p>
+              </w:tc>
+              <w:tc>
+                <w:tcPr>
+                  <w:tcW w:w="7672" w:type="dxa"/>
+                </w:tcPr>
+                <w:p>
+                  <w:pPr>
+                    <w:pStyle w:val="ad"/>
+                    <w:numPr>
+                      <w:ilvl w:val="0"/>
+                      <w:numId w:val="34"/>
+                    </w:numPr>
+                    <w:spacing w:before="45" w:line="211" w:lineRule="auto"/>
+                    <w:rPr>
+                      <w:color w:val="404040" w:themeColor="text1" w:themeTint="BF"/>
+                    </w:rPr>
+                  </w:pPr>
+                  <w:r>
+                    <w:rPr>
+                      <w:b/>
+                      <w:bCs/>
+                      <w:color w:val="404040" w:themeColor="text1" w:themeTint="BF"/>
+                    </w:rPr>
+                    <w:t xml:space="preserve">Проверка: </w:t>
+                  </w:r>
+                  <w:r>
+                    <w:rPr>
+                      <w:color w:val="404040" w:themeColor="text1" w:themeTint="BF"/>
+                    </w:rPr>
+                    <w:t xml:space="preserve">несколько итераций usability-тестирований с доработкой решений между ними.</w:t>
+                  </w:r>
+                </w:p>
+              </w:tc>
+            </w:tr>
+            <w:tr>
+              <w:trPr>
+                <w:cantSplit/>
+              </w:trPr>
+              <w:tc>
+                <w:tcPr>
+                  <w:tcW w:w="2285" w:type="dxa"/>
+                  <w:vMerge/>
+                </w:tcPr>
+                <w:p>
+                  <w:pPr>
+                    <w:spacing w:before="0" w:after="0" w:line="20" w:lineRule="exact"/>
+                    <w:rPr>
+                      <w:sz w:val="2"/>
+                      <w:szCs w:val="2"/>
+                    </w:rPr>
+                  </w:pPr>
+                </w:p>
+              </w:tc>
+              <w:tc>
+                <w:tcPr>
+                  <w:tcW w:w="7672" w:type="dxa"/>
+                </w:tcPr>
+                <w:p>
+                  <w:pPr>
+                    <w:pStyle w:val="ad"/>
+                    <w:numPr>
+                      <w:ilvl w:val="0"/>
+                      <w:numId w:val="34"/>
+                    </w:numPr>
+                    <w:spacing w:before="45" w:line="211" w:lineRule="auto"/>
+                    <w:rPr>
+                      <w:color w:val="404040" w:themeColor="text1" w:themeTint="BF"/>
+                    </w:rPr>
+                  </w:pPr>
+                  <w:r>
+                    <w:rPr>
+                      <w:b/>
+                      <w:bCs/>
+                      <w:color w:val="404040" w:themeColor="text1" w:themeTint="BF"/>
+                    </w:rPr>
+                    <w:t xml:space="preserve">Результат: </w:t>
+                  </w:r>
+                  <w:r>
+                    <w:rPr>
+                      <w:color w:val="404040" w:themeColor="text1" w:themeTint="BF"/>
+                    </w:rPr>
+                    <w:t xml:space="preserve">онбординг сократился; количество ошибок снизилось на 24%, когнитивная нагрузка — на 36%, скорость решения задач выросла.</w:t>
+                  </w:r>
+                </w:p>
+              </w:tc>
+            </w:tr>
+            <w:tr>
+              <w:trPr>
+                <w:cantSplit/>
+              </w:trPr>
+              <w:tc>
+                <w:tcPr>
+                  <w:tcW w:w="2285" w:type="dxa"/>
+                  <w:vMerge/>
+                </w:tcPr>
+                <w:p>
+                  <w:pPr>
+                    <w:spacing w:before="0" w:after="0" w:line="20" w:lineRule="exact"/>
+                    <w:rPr>
+                      <w:sz w:val="2"/>
+                      <w:szCs w:val="2"/>
+                    </w:rPr>
+                  </w:pPr>
+                </w:p>
+              </w:tc>
+              <w:tc>
+                <w:tcPr>
+                  <w:tcW w:w="7672" w:type="dxa"/>
+                </w:tcPr>
+                <w:p>
+                  <w:pPr>
+                    <w:pStyle w:val="ad"/>
+                    <w:keepNext/>
+                    <w:spacing w:before="72" w:line="211" w:lineRule="auto"/>
+                    <w:rPr>
+                      <w:bCs/>
+                      <w:color w:val="0483F8"/>
+                      <w:spacing w:val="-2"/>
+                      <w:sz w:val="22"/>
+                      <w:szCs w:val="22"/>
+                    </w:rPr>
+                  </w:pPr>
+                  <w:r>
+                    <w:rPr>
+                      <w:bCs/>
+                      <w:color w:val="0483F8"/>
+                      <w:spacing w:val="-2"/>
+                      <w:sz w:val="22"/>
+                      <w:szCs w:val="22"/>
+                    </w:rPr>
                     <w:t xml:space="preserve">Состав команды</w:t>
                   </w:r>
                 </w:p>
@@ -2572,7 +2812,7 @@
                     <w:rPr>
                       <w:color w:val="404040" w:themeColor="text1" w:themeTint="BF"/>
                     </w:rPr>
-                    <w:t xml:space="preserve">Аналитики, команда разработки, кросс-функциональные продуктовые команды.</w:t>
+                    <w:t xml:space="preserve">Продакт-менеджеры, аналитики, команда разработки, кросс-функциональные продуктовые команды.</w:t>
                   </w:r>
                 </w:p>
               </w:tc>
@@ -2657,7 +2897,7 @@
                 <w:p>
                   <w:pPr>
                     <w:pStyle w:val="ad"/>
-                    <w:spacing w:before="234" w:line="211" w:lineRule="auto"/>
+                    <w:spacing w:before="184" w:line="211" w:lineRule="auto"/>
                     <w:ind w:left="-108" w:right="77"/>
                     <w:rPr>
                       <w:bCs/>
@@ -2698,7 +2938,7 @@
                 <w:p>
                   <w:pPr>
                     <w:keepNext/>
-                    <w:spacing w:before="200"/>
+                    <w:spacing w:before="150"/>
                     <w:rPr>
                       <w:b/>
                       <w:bCs/>
@@ -2730,7 +2970,7 @@
                       <w:bCs/>
                       <w:color w:val="404040"/>
                     </w:rPr>
-                    <w:t xml:space="preserve">UX/UI Designer</w:t>
+                    <w:t xml:space="preserve">Senior UX/UI Designer</w:t>
                   </w:r>
                 </w:p>
                 <w:p>
@@ -2967,7 +3207,7 @@
                     <w:rPr>
                       <w:color w:val="404040" w:themeColor="text1" w:themeTint="BF"/>
                     </w:rPr>
-                    <w:t xml:space="preserve">Ставил задачи младшим дизайнерам и менторил их.</w:t>
+                    <w:t xml:space="preserve">Как старший дизайнер ставил задачи младшим дизайнерам, проводил дизайн-ревью и менторил команду.</w:t>
                   </w:r>
                 </w:p>
               </w:tc>
@@ -3035,7 +3275,7 @@
                     <w:rPr>
                       <w:color w:val="404040" w:themeColor="text1" w:themeTint="BF"/>
                     </w:rPr>
-                    <w:t xml:space="preserve">Аналитики, разработчики, младшие дизайнеры.</w:t>
+                    <w:t xml:space="preserve">Продакт-менеджеры, аналитики, разработчики, младшие дизайнеры.</w:t>
                   </w:r>
                 </w:p>
               </w:tc>
@@ -3120,7 +3360,7 @@
                 <w:p>
                   <w:pPr>
                     <w:pStyle w:val="ad"/>
-                    <w:spacing w:before="234" w:line="211" w:lineRule="auto"/>
+                    <w:spacing w:before="184" w:line="211" w:lineRule="auto"/>
                     <w:ind w:left="-108" w:right="77"/>
                     <w:rPr>
                       <w:bCs/>
@@ -3161,7 +3401,7 @@
                 <w:p>
                   <w:pPr>
                     <w:keepNext/>
-                    <w:spacing w:before="200"/>
+                    <w:spacing w:before="150"/>
                     <w:rPr>
                       <w:b/>
                       <w:bCs/>
@@ -3735,7 +3975,7 @@
                 <w:p>
                   <w:pPr>
                     <w:pStyle w:val="ad"/>
-                    <w:spacing w:before="234" w:line="211" w:lineRule="auto"/>
+                    <w:spacing w:before="184" w:line="211" w:lineRule="auto"/>
                     <w:ind w:left="-108" w:right="77"/>
                     <w:rPr>
                       <w:bCs/>
@@ -3776,7 +4016,7 @@
                 <w:p>
                   <w:pPr>
                     <w:keepNext/>
-                    <w:spacing w:before="200"/>
+                    <w:spacing w:before="150"/>
                     <w:rPr>
                       <w:b/>
                       <w:bCs/>
@@ -4110,7 +4350,7 @@
                 <w:p>
                   <w:pPr>
                     <w:pStyle w:val="ad"/>
-                    <w:spacing w:before="234" w:line="211" w:lineRule="auto"/>
+                    <w:spacing w:before="184" w:line="211" w:lineRule="auto"/>
                     <w:ind w:left="-108" w:right="77"/>
                     <w:rPr>
                       <w:bCs/>
@@ -4151,7 +4391,7 @@
                 <w:p>
                   <w:pPr>
                     <w:keepNext/>
-                    <w:spacing w:before="200"/>
+                    <w:spacing w:before="150"/>
                     <w:rPr>
                       <w:b/>
                       <w:bCs/>
@@ -4311,7 +4551,7 @@
                 <w:p>
                   <w:pPr>
                     <w:pStyle w:val="ad"/>
-                    <w:spacing w:before="234" w:line="211" w:lineRule="auto"/>
+                    <w:spacing w:before="184" w:line="211" w:lineRule="auto"/>
                     <w:ind w:left="-108" w:right="77"/>
                     <w:rPr>
                       <w:bCs/>
@@ -4352,7 +4592,7 @@
                 <w:p>
                   <w:pPr>
                     <w:keepNext/>
-                    <w:spacing w:before="200"/>
+                    <w:spacing w:before="150"/>
                     <w:rPr>
                       <w:b/>
                       <w:bCs/>
@@ -4644,7 +4884,7 @@
                 <w:p>
                   <w:pPr>
                     <w:pStyle w:val="ad"/>
-                    <w:spacing w:before="234" w:line="211" w:lineRule="auto"/>
+                    <w:spacing w:before="184" w:line="211" w:lineRule="auto"/>
                     <w:ind w:left="-108" w:right="77"/>
                     <w:rPr>
                       <w:bCs/>
@@ -4685,7 +4925,7 @@
                 <w:p>
                   <w:pPr>
                     <w:keepNext/>
-                    <w:spacing w:before="200"/>
+                    <w:spacing w:before="150"/>
                     <w:rPr>
                       <w:b/>
                       <w:bCs/>
@@ -4942,7 +5182,7 @@
         <w:pBdr>
           <w:bottom w:val="single" w:sz="4" w:space="1" w:color="auto"/>
         </w:pBdr>
-        <w:spacing w:before="240"/>
+        <w:spacing w:before="180"/>
         <w:rPr>
           <w:b/>
           <w:bCs/>
@@ -5002,7 +5242,7 @@
         <w:pBdr>
           <w:bottom w:val="single" w:sz="4" w:space="1" w:color="auto"/>
         </w:pBdr>
-        <w:spacing w:before="240"/>
+        <w:spacing w:before="180"/>
         <w:rPr>
           <w:b/>
           <w:bCs/>

</xml_diff>

<commit_message>
Detail Лига Ставок solution: progressive disclosure, simplified flows
Co-Authored-By: Claude Opus 5.5 <noreply@anthropic.com>
Claude-Session: https://claude.ai/code/session_012npdp2UDGCWsrnjWPKCB4G
</commit_message>
<xml_diff>
--- a/Резюме_ITFB_Михаил_Н_UX-UI.docx
+++ b/Резюме_ITFB_Михаил_Н_UX-UI.docx
@@ -2539,31 +2539,6 @@
                     <w:t xml:space="preserve">сложный онбординг в систему занимал много времени и требовал высокой когнитивной нагрузки при обучении.</w:t>
                   </w:r>
                 </w:p>
-              </w:tc>
-            </w:tr>
-            <w:tr>
-              <w:trPr>
-                <w:cantSplit/>
-              </w:trPr>
-              <w:tc>
-                <w:tcPr>
-                  <w:tcW w:w="2285" w:type="dxa"/>
-                  <w:vMerge/>
-                </w:tcPr>
-                <w:p>
-                  <w:pPr>
-                    <w:spacing w:before="0" w:after="0" w:line="20" w:lineRule="exact"/>
-                    <w:rPr>
-                      <w:sz w:val="2"/>
-                      <w:szCs w:val="2"/>
-                    </w:rPr>
-                  </w:pPr>
-                </w:p>
-              </w:tc>
-              <w:tc>
-                <w:tcPr>
-                  <w:tcW w:w="7672" w:type="dxa"/>
-                </w:tcPr>
                 <w:p>
                   <w:pPr>
                     <w:pStyle w:val="ad"/>
@@ -2591,31 +2566,6 @@
                     <w:t xml:space="preserve">сформировал по итогам серии глубинных интервью с пользователями.</w:t>
                   </w:r>
                 </w:p>
-              </w:tc>
-            </w:tr>
-            <w:tr>
-              <w:trPr>
-                <w:cantSplit/>
-              </w:trPr>
-              <w:tc>
-                <w:tcPr>
-                  <w:tcW w:w="2285" w:type="dxa"/>
-                  <w:vMerge/>
-                </w:tcPr>
-                <w:p>
-                  <w:pPr>
-                    <w:spacing w:before="0" w:after="0" w:line="20" w:lineRule="exact"/>
-                    <w:rPr>
-                      <w:sz w:val="2"/>
-                      <w:szCs w:val="2"/>
-                    </w:rPr>
-                  </w:pPr>
-                </w:p>
-              </w:tc>
-              <w:tc>
-                <w:tcPr>
-                  <w:tcW w:w="7672" w:type="dxa"/>
-                </w:tcPr>
                 <w:p>
                   <w:pPr>
                     <w:pStyle w:val="ad"/>
@@ -2640,34 +2590,9 @@
                     <w:rPr>
                       <w:color w:val="404040" w:themeColor="text1" w:themeTint="BF"/>
                     </w:rPr>
-                    <w:t xml:space="preserve">спроектировал UX для 3 групп пользователей (250+ человек) с упором на упрощение онбординга.</w:t>
+                    <w:t xml:space="preserve">переработал концепцию и подход к интерфейсу для 3 групп пользователей (250+ человек): из-за огромного объёма функционала применил прогрессивное раскрытие, упростил сценарии и очистил интерфейс от легаси-действий.</w:t>
                   </w:r>
                 </w:p>
-              </w:tc>
-            </w:tr>
-            <w:tr>
-              <w:trPr>
-                <w:cantSplit/>
-              </w:trPr>
-              <w:tc>
-                <w:tcPr>
-                  <w:tcW w:w="2285" w:type="dxa"/>
-                  <w:vMerge/>
-                </w:tcPr>
-                <w:p>
-                  <w:pPr>
-                    <w:spacing w:before="0" w:after="0" w:line="20" w:lineRule="exact"/>
-                    <w:rPr>
-                      <w:sz w:val="2"/>
-                      <w:szCs w:val="2"/>
-                    </w:rPr>
-                  </w:pPr>
-                </w:p>
-              </w:tc>
-              <w:tc>
-                <w:tcPr>
-                  <w:tcW w:w="7672" w:type="dxa"/>
-                </w:tcPr>
                 <w:p>
                   <w:pPr>
                     <w:pStyle w:val="ad"/>
@@ -2695,31 +2620,6 @@
                     <w:t xml:space="preserve">несколько итераций usability-тестирований с доработкой решений между ними.</w:t>
                   </w:r>
                 </w:p>
-              </w:tc>
-            </w:tr>
-            <w:tr>
-              <w:trPr>
-                <w:cantSplit/>
-              </w:trPr>
-              <w:tc>
-                <w:tcPr>
-                  <w:tcW w:w="2285" w:type="dxa"/>
-                  <w:vMerge/>
-                </w:tcPr>
-                <w:p>
-                  <w:pPr>
-                    <w:spacing w:before="0" w:after="0" w:line="20" w:lineRule="exact"/>
-                    <w:rPr>
-                      <w:sz w:val="2"/>
-                      <w:szCs w:val="2"/>
-                    </w:rPr>
-                  </w:pPr>
-                </w:p>
-              </w:tc>
-              <w:tc>
-                <w:tcPr>
-                  <w:tcW w:w="7672" w:type="dxa"/>
-                </w:tcPr>
                 <w:p>
                   <w:pPr>
                     <w:pStyle w:val="ad"/>
@@ -2880,7 +2780,7 @@
                     <w:rPr>
                       <w:color w:val="404040" w:themeColor="text1" w:themeTint="BF"/>
                     </w:rPr>
-                    <w:t xml:space="preserve">Figma, User flow, JTBD, User Story, CJM, дизайн-системы, usability testing, прототипирование интерфейсов</w:t>
+                    <w:t xml:space="preserve">Figma, User flow, JTBD, User Story, CJM, прогрессивное раскрытие, дизайн-системы, usability testing, прототипирование интерфейсов</w:t>
                   </w:r>
                 </w:p>
               </w:tc>

</xml_diff>

<commit_message>
Add Яндекс Лавка Kazakhstan part-time brand design project
Co-Authored-By: Claude Opus 5.5 <noreply@anthropic.com>
Claude-Session: https://claude.ai/code/session_012npdp2UDGCWsrnjWPKCB4G
</commit_message>
<xml_diff>
--- a/Резюме_ITFB_Михаил_Н_UX-UI.docx
+++ b/Резюме_ITFB_Михаил_Н_UX-UI.docx
@@ -310,7 +310,7 @@
           <w:sz w:val="20"/>
           <w:szCs w:val="20"/>
         </w:rPr>
-        <w:t xml:space="preserve">Визуальный язык: перенос брендбука в digital, иконографика, графический дизайн и брендированные материалы, микро-анимации интерфейсов.</w:t>
+        <w:t xml:space="preserve">Визуальный язык: перенос брендбука в digital, иконографика, графический дизайн и брендированные материалы (в т. ч. для пилота доставки дронами Яндекс Лавки), микро-анимации интерфейсов.</w:t>
       </w:r>
     </w:p>
     <w:p>
@@ -400,7 +400,7 @@
           <w:sz w:val="20"/>
           <w:szCs w:val="20"/>
         </w:rPr>
-        <w:t xml:space="preserve">Инструменты: Figma, Miro, Draw.io, Confluence, Jira.</w:t>
+        <w:t xml:space="preserve">Инструменты: Figma, Adobe Illustrator, Nano Banana, Miro, Draw.io, Confluence, Jira.</w:t>
       </w:r>
     </w:p>
     <w:p>
@@ -920,6 +920,445 @@
                       <w:color w:val="404040" w:themeColor="text1" w:themeTint="BF"/>
                     </w:rPr>
                     <w:t xml:space="preserve">Figma, HTML-прототипирование, Claude (AI-assisted design), ролевые модели, usability testing, глубинные интервью</w:t>
+                  </w:r>
+                </w:p>
+              </w:tc>
+            </w:tr>
+            <w:tr>
+              <w:trPr>
+                <w:cantSplit/>
+              </w:trPr>
+              <w:tc>
+                <w:tcPr>
+                  <w:tcW w:w="2285" w:type="dxa"/>
+                  <w:vMerge w:val="restart"/>
+                </w:tcPr>
+                <w:p>
+                  <w:pPr>
+                    <w:pStyle w:val="ad"/>
+                    <w:spacing w:before="184" w:line="211" w:lineRule="auto"/>
+                    <w:ind w:left="-108" w:right="77"/>
+                    <w:rPr>
+                      <w:bCs/>
+                      <w:color w:val="AEAAAA" w:themeColor="background2" w:themeShade="BF"/>
+                    </w:rPr>
+                  </w:pPr>
+                  <w:r>
+                    <w:rPr>
+                      <w:bCs/>
+                      <w:color w:val="AEAAAA" w:themeColor="background2" w:themeShade="BF"/>
+                    </w:rPr>
+                    <w:t xml:space="preserve">июль 2026 – по настоящее время</w:t>
+                  </w:r>
+                </w:p>
+                <w:p>
+                  <w:pPr>
+                    <w:pStyle w:val="ad"/>
+                    <w:spacing w:before="54" w:line="211" w:lineRule="auto"/>
+                    <w:ind w:left="-108" w:right="77"/>
+                    <w:rPr>
+                      <w:bCs/>
+                      <w:color w:val="AEAAAA" w:themeColor="background2" w:themeShade="BF"/>
+                    </w:rPr>
+                  </w:pPr>
+                  <w:r>
+                    <w:rPr>
+                      <w:bCs/>
+                      <w:color w:val="AEAAAA" w:themeColor="background2" w:themeShade="BF"/>
+                    </w:rPr>
+                    <w:t xml:space="preserve">(3 месяца, part-time)</w:t>
+                  </w:r>
+                </w:p>
+              </w:tc>
+              <w:tc>
+                <w:tcPr>
+                  <w:tcW w:w="7672" w:type="dxa"/>
+                </w:tcPr>
+                <w:p>
+                  <w:pPr>
+                    <w:keepNext/>
+                    <w:spacing w:before="150"/>
+                    <w:rPr>
+                      <w:b/>
+                      <w:bCs/>
+                      <w:color w:val="404040"/>
+                    </w:rPr>
+                  </w:pPr>
+                  <w:r>
+                    <w:rPr>
+                      <w:b/>
+                      <w:bCs/>
+                      <w:color w:val="404040"/>
+                    </w:rPr>
+                    <w:t xml:space="preserve">Яндекс Лавка, Казахстан</w:t>
+                  </w:r>
+                </w:p>
+                <w:p>
+                  <w:pPr>
+                    <w:keepNext/>
+                    <w:spacing w:before="20"/>
+                    <w:rPr>
+                      <w:b/>
+                      <w:bCs/>
+                      <w:color w:val="404040"/>
+                    </w:rPr>
+                  </w:pPr>
+                  <w:r>
+                    <w:rPr>
+                      <w:b/>
+                      <w:bCs/>
+                      <w:color w:val="404040"/>
+                    </w:rPr>
+                    <w:t xml:space="preserve">Graphic / Brand Designer (part-time)</w:t>
+                  </w:r>
+                </w:p>
+                <w:p>
+                  <w:pPr>
+                    <w:pStyle w:val="ad"/>
+                    <w:keepNext/>
+                    <w:spacing w:before="72" w:line="211" w:lineRule="auto"/>
+                    <w:rPr>
+                      <w:bCs/>
+                      <w:color w:val="0483F8"/>
+                      <w:spacing w:val="-2"/>
+                      <w:sz w:val="22"/>
+                      <w:szCs w:val="22"/>
+                    </w:rPr>
+                  </w:pPr>
+                  <w:r>
+                    <w:rPr>
+                      <w:bCs/>
+                      <w:color w:val="0483F8"/>
+                      <w:spacing w:val="-2"/>
+                      <w:sz w:val="22"/>
+                      <w:szCs w:val="22"/>
+                    </w:rPr>
+                    <w:t xml:space="preserve">Обязанности</w:t>
+                  </w:r>
+                </w:p>
+                <w:p>
+                  <w:pPr>
+                    <w:spacing w:before="72"/>
+                    <w:rPr>
+                      <w:color w:val="404040" w:themeColor="text1" w:themeTint="BF"/>
+                      <w:sz w:val="20"/>
+                      <w:szCs w:val="20"/>
+                    </w:rPr>
+                  </w:pPr>
+                  <w:r>
+                    <w:rPr>
+                      <w:color w:val="404040" w:themeColor="text1" w:themeTint="BF"/>
+                      <w:sz w:val="20"/>
+                      <w:szCs w:val="20"/>
+                    </w:rPr>
+                    <w:t xml:space="preserve">Дизайн для пилотного проекта доставки дронами: брендирование коробки, дрона и посадочной площадки, иконка в приложении, дизайн самого дрона.</w:t>
+                  </w:r>
+                </w:p>
+                <w:p>
+                  <w:pPr>
+                    <w:pStyle w:val="ad"/>
+                    <w:numPr>
+                      <w:ilvl w:val="0"/>
+                      <w:numId w:val="30"/>
+                    </w:numPr>
+                    <w:spacing w:before="45" w:line="211" w:lineRule="auto"/>
+                    <w:rPr>
+                      <w:color w:val="404040" w:themeColor="text1" w:themeTint="BF"/>
+                    </w:rPr>
+                  </w:pPr>
+                  <w:r>
+                    <w:rPr>
+                      <w:color w:val="404040" w:themeColor="text1" w:themeTint="BF"/>
+                    </w:rPr>
+                    <w:t xml:space="preserve">Разработал брендирование атрибутов пилота: коробки, дрона и посадочной площадки.</w:t>
+                  </w:r>
+                </w:p>
+              </w:tc>
+            </w:tr>
+            <w:tr>
+              <w:trPr>
+                <w:cantSplit/>
+              </w:trPr>
+              <w:tc>
+                <w:tcPr>
+                  <w:tcW w:w="2285" w:type="dxa"/>
+                  <w:vMerge/>
+                </w:tcPr>
+                <w:p>
+                  <w:pPr>
+                    <w:spacing w:before="0" w:after="0" w:line="20" w:lineRule="exact"/>
+                    <w:rPr>
+                      <w:sz w:val="2"/>
+                      <w:szCs w:val="2"/>
+                    </w:rPr>
+                  </w:pPr>
+                </w:p>
+              </w:tc>
+              <w:tc>
+                <w:tcPr>
+                  <w:tcW w:w="7672" w:type="dxa"/>
+                </w:tcPr>
+                <w:p>
+                  <w:pPr>
+                    <w:pStyle w:val="ad"/>
+                    <w:numPr>
+                      <w:ilvl w:val="0"/>
+                      <w:numId w:val="30"/>
+                    </w:numPr>
+                    <w:spacing w:before="45" w:line="211" w:lineRule="auto"/>
+                    <w:rPr>
+                      <w:color w:val="404040" w:themeColor="text1" w:themeTint="BF"/>
+                    </w:rPr>
+                  </w:pPr>
+                  <w:r>
+                    <w:rPr>
+                      <w:color w:val="404040" w:themeColor="text1" w:themeTint="BF"/>
+                    </w:rPr>
+                    <w:t xml:space="preserve">Обосновал комбо-логотип с Яндекс Go: основной трафик Лавка получает через Go, поэтому атрибуты должны ассоциироваться с основным приложением.</w:t>
+                  </w:r>
+                </w:p>
+              </w:tc>
+            </w:tr>
+            <w:tr>
+              <w:trPr>
+                <w:cantSplit/>
+              </w:trPr>
+              <w:tc>
+                <w:tcPr>
+                  <w:tcW w:w="2285" w:type="dxa"/>
+                  <w:vMerge/>
+                </w:tcPr>
+                <w:p>
+                  <w:pPr>
+                    <w:spacing w:before="0" w:after="0" w:line="20" w:lineRule="exact"/>
+                    <w:rPr>
+                      <w:sz w:val="2"/>
+                      <w:szCs w:val="2"/>
+                    </w:rPr>
+                  </w:pPr>
+                </w:p>
+              </w:tc>
+              <w:tc>
+                <w:tcPr>
+                  <w:tcW w:w="7672" w:type="dxa"/>
+                </w:tcPr>
+                <w:p>
+                  <w:pPr>
+                    <w:pStyle w:val="ad"/>
+                    <w:numPr>
+                      <w:ilvl w:val="0"/>
+                      <w:numId w:val="30"/>
+                    </w:numPr>
+                    <w:spacing w:before="45" w:line="211" w:lineRule="auto"/>
+                    <w:rPr>
+                      <w:color w:val="404040" w:themeColor="text1" w:themeTint="BF"/>
+                    </w:rPr>
+                  </w:pPr>
+                  <w:r>
+                    <w:rPr>
+                      <w:color w:val="404040" w:themeColor="text1" w:themeTint="BF"/>
+                    </w:rPr>
+                    <w:t xml:space="preserve">Придумал ёмкий лайн, передающий главное преимущество доставки дроном — дешевле и быстрее.</w:t>
+                  </w:r>
+                </w:p>
+              </w:tc>
+            </w:tr>
+            <w:tr>
+              <w:trPr>
+                <w:cantSplit/>
+              </w:trPr>
+              <w:tc>
+                <w:tcPr>
+                  <w:tcW w:w="2285" w:type="dxa"/>
+                  <w:vMerge/>
+                </w:tcPr>
+                <w:p>
+                  <w:pPr>
+                    <w:spacing w:before="0" w:after="0" w:line="20" w:lineRule="exact"/>
+                    <w:rPr>
+                      <w:sz w:val="2"/>
+                      <w:szCs w:val="2"/>
+                    </w:rPr>
+                  </w:pPr>
+                </w:p>
+              </w:tc>
+              <w:tc>
+                <w:tcPr>
+                  <w:tcW w:w="7672" w:type="dxa"/>
+                </w:tcPr>
+                <w:p>
+                  <w:pPr>
+                    <w:pStyle w:val="ad"/>
+                    <w:numPr>
+                      <w:ilvl w:val="0"/>
+                      <w:numId w:val="30"/>
+                    </w:numPr>
+                    <w:spacing w:before="45" w:line="211" w:lineRule="auto"/>
+                    <w:rPr>
+                      <w:color w:val="404040" w:themeColor="text1" w:themeTint="BF"/>
+                    </w:rPr>
+                  </w:pPr>
+                  <w:r>
+                    <w:rPr>
+                      <w:color w:val="404040" w:themeColor="text1" w:themeTint="BF"/>
+                    </w:rPr>
+                    <w:t xml:space="preserve">Разработал иконку для приложения с ключевой идеей: дрон минует препятствия и летит напрямик.</w:t>
+                  </w:r>
+                </w:p>
+              </w:tc>
+            </w:tr>
+            <w:tr>
+              <w:trPr>
+                <w:cantSplit/>
+              </w:trPr>
+              <w:tc>
+                <w:tcPr>
+                  <w:tcW w:w="2285" w:type="dxa"/>
+                  <w:vMerge/>
+                </w:tcPr>
+                <w:p>
+                  <w:pPr>
+                    <w:spacing w:before="0" w:after="0" w:line="20" w:lineRule="exact"/>
+                    <w:rPr>
+                      <w:sz w:val="2"/>
+                      <w:szCs w:val="2"/>
+                    </w:rPr>
+                  </w:pPr>
+                </w:p>
+              </w:tc>
+              <w:tc>
+                <w:tcPr>
+                  <w:tcW w:w="7672" w:type="dxa"/>
+                </w:tcPr>
+                <w:p>
+                  <w:pPr>
+                    <w:pStyle w:val="ad"/>
+                    <w:numPr>
+                      <w:ilvl w:val="0"/>
+                      <w:numId w:val="30"/>
+                    </w:numPr>
+                    <w:spacing w:before="45" w:line="211" w:lineRule="auto"/>
+                    <w:rPr>
+                      <w:color w:val="404040" w:themeColor="text1" w:themeTint="BF"/>
+                    </w:rPr>
+                  </w:pPr>
+                  <w:r>
+                    <w:rPr>
+                      <w:color w:val="404040" w:themeColor="text1" w:themeTint="BF"/>
+                    </w:rPr>
+                    <w:t xml:space="preserve">Разработал дизайн реального дрона: придал ему дружелюбные черты, чтобы снизить настороженность людей к дронам.</w:t>
+                  </w:r>
+                </w:p>
+              </w:tc>
+            </w:tr>
+            <w:tr>
+              <w:trPr>
+                <w:cantSplit/>
+              </w:trPr>
+              <w:tc>
+                <w:tcPr>
+                  <w:tcW w:w="2285" w:type="dxa"/>
+                  <w:vMerge/>
+                </w:tcPr>
+                <w:p>
+                  <w:pPr>
+                    <w:spacing w:before="0" w:after="0" w:line="20" w:lineRule="exact"/>
+                    <w:rPr>
+                      <w:sz w:val="2"/>
+                      <w:szCs w:val="2"/>
+                    </w:rPr>
+                  </w:pPr>
+                </w:p>
+              </w:tc>
+              <w:tc>
+                <w:tcPr>
+                  <w:tcW w:w="7672" w:type="dxa"/>
+                </w:tcPr>
+                <w:p>
+                  <w:pPr>
+                    <w:pStyle w:val="ad"/>
+                    <w:numPr>
+                      <w:ilvl w:val="0"/>
+                      <w:numId w:val="30"/>
+                    </w:numPr>
+                    <w:spacing w:before="45" w:line="211" w:lineRule="auto"/>
+                    <w:rPr>
+                      <w:color w:val="404040" w:themeColor="text1" w:themeTint="BF"/>
+                    </w:rPr>
+                  </w:pPr>
+                  <w:r>
+                    <w:rPr>
+                      <w:color w:val="404040" w:themeColor="text1" w:themeTint="BF"/>
+                    </w:rPr>
+                    <w:t xml:space="preserve">Подготовил презентации для продажи пилота внутри компании.</w:t>
+                  </w:r>
+                </w:p>
+              </w:tc>
+            </w:tr>
+            <w:tr>
+              <w:trPr>
+                <w:cantSplit/>
+              </w:trPr>
+              <w:tc>
+                <w:tcPr>
+                  <w:tcW w:w="2285" w:type="dxa"/>
+                  <w:vMerge/>
+                </w:tcPr>
+                <w:p>
+                  <w:pPr>
+                    <w:spacing w:before="0" w:after="0" w:line="20" w:lineRule="exact"/>
+                    <w:rPr>
+                      <w:sz w:val="2"/>
+                      <w:szCs w:val="2"/>
+                    </w:rPr>
+                  </w:pPr>
+                </w:p>
+              </w:tc>
+              <w:tc>
+                <w:tcPr>
+                  <w:tcW w:w="7672" w:type="dxa"/>
+                </w:tcPr>
+                <w:p>
+                  <w:pPr>
+                    <w:pStyle w:val="ad"/>
+                    <w:keepNext/>
+                    <w:spacing w:before="72" w:line="211" w:lineRule="auto"/>
+                    <w:rPr>
+                      <w:bCs/>
+                      <w:color w:val="0483F8"/>
+                      <w:spacing w:val="-2"/>
+                      <w:sz w:val="22"/>
+                      <w:szCs w:val="22"/>
+                    </w:rPr>
+                  </w:pPr>
+                  <w:r>
+                    <w:rPr>
+                      <w:bCs/>
+                      <w:color w:val="0483F8"/>
+                      <w:spacing w:val="-2"/>
+                      <w:sz w:val="22"/>
+                      <w:szCs w:val="22"/>
+                    </w:rPr>
+                    <w:t xml:space="preserve">Технологии</w:t>
+                  </w:r>
+                </w:p>
+                <w:p>
+                  <w:pPr>
+                    <w:pStyle w:val="ad"/>
+                    <w:numPr>
+                      <w:ilvl w:val="0"/>
+                      <w:numId w:val="23"/>
+                    </w:numPr>
+                    <w:spacing w:before="45" w:line="211" w:lineRule="auto"/>
+                    <w:rPr>
+                      <w:color w:val="404040" w:themeColor="text1" w:themeTint="BF"/>
+                    </w:rPr>
+                  </w:pPr>
+                  <w:r>
+                    <w:rPr>
+                      <w:color w:val="404040" w:themeColor="text1" w:themeTint="BF"/>
+                    </w:rPr>
+                    <w:t xml:space="preserve">Figma, Adobe Illustrator, Nano Banana, брендинг, айдентика, иконографика, графический дизайн, презентации</w:t>
                   </w:r>
                 </w:p>
               </w:tc>

</xml_diff>

<commit_message>
Яндекс Лавка: drone icon in Яндекс Go, drop combo-logo bullet
Co-Authored-By: Claude Opus 5.5 <noreply@anthropic.com>
Claude-Session: https://claude.ai/code/session_012npdp2UDGCWsrnjWPKCB4G
</commit_message>
<xml_diff>
--- a/Резюме_ITFB_Михаил_Н_UX-UI.docx
+++ b/Резюме_ITFB_Михаил_Н_UX-UI.docx
@@ -1051,7 +1051,7 @@
                       <w:sz w:val="20"/>
                       <w:szCs w:val="20"/>
                     </w:rPr>
-                    <w:t xml:space="preserve">Дизайн для пилотного проекта доставки дронами: брендирование коробки, дрона и посадочной площадки, иконка в приложении, дизайн самого дрона.</w:t>
+                    <w:t xml:space="preserve">Дизайн для пилотного проекта доставки дронами: брендирование коробки, дрона и посадочной площадки, иконка дрона в Яндекс Go, дизайн самого дрона.</w:t>
                   </w:r>
                 </w:p>
                 <w:p>
@@ -1114,50 +1114,6 @@
                     <w:rPr>
                       <w:color w:val="404040" w:themeColor="text1" w:themeTint="BF"/>
                     </w:rPr>
-                    <w:t xml:space="preserve">Обосновал комбо-логотип с Яндекс Go: основной трафик Лавка получает через Go, поэтому атрибуты должны ассоциироваться с основным приложением.</w:t>
-                  </w:r>
-                </w:p>
-              </w:tc>
-            </w:tr>
-            <w:tr>
-              <w:trPr>
-                <w:cantSplit/>
-              </w:trPr>
-              <w:tc>
-                <w:tcPr>
-                  <w:tcW w:w="2285" w:type="dxa"/>
-                  <w:vMerge/>
-                </w:tcPr>
-                <w:p>
-                  <w:pPr>
-                    <w:spacing w:before="0" w:after="0" w:line="20" w:lineRule="exact"/>
-                    <w:rPr>
-                      <w:sz w:val="2"/>
-                      <w:szCs w:val="2"/>
-                    </w:rPr>
-                  </w:pPr>
-                </w:p>
-              </w:tc>
-              <w:tc>
-                <w:tcPr>
-                  <w:tcW w:w="7672" w:type="dxa"/>
-                </w:tcPr>
-                <w:p>
-                  <w:pPr>
-                    <w:pStyle w:val="ad"/>
-                    <w:numPr>
-                      <w:ilvl w:val="0"/>
-                      <w:numId w:val="30"/>
-                    </w:numPr>
-                    <w:spacing w:before="45" w:line="211" w:lineRule="auto"/>
-                    <w:rPr>
-                      <w:color w:val="404040" w:themeColor="text1" w:themeTint="BF"/>
-                    </w:rPr>
-                  </w:pPr>
-                  <w:r>
-                    <w:rPr>
-                      <w:color w:val="404040" w:themeColor="text1" w:themeTint="BF"/>
-                    </w:rPr>
                     <w:t xml:space="preserve">Придумал ёмкий лайн, передающий главное преимущество доставки дроном — дешевле и быстрее.</w:t>
                   </w:r>
                 </w:p>
@@ -1202,7 +1158,7 @@
                     <w:rPr>
                       <w:color w:val="404040" w:themeColor="text1" w:themeTint="BF"/>
                     </w:rPr>
-                    <w:t xml:space="preserve">Разработал иконку для приложения с ключевой идеей: дрон минует препятствия и летит напрямик.</w:t>
+                    <w:t xml:space="preserve">Разработал иконку дрона для приложения Яндекс Go.</w:t>
                   </w:r>
                 </w:p>
               </w:tc>

</xml_diff>